<commit_message>
Windows 32/64 builds, Linux rpm/deb packaging, runtime portability fixes
Co-Authored-By: Claude Sonnet 5.5 <noreply@anthropic.com>
Claude-Session: https://claude.ai/code/session_01JnKSjwwiAQX8ZZcaJLvQEV
</commit_message>
<xml_diff>
--- a/docs/PLI-User-Guide.docx
+++ b/docs/PLI-User-Guide.docx
@@ -487,7 +487,7 @@
           <w:sz w:val="20"/>
           <w:szCs w:val="20"/>
         </w:rPr>
-        <w:t xml:space="preserve">Building on VM/370 CMS</w:t>
+        <w:t xml:space="preserve">Windows</w:t>
       </w:r>
       <w:r>
         <w:rPr>
@@ -498,6 +498,64 @@
           <w:szCs w:val="20"/>
         </w:rPr>
         <w:t xml:space="preserve">	3</w:t>
+      </w:r>
+    </w:p>
+    <w:p>
+      <w:pPr>
+        <w:tabs>
+          <w:tab w:val="right" w:pos="9638" w:leader="dot"/>
+        </w:tabs>
+        <w:spacing w:after="20" w:before="20"/>
+        <w:ind w:left="400"/>
+      </w:pPr>
+      <w:r>
+        <w:rPr>
+          <w:rFonts w:ascii="Times New Roman" w:cs="Times New Roman" w:eastAsia="Times New Roman" w:hAnsi="Times New Roman"/>
+          <w:b w:val="false"/>
+          <w:bCs w:val="false"/>
+          <w:sz w:val="20"/>
+          <w:szCs w:val="20"/>
+        </w:rPr>
+        <w:t xml:space="preserve">Linux packages</w:t>
+      </w:r>
+      <w:r>
+        <w:rPr>
+          <w:rFonts w:ascii="Times New Roman" w:cs="Times New Roman" w:eastAsia="Times New Roman" w:hAnsi="Times New Roman"/>
+          <w:b w:val="false"/>
+          <w:bCs w:val="false"/>
+          <w:sz w:val="20"/>
+          <w:szCs w:val="20"/>
+        </w:rPr>
+        <w:t xml:space="preserve">	3</w:t>
+      </w:r>
+    </w:p>
+    <w:p>
+      <w:pPr>
+        <w:tabs>
+          <w:tab w:val="right" w:pos="9638" w:leader="dot"/>
+        </w:tabs>
+        <w:spacing w:after="20" w:before="20"/>
+        <w:ind w:left="400"/>
+      </w:pPr>
+      <w:r>
+        <w:rPr>
+          <w:rFonts w:ascii="Times New Roman" w:cs="Times New Roman" w:eastAsia="Times New Roman" w:hAnsi="Times New Roman"/>
+          <w:b w:val="false"/>
+          <w:bCs w:val="false"/>
+          <w:sz w:val="20"/>
+          <w:szCs w:val="20"/>
+        </w:rPr>
+        <w:t xml:space="preserve">Building on VM/370 CMS</w:t>
+      </w:r>
+      <w:r>
+        <w:rPr>
+          <w:rFonts w:ascii="Times New Roman" w:cs="Times New Roman" w:eastAsia="Times New Roman" w:hAnsi="Times New Roman"/>
+          <w:b w:val="false"/>
+          <w:bCs w:val="false"/>
+          <w:sz w:val="20"/>
+          <w:szCs w:val="20"/>
+        </w:rPr>
+        <w:t xml:space="preserve">	4</w:t>
       </w:r>
     </w:p>
     <w:p>
@@ -4312,6 +4370,288 @@
           <w:szCs w:val="21"/>
         </w:rPr>
         <w:t xml:space="preserve">The return code is 0 when the translation succeeded, 8 when an error was found in the source, and 4 for a usage error.</w:t>
+      </w:r>
+    </w:p>
+    <w:p>
+      <w:pPr>
+        <w:pStyle w:val="Heading2"/>
+      </w:pPr>
+      <w:r>
+        <w:t xml:space="preserve">Windows</w:t>
+      </w:r>
+    </w:p>
+    <w:p>
+      <w:pPr>
+        <w:keepNext w:val="false"/>
+        <w:spacing w:after="120" w:before="0"/>
+      </w:pPr>
+      <w:r>
+        <w:rPr>
+          <w:rFonts w:ascii="Times New Roman" w:cs="Times New Roman" w:eastAsia="Times New Roman" w:hAnsi="Times New Roman"/>
+          <w:b w:val="false"/>
+          <w:bCs w:val="false"/>
+          <w:sz w:val="21"/>
+          <w:szCs w:val="21"/>
+        </w:rPr>
+        <w:t xml:space="preserve">The translator builds for Windows, 32 and 64 bit, with MinGW-w64: </w:t>
+      </w:r>
+      <w:r>
+        <w:rPr>
+          <w:rFonts w:ascii="Courier New" w:cs="Courier New" w:eastAsia="Courier New" w:hAnsi="Courier New"/>
+          <w:sz w:val="19"/>
+          <w:szCs w:val="19"/>
+        </w:rPr>
+        <w:t xml:space="preserve">make win</w:t>
+      </w:r>
+      <w:r>
+        <w:rPr>
+          <w:rFonts w:ascii="Times New Roman" w:cs="Times New Roman" w:eastAsia="Times New Roman" w:hAnsi="Times New Roman"/>
+          <w:b w:val="false"/>
+          <w:bCs w:val="false"/>
+          <w:sz w:val="21"/>
+          <w:szCs w:val="21"/>
+        </w:rPr>
+        <w:t xml:space="preserve"> produces </w:t>
+      </w:r>
+      <w:r>
+        <w:rPr>
+          <w:rFonts w:ascii="Courier New" w:cs="Courier New" w:eastAsia="Courier New" w:hAnsi="Courier New"/>
+          <w:sz w:val="19"/>
+          <w:szCs w:val="19"/>
+        </w:rPr>
+        <w:t xml:space="preserve">pli-i686.exe</w:t>
+      </w:r>
+      <w:r>
+        <w:rPr>
+          <w:rFonts w:ascii="Times New Roman" w:cs="Times New Roman" w:eastAsia="Times New Roman" w:hAnsi="Times New Roman"/>
+          <w:b w:val="false"/>
+          <w:bCs w:val="false"/>
+          <w:sz w:val="21"/>
+          <w:szCs w:val="21"/>
+        </w:rPr>
+        <w:t xml:space="preserve"> and </w:t>
+      </w:r>
+      <w:r>
+        <w:rPr>
+          <w:rFonts w:ascii="Courier New" w:cs="Courier New" w:eastAsia="Courier New" w:hAnsi="Courier New"/>
+          <w:sz w:val="19"/>
+          <w:szCs w:val="19"/>
+        </w:rPr>
+        <w:t xml:space="preserve">pli-x86_64.exe</w:t>
+      </w:r>
+      <w:r>
+        <w:rPr>
+          <w:rFonts w:ascii="Times New Roman" w:cs="Times New Roman" w:eastAsia="Times New Roman" w:hAnsi="Times New Roman"/>
+          <w:b w:val="false"/>
+          <w:bCs w:val="false"/>
+          <w:sz w:val="21"/>
+          <w:szCs w:val="21"/>
+        </w:rPr>
+        <w:t xml:space="preserve">, which are linked statically and need no DLL. Both pass the whole test suite under Wine. Translate with </w:t>
+      </w:r>
+      <w:r>
+        <w:rPr>
+          <w:rFonts w:ascii="Courier New" w:cs="Courier New" w:eastAsia="Courier New" w:hAnsi="Courier New"/>
+          <w:sz w:val="19"/>
+          <w:szCs w:val="19"/>
+        </w:rPr>
+        <w:t xml:space="preserve">pli prog.pli -o prog.c</w:t>
+      </w:r>
+      <w:r>
+        <w:rPr>
+          <w:rFonts w:ascii="Times New Roman" w:cs="Times New Roman" w:eastAsia="Times New Roman" w:hAnsi="Times New Roman"/>
+          <w:b w:val="false"/>
+          <w:bCs w:val="false"/>
+          <w:sz w:val="21"/>
+          <w:szCs w:val="21"/>
+        </w:rPr>
+        <w:t xml:space="preserve"> and compile the C file with any Windows C compiler, for example </w:t>
+      </w:r>
+      <w:r>
+        <w:rPr>
+          <w:rFonts w:ascii="Courier New" w:cs="Courier New" w:eastAsia="Courier New" w:hAnsi="Courier New"/>
+          <w:sz w:val="19"/>
+          <w:szCs w:val="19"/>
+        </w:rPr>
+        <w:t xml:space="preserve">gcc -std=c89 -I. prog.c -o prog.exe -lm</w:t>
+      </w:r>
+      <w:r>
+        <w:rPr>
+          <w:rFonts w:ascii="Times New Roman" w:cs="Times New Roman" w:eastAsia="Times New Roman" w:hAnsi="Times New Roman"/>
+          <w:b w:val="false"/>
+          <w:bCs w:val="false"/>
+          <w:sz w:val="21"/>
+          <w:szCs w:val="21"/>
+        </w:rPr>
+        <w:t xml:space="preserve">, with </w:t>
+      </w:r>
+      <w:r>
+        <w:rPr>
+          <w:rFonts w:ascii="Courier New" w:cs="Courier New" w:eastAsia="Courier New" w:hAnsi="Courier New"/>
+          <w:sz w:val="19"/>
+          <w:szCs w:val="19"/>
+        </w:rPr>
+        <w:t xml:space="preserve">plirt.h</w:t>
+      </w:r>
+      <w:r>
+        <w:rPr>
+          <w:rFonts w:ascii="Times New Roman" w:cs="Times New Roman" w:eastAsia="Times New Roman" w:hAnsi="Times New Roman"/>
+          <w:b w:val="false"/>
+          <w:bCs w:val="false"/>
+          <w:sz w:val="21"/>
+          <w:szCs w:val="21"/>
+        </w:rPr>
+        <w:t xml:space="preserve"> in the include path. The runtime prints floating-point exponents with two digits on every system, and record files are opened in binary mode.</w:t>
+      </w:r>
+    </w:p>
+    <w:p>
+      <w:pPr>
+        <w:pStyle w:val="Heading2"/>
+      </w:pPr>
+      <w:r>
+        <w:t xml:space="preserve">Linux packages</w:t>
+      </w:r>
+    </w:p>
+    <w:p>
+      <w:pPr>
+        <w:keepNext w:val="false"/>
+        <w:spacing w:after="120" w:before="0"/>
+      </w:pPr>
+      <w:r>
+        <w:rPr>
+          <w:rFonts w:ascii="Times New Roman" w:cs="Times New Roman" w:eastAsia="Times New Roman" w:hAnsi="Times New Roman"/>
+          <w:b w:val="false"/>
+          <w:bCs w:val="false"/>
+          <w:sz w:val="21"/>
+          <w:szCs w:val="21"/>
+        </w:rPr>
+        <w:t xml:space="preserve">The source needs only a C compiler and builds on any Linux distribution; </w:t>
+      </w:r>
+      <w:r>
+        <w:rPr>
+          <w:rFonts w:ascii="Courier New" w:cs="Courier New" w:eastAsia="Courier New" w:hAnsi="Courier New"/>
+          <w:sz w:val="19"/>
+          <w:szCs w:val="19"/>
+        </w:rPr>
+        <w:t xml:space="preserve">make install</w:t>
+      </w:r>
+      <w:r>
+        <w:rPr>
+          <w:rFonts w:ascii="Times New Roman" w:cs="Times New Roman" w:eastAsia="Times New Roman" w:hAnsi="Times New Roman"/>
+          <w:b w:val="false"/>
+          <w:bCs w:val="false"/>
+          <w:sz w:val="21"/>
+          <w:szCs w:val="21"/>
+        </w:rPr>
+        <w:t xml:space="preserve"> copies </w:t>
+      </w:r>
+      <w:r>
+        <w:rPr>
+          <w:rFonts w:ascii="Courier New" w:cs="Courier New" w:eastAsia="Courier New" w:hAnsi="Courier New"/>
+          <w:sz w:val="19"/>
+          <w:szCs w:val="19"/>
+        </w:rPr>
+        <w:t xml:space="preserve">pli</w:t>
+      </w:r>
+      <w:r>
+        <w:rPr>
+          <w:rFonts w:ascii="Times New Roman" w:cs="Times New Roman" w:eastAsia="Times New Roman" w:hAnsi="Times New Roman"/>
+          <w:b w:val="false"/>
+          <w:bCs w:val="false"/>
+          <w:sz w:val="21"/>
+          <w:szCs w:val="21"/>
+        </w:rPr>
+        <w:t xml:space="preserve"> to </w:t>
+      </w:r>
+      <w:r>
+        <w:rPr>
+          <w:rFonts w:ascii="Courier New" w:cs="Courier New" w:eastAsia="Courier New" w:hAnsi="Courier New"/>
+          <w:sz w:val="19"/>
+          <w:szCs w:val="19"/>
+        </w:rPr>
+        <w:t xml:space="preserve">/usr/local/bin</w:t>
+      </w:r>
+      <w:r>
+        <w:rPr>
+          <w:rFonts w:ascii="Times New Roman" w:cs="Times New Roman" w:eastAsia="Times New Roman" w:hAnsi="Times New Roman"/>
+          <w:b w:val="false"/>
+          <w:bCs w:val="false"/>
+          <w:sz w:val="21"/>
+          <w:szCs w:val="21"/>
+        </w:rPr>
+        <w:t xml:space="preserve"> and the runtime header and examples to </w:t>
+      </w:r>
+      <w:r>
+        <w:rPr>
+          <w:rFonts w:ascii="Courier New" w:cs="Courier New" w:eastAsia="Courier New" w:hAnsi="Courier New"/>
+          <w:sz w:val="19"/>
+          <w:szCs w:val="19"/>
+        </w:rPr>
+        <w:t xml:space="preserve">/usr/local/share/pli</w:t>
+      </w:r>
+      <w:r>
+        <w:rPr>
+          <w:rFonts w:ascii="Times New Roman" w:cs="Times New Roman" w:eastAsia="Times New Roman" w:hAnsi="Times New Roman"/>
+          <w:b w:val="false"/>
+          <w:bCs w:val="false"/>
+          <w:sz w:val="21"/>
+          <w:szCs w:val="21"/>
+        </w:rPr>
+        <w:t xml:space="preserve">. </w:t>
+      </w:r>
+      <w:r>
+        <w:rPr>
+          <w:rFonts w:ascii="Courier New" w:cs="Courier New" w:eastAsia="Courier New" w:hAnsi="Courier New"/>
+          <w:sz w:val="19"/>
+          <w:szCs w:val="19"/>
+        </w:rPr>
+        <w:t xml:space="preserve">make dist</w:t>
+      </w:r>
+      <w:r>
+        <w:rPr>
+          <w:rFonts w:ascii="Times New Roman" w:cs="Times New Roman" w:eastAsia="Times New Roman" w:hAnsi="Times New Roman"/>
+          <w:b w:val="false"/>
+          <w:bCs w:val="false"/>
+          <w:sz w:val="21"/>
+          <w:szCs w:val="21"/>
+        </w:rPr>
+        <w:t xml:space="preserve"> builds, besides the Windows zip files, a statically linked x86_64 binary, a tar file, an rpm and a deb. The rpm and deb contain the static binary, so they do not depend on the version of the C library. The file </w:t>
+      </w:r>
+      <w:r>
+        <w:rPr>
+          <w:rFonts w:ascii="Courier New" w:cs="Courier New" w:eastAsia="Courier New" w:hAnsi="Courier New"/>
+          <w:sz w:val="19"/>
+          <w:szCs w:val="19"/>
+        </w:rPr>
+        <w:t xml:space="preserve">pli.spec</w:t>
+      </w:r>
+      <w:r>
+        <w:rPr>
+          <w:rFonts w:ascii="Times New Roman" w:cs="Times New Roman" w:eastAsia="Times New Roman" w:hAnsi="Times New Roman"/>
+          <w:b w:val="false"/>
+          <w:bCs w:val="false"/>
+          <w:sz w:val="21"/>
+          <w:szCs w:val="21"/>
+        </w:rPr>
+        <w:t xml:space="preserve"> builds an rpm from source on RPM-based distributions. Compile generated programs with </w:t>
+      </w:r>
+      <w:r>
+        <w:rPr>
+          <w:rFonts w:ascii="Courier New" w:cs="Courier New" w:eastAsia="Courier New" w:hAnsi="Courier New"/>
+          <w:sz w:val="19"/>
+          <w:szCs w:val="19"/>
+        </w:rPr>
+        <w:t xml:space="preserve">cc -I/usr/share/pli prog.c -lm</w:t>
+      </w:r>
+      <w:r>
+        <w:rPr>
+          <w:rFonts w:ascii="Times New Roman" w:cs="Times New Roman" w:eastAsia="Times New Roman" w:hAnsi="Times New Roman"/>
+          <w:b w:val="false"/>
+          <w:bCs w:val="false"/>
+          <w:sz w:val="21"/>
+          <w:szCs w:val="21"/>
+        </w:rPr>
+        <w:t xml:space="preserve">. The packages were built on Ubuntu; only the deb was unpacked and run here, and no other distribution was tested.</w:t>
       </w:r>
     </w:p>
     <w:p>

</xml_diff>

<commit_message>
Add -c: build programs directly; bundle TinyCC in Windows packages
Co-Authored-By: Claude Sonnet 5.5 <noreply@anthropic.com>
Claude-Session: https://claude.ai/code/session_01JnKSjwwiAQX8ZZcaJLvQEV
</commit_message>
<xml_diff>
--- a/docs/PLI-User-Guide.docx
+++ b/docs/PLI-User-Guide.docx
@@ -458,7 +458,7 @@
           <w:sz w:val="20"/>
           <w:szCs w:val="20"/>
         </w:rPr>
-        <w:t xml:space="preserve">The command line</w:t>
+        <w:t xml:space="preserve">Building the program in one step</w:t>
       </w:r>
       <w:r>
         <w:rPr>
@@ -487,7 +487,7 @@
           <w:sz w:val="20"/>
           <w:szCs w:val="20"/>
         </w:rPr>
-        <w:t xml:space="preserve">Windows</w:t>
+        <w:t xml:space="preserve">The command line</w:t>
       </w:r>
       <w:r>
         <w:rPr>
@@ -516,7 +516,7 @@
           <w:sz w:val="20"/>
           <w:szCs w:val="20"/>
         </w:rPr>
-        <w:t xml:space="preserve">Linux packages</w:t>
+        <w:t xml:space="preserve">Windows</w:t>
       </w:r>
       <w:r>
         <w:rPr>
@@ -527,6 +527,35 @@
           <w:szCs w:val="20"/>
         </w:rPr>
         <w:t xml:space="preserve">	3</w:t>
+      </w:r>
+    </w:p>
+    <w:p>
+      <w:pPr>
+        <w:tabs>
+          <w:tab w:val="right" w:pos="9638" w:leader="dot"/>
+        </w:tabs>
+        <w:spacing w:after="20" w:before="20"/>
+        <w:ind w:left="400"/>
+      </w:pPr>
+      <w:r>
+        <w:rPr>
+          <w:rFonts w:ascii="Times New Roman" w:cs="Times New Roman" w:eastAsia="Times New Roman" w:hAnsi="Times New Roman"/>
+          <w:b w:val="false"/>
+          <w:bCs w:val="false"/>
+          <w:sz w:val="20"/>
+          <w:szCs w:val="20"/>
+        </w:rPr>
+        <w:t xml:space="preserve">Linux packages</w:t>
+      </w:r>
+      <w:r>
+        <w:rPr>
+          <w:rFonts w:ascii="Times New Roman" w:cs="Times New Roman" w:eastAsia="Times New Roman" w:hAnsi="Times New Roman"/>
+          <w:b w:val="false"/>
+          <w:bCs w:val="false"/>
+          <w:sz w:val="20"/>
+          <w:szCs w:val="20"/>
+        </w:rPr>
+        <w:t xml:space="preserve">	4</w:t>
       </w:r>
     </w:p>
     <w:p>
@@ -3969,6 +3998,282 @@
         <w:pStyle w:val="Heading2"/>
       </w:pPr>
       <w:r>
+        <w:t xml:space="preserve">Building the program in one step</w:t>
+      </w:r>
+    </w:p>
+    <w:p>
+      <w:pPr>
+        <w:keepNext w:val="false"/>
+        <w:spacing w:after="120" w:before="0"/>
+      </w:pPr>
+      <w:r>
+        <w:rPr>
+          <w:rFonts w:ascii="Times New Roman" w:cs="Times New Roman" w:eastAsia="Times New Roman" w:hAnsi="Times New Roman"/>
+          <w:b w:val="false"/>
+          <w:bCs w:val="false"/>
+          <w:sz w:val="21"/>
+          <w:szCs w:val="21"/>
+        </w:rPr>
+        <w:t xml:space="preserve">With the option </w:t>
+      </w:r>
+      <w:r>
+        <w:rPr>
+          <w:rFonts w:ascii="Courier New" w:cs="Courier New" w:eastAsia="Courier New" w:hAnsi="Courier New"/>
+          <w:sz w:val="19"/>
+          <w:szCs w:val="19"/>
+        </w:rPr>
+        <w:t xml:space="preserve">-c</w:t>
+      </w:r>
+      <w:r>
+        <w:rPr>
+          <w:rFonts w:ascii="Times New Roman" w:cs="Times New Roman" w:eastAsia="Times New Roman" w:hAnsi="Times New Roman"/>
+          <w:b w:val="false"/>
+          <w:bCs w:val="false"/>
+          <w:sz w:val="21"/>
+          <w:szCs w:val="21"/>
+        </w:rPr>
+        <w:t xml:space="preserve"> the translator also builds the program. It looks for a C compiler in this order: the one named by </w:t>
+      </w:r>
+      <w:r>
+        <w:rPr>
+          <w:rFonts w:ascii="Courier New" w:cs="Courier New" w:eastAsia="Courier New" w:hAnsi="Courier New"/>
+          <w:sz w:val="19"/>
+          <w:szCs w:val="19"/>
+        </w:rPr>
+        <w:t xml:space="preserve">-cc</w:t>
+      </w:r>
+      <w:r>
+        <w:rPr>
+          <w:rFonts w:ascii="Times New Roman" w:cs="Times New Roman" w:eastAsia="Times New Roman" w:hAnsi="Times New Roman"/>
+          <w:b w:val="false"/>
+          <w:bCs w:val="false"/>
+          <w:sz w:val="21"/>
+          <w:szCs w:val="21"/>
+        </w:rPr>
+        <w:t xml:space="preserve">, the command in the environment variable </w:t>
+      </w:r>
+      <w:r>
+        <w:rPr>
+          <w:rFonts w:ascii="Courier New" w:cs="Courier New" w:eastAsia="Courier New" w:hAnsi="Courier New"/>
+          <w:sz w:val="19"/>
+          <w:szCs w:val="19"/>
+        </w:rPr>
+        <w:t xml:space="preserve">PLI_CC</w:t>
+      </w:r>
+      <w:r>
+        <w:rPr>
+          <w:rFonts w:ascii="Times New Roman" w:cs="Times New Roman" w:eastAsia="Times New Roman" w:hAnsi="Times New Roman"/>
+          <w:b w:val="false"/>
+          <w:bCs w:val="false"/>
+          <w:sz w:val="21"/>
+          <w:szCs w:val="21"/>
+        </w:rPr>
+        <w:t xml:space="preserve">, then </w:t>
+      </w:r>
+      <w:r>
+        <w:rPr>
+          <w:rFonts w:ascii="Courier New" w:cs="Courier New" w:eastAsia="Courier New" w:hAnsi="Courier New"/>
+          <w:sz w:val="19"/>
+          <w:szCs w:val="19"/>
+        </w:rPr>
+        <w:t xml:space="preserve">gcc</w:t>
+      </w:r>
+      <w:r>
+        <w:rPr>
+          <w:rFonts w:ascii="Times New Roman" w:cs="Times New Roman" w:eastAsia="Times New Roman" w:hAnsi="Times New Roman"/>
+          <w:b w:val="false"/>
+          <w:bCs w:val="false"/>
+          <w:sz w:val="21"/>
+          <w:szCs w:val="21"/>
+        </w:rPr>
+        <w:t xml:space="preserve">, </w:t>
+      </w:r>
+      <w:r>
+        <w:rPr>
+          <w:rFonts w:ascii="Courier New" w:cs="Courier New" w:eastAsia="Courier New" w:hAnsi="Courier New"/>
+          <w:sz w:val="19"/>
+          <w:szCs w:val="19"/>
+        </w:rPr>
+        <w:t xml:space="preserve">cc</w:t>
+      </w:r>
+      <w:r>
+        <w:rPr>
+          <w:rFonts w:ascii="Times New Roman" w:cs="Times New Roman" w:eastAsia="Times New Roman" w:hAnsi="Times New Roman"/>
+          <w:b w:val="false"/>
+          <w:bCs w:val="false"/>
+          <w:sz w:val="21"/>
+          <w:szCs w:val="21"/>
+        </w:rPr>
+        <w:t xml:space="preserve">, </w:t>
+      </w:r>
+      <w:r>
+        <w:rPr>
+          <w:rFonts w:ascii="Courier New" w:cs="Courier New" w:eastAsia="Courier New" w:hAnsi="Courier New"/>
+          <w:sz w:val="19"/>
+          <w:szCs w:val="19"/>
+        </w:rPr>
+        <w:t xml:space="preserve">clang</w:t>
+      </w:r>
+      <w:r>
+        <w:rPr>
+          <w:rFonts w:ascii="Times New Roman" w:cs="Times New Roman" w:eastAsia="Times New Roman" w:hAnsi="Times New Roman"/>
+          <w:b w:val="false"/>
+          <w:bCs w:val="false"/>
+          <w:sz w:val="21"/>
+          <w:szCs w:val="21"/>
+        </w:rPr>
+        <w:t xml:space="preserve">, </w:t>
+      </w:r>
+      <w:r>
+        <w:rPr>
+          <w:rFonts w:ascii="Courier New" w:cs="Courier New" w:eastAsia="Courier New" w:hAnsi="Courier New"/>
+          <w:sz w:val="19"/>
+          <w:szCs w:val="19"/>
+        </w:rPr>
+        <w:t xml:space="preserve">tcc</w:t>
+      </w:r>
+      <w:r>
+        <w:rPr>
+          <w:rFonts w:ascii="Times New Roman" w:cs="Times New Roman" w:eastAsia="Times New Roman" w:hAnsi="Times New Roman"/>
+          <w:b w:val="false"/>
+          <w:bCs w:val="false"/>
+          <w:sz w:val="21"/>
+          <w:szCs w:val="21"/>
+        </w:rPr>
+        <w:t xml:space="preserve"> and on Windows </w:t>
+      </w:r>
+      <w:r>
+        <w:rPr>
+          <w:rFonts w:ascii="Courier New" w:cs="Courier New" w:eastAsia="Courier New" w:hAnsi="Courier New"/>
+          <w:sz w:val="19"/>
+          <w:szCs w:val="19"/>
+        </w:rPr>
+        <w:t xml:space="preserve">cl</w:t>
+      </w:r>
+      <w:r>
+        <w:rPr>
+          <w:rFonts w:ascii="Times New Roman" w:cs="Times New Roman" w:eastAsia="Times New Roman" w:hAnsi="Times New Roman"/>
+          <w:b w:val="false"/>
+          <w:bCs w:val="false"/>
+          <w:sz w:val="21"/>
+          <w:szCs w:val="21"/>
+        </w:rPr>
+        <w:t xml:space="preserve"> from the path, and last the TinyCC in the directory </w:t>
+      </w:r>
+      <w:r>
+        <w:rPr>
+          <w:rFonts w:ascii="Courier New" w:cs="Courier New" w:eastAsia="Courier New" w:hAnsi="Courier New"/>
+          <w:sz w:val="19"/>
+          <w:szCs w:val="19"/>
+        </w:rPr>
+        <w:t xml:space="preserve">tcc</w:t>
+      </w:r>
+      <w:r>
+        <w:rPr>
+          <w:rFonts w:ascii="Times New Roman" w:cs="Times New Roman" w:eastAsia="Times New Roman" w:hAnsi="Times New Roman"/>
+          <w:b w:val="false"/>
+          <w:bCs w:val="false"/>
+          <w:sz w:val="21"/>
+          <w:szCs w:val="21"/>
+        </w:rPr>
+        <w:t xml:space="preserve"> next to </w:t>
+      </w:r>
+      <w:r>
+        <w:rPr>
+          <w:rFonts w:ascii="Courier New" w:cs="Courier New" w:eastAsia="Courier New" w:hAnsi="Courier New"/>
+          <w:sz w:val="19"/>
+          <w:szCs w:val="19"/>
+        </w:rPr>
+        <w:t xml:space="preserve">pli</w:t>
+      </w:r>
+      <w:r>
+        <w:rPr>
+          <w:rFonts w:ascii="Times New Roman" w:cs="Times New Roman" w:eastAsia="Times New Roman" w:hAnsi="Times New Roman"/>
+          <w:b w:val="false"/>
+          <w:bCs w:val="false"/>
+          <w:sz w:val="21"/>
+          <w:szCs w:val="21"/>
+        </w:rPr>
+        <w:t xml:space="preserve">. </w:t>
+      </w:r>
+      <w:r>
+        <w:rPr>
+          <w:rFonts w:ascii="Courier New" w:cs="Courier New" w:eastAsia="Courier New" w:hAnsi="Courier New"/>
+          <w:sz w:val="19"/>
+          <w:szCs w:val="19"/>
+        </w:rPr>
+        <w:t xml:space="preserve">-cc bundled</w:t>
+      </w:r>
+      <w:r>
+        <w:rPr>
+          <w:rFonts w:ascii="Times New Roman" w:cs="Times New Roman" w:eastAsia="Times New Roman" w:hAnsi="Times New Roman"/>
+          <w:b w:val="false"/>
+          <w:bCs w:val="false"/>
+          <w:sz w:val="21"/>
+          <w:szCs w:val="21"/>
+        </w:rPr>
+        <w:t xml:space="preserve"> forces the bundled compiler. </w:t>
+      </w:r>
+      <w:r>
+        <w:rPr>
+          <w:rFonts w:ascii="Courier New" w:cs="Courier New" w:eastAsia="Courier New" w:hAnsi="Courier New"/>
+          <w:sz w:val="19"/>
+          <w:szCs w:val="19"/>
+        </w:rPr>
+        <w:t xml:space="preserve">-o</w:t>
+      </w:r>
+      <w:r>
+        <w:rPr>
+          <w:rFonts w:ascii="Times New Roman" w:cs="Times New Roman" w:eastAsia="Times New Roman" w:hAnsi="Times New Roman"/>
+          <w:b w:val="false"/>
+          <w:bCs w:val="false"/>
+          <w:sz w:val="21"/>
+          <w:szCs w:val="21"/>
+        </w:rPr>
+        <w:t xml:space="preserve"> names the program, and the C file is kept next to the source. Example: </w:t>
+      </w:r>
+      <w:r>
+        <w:rPr>
+          <w:rFonts w:ascii="Courier New" w:cs="Courier New" w:eastAsia="Courier New" w:hAnsi="Courier New"/>
+          <w:sz w:val="19"/>
+          <w:szCs w:val="19"/>
+        </w:rPr>
+        <w:t xml:space="preserve">pli -c examples/sieve.pli -o sieve</w:t>
+      </w:r>
+      <w:r>
+        <w:rPr>
+          <w:rFonts w:ascii="Times New Roman" w:cs="Times New Roman" w:eastAsia="Times New Roman" w:hAnsi="Times New Roman"/>
+          <w:b w:val="false"/>
+          <w:bCs w:val="false"/>
+          <w:sz w:val="21"/>
+          <w:szCs w:val="21"/>
+        </w:rPr>
+        <w:t xml:space="preserve">. TinyCC is distributed under the GNU Lesser General Public License; its licence text is in the </w:t>
+      </w:r>
+      <w:r>
+        <w:rPr>
+          <w:rFonts w:ascii="Courier New" w:cs="Courier New" w:eastAsia="Courier New" w:hAnsi="Courier New"/>
+          <w:sz w:val="19"/>
+          <w:szCs w:val="19"/>
+        </w:rPr>
+        <w:t xml:space="preserve">tcc</w:t>
+      </w:r>
+      <w:r>
+        <w:rPr>
+          <w:rFonts w:ascii="Times New Roman" w:cs="Times New Roman" w:eastAsia="Times New Roman" w:hAnsi="Times New Roman"/>
+          <w:b w:val="false"/>
+          <w:bCs w:val="false"/>
+          <w:sz w:val="21"/>
+          <w:szCs w:val="21"/>
+        </w:rPr>
+        <w:t xml:space="preserve"> directory.</w:t>
+      </w:r>
+    </w:p>
+    <w:p>
+      <w:pPr>
+        <w:pStyle w:val="Heading2"/>
+      </w:pPr>
+      <w:r>
         <w:t xml:space="preserve">The command line</w:t>
       </w:r>
     </w:p>
@@ -4273,7 +4578,7 @@
           </w:tcPr>
           <w:p>
             <w:pPr>
-              <w:keepNext/>
+              <w:keepNext w:val="false"/>
               <w:spacing w:after="0"/>
             </w:pPr>
             <w:r>
@@ -4282,7 +4587,7 @@
                 <w:sz w:val="18"/>
                 <w:szCs w:val="18"/>
               </w:rPr>
-              <w:t xml:space="preserve">-s</w:t>
+              <w:t xml:space="preserve">-c</w:t>
             </w:r>
           </w:p>
         </w:tc>
@@ -4298,7 +4603,7 @@
           </w:tcPr>
           <w:p>
             <w:pPr>
-              <w:keepNext/>
+              <w:keepNext w:val="false"/>
               <w:spacing w:after="0"/>
             </w:pPr>
             <w:r>
@@ -4309,7 +4614,7 @@
                 <w:sz w:val="19"/>
                 <w:szCs w:val="19"/>
               </w:rPr>
-              <w:t xml:space="preserve">Check array subscripts at run time and raise SUBSCRIPTRANGE. The prefix </w:t>
+              <w:t xml:space="preserve">Translate and then build the program with a C compiler. </w:t>
             </w:r>
             <w:r>
               <w:rPr>
@@ -4317,7 +4622,7 @@
                 <w:sz w:val="18"/>
                 <w:szCs w:val="18"/>
               </w:rPr>
-              <w:t xml:space="preserve">(SUBSCRIPTRANGE):</w:t>
+              <w:t xml:space="preserve">-o</w:t>
             </w:r>
             <w:r>
               <w:rPr>
@@ -4327,6 +4632,210 @@
                 <w:sz w:val="19"/>
                 <w:szCs w:val="19"/>
               </w:rPr>
+              <w:t xml:space="preserve"> then names the program, not the C file.</w:t>
+            </w:r>
+          </w:p>
+        </w:tc>
+      </w:tr>
+      <w:tr>
+        <w:trPr>
+          <w:cantSplit/>
+        </w:trPr>
+        <w:tc>
+          <w:tcPr>
+            <w:tcW w:type="dxa" w:w="1700"/>
+            <w:tcMar>
+              <w:top w:type="dxa" w:w="60"/>
+              <w:left w:type="dxa" w:w="100"/>
+              <w:bottom w:type="dxa" w:w="60"/>
+              <w:right w:type="dxa" w:w="100"/>
+            </w:tcMar>
+          </w:tcPr>
+          <w:p>
+            <w:pPr>
+              <w:keepNext w:val="false"/>
+              <w:spacing w:after="0"/>
+            </w:pPr>
+            <w:r>
+              <w:rPr>
+                <w:rFonts w:ascii="Courier New" w:cs="Courier New" w:eastAsia="Courier New" w:hAnsi="Courier New"/>
+                <w:sz w:val="18"/>
+                <w:szCs w:val="18"/>
+              </w:rPr>
+              <w:t xml:space="preserve">-cc name</w:t>
+            </w:r>
+          </w:p>
+        </w:tc>
+        <w:tc>
+          <w:tcPr>
+            <w:tcW w:type="dxa" w:w="7938"/>
+            <w:tcMar>
+              <w:top w:type="dxa" w:w="60"/>
+              <w:left w:type="dxa" w:w="100"/>
+              <w:bottom w:type="dxa" w:w="60"/>
+              <w:right w:type="dxa" w:w="100"/>
+            </w:tcMar>
+          </w:tcPr>
+          <w:p>
+            <w:pPr>
+              <w:keepNext w:val="false"/>
+              <w:spacing w:after="0"/>
+            </w:pPr>
+            <w:r>
+              <w:rPr>
+                <w:rFonts w:ascii="Times New Roman" w:cs="Times New Roman" w:eastAsia="Times New Roman" w:hAnsi="Times New Roman"/>
+                <w:b w:val="false"/>
+                <w:bCs w:val="false"/>
+                <w:sz w:val="19"/>
+                <w:szCs w:val="19"/>
+              </w:rPr>
+              <w:t xml:space="preserve">The C compiler for </w:t>
+            </w:r>
+            <w:r>
+              <w:rPr>
+                <w:rFonts w:ascii="Courier New" w:cs="Courier New" w:eastAsia="Courier New" w:hAnsi="Courier New"/>
+                <w:sz w:val="18"/>
+                <w:szCs w:val="18"/>
+              </w:rPr>
+              <w:t xml:space="preserve">-c</w:t>
+            </w:r>
+            <w:r>
+              <w:rPr>
+                <w:rFonts w:ascii="Times New Roman" w:cs="Times New Roman" w:eastAsia="Times New Roman" w:hAnsi="Times New Roman"/>
+                <w:b w:val="false"/>
+                <w:bCs w:val="false"/>
+                <w:sz w:val="19"/>
+                <w:szCs w:val="19"/>
+              </w:rPr>
+              <w:t xml:space="preserve">: a command such as </w:t>
+            </w:r>
+            <w:r>
+              <w:rPr>
+                <w:rFonts w:ascii="Courier New" w:cs="Courier New" w:eastAsia="Courier New" w:hAnsi="Courier New"/>
+                <w:sz w:val="18"/>
+                <w:szCs w:val="18"/>
+              </w:rPr>
+              <w:t xml:space="preserve">gcc</w:t>
+            </w:r>
+            <w:r>
+              <w:rPr>
+                <w:rFonts w:ascii="Times New Roman" w:cs="Times New Roman" w:eastAsia="Times New Roman" w:hAnsi="Times New Roman"/>
+                <w:b w:val="false"/>
+                <w:bCs w:val="false"/>
+                <w:sz w:val="19"/>
+                <w:szCs w:val="19"/>
+              </w:rPr>
+              <w:t xml:space="preserve">, or </w:t>
+            </w:r>
+            <w:r>
+              <w:rPr>
+                <w:rFonts w:ascii="Courier New" w:cs="Courier New" w:eastAsia="Courier New" w:hAnsi="Courier New"/>
+                <w:sz w:val="18"/>
+                <w:szCs w:val="18"/>
+              </w:rPr>
+              <w:t xml:space="preserve">bundled</w:t>
+            </w:r>
+            <w:r>
+              <w:rPr>
+                <w:rFonts w:ascii="Times New Roman" w:cs="Times New Roman" w:eastAsia="Times New Roman" w:hAnsi="Times New Roman"/>
+                <w:b w:val="false"/>
+                <w:bCs w:val="false"/>
+                <w:sz w:val="19"/>
+                <w:szCs w:val="19"/>
+              </w:rPr>
+              <w:t xml:space="preserve"> for the TinyCC next to </w:t>
+            </w:r>
+            <w:r>
+              <w:rPr>
+                <w:rFonts w:ascii="Courier New" w:cs="Courier New" w:eastAsia="Courier New" w:hAnsi="Courier New"/>
+                <w:sz w:val="18"/>
+                <w:szCs w:val="18"/>
+              </w:rPr>
+              <w:t xml:space="preserve">pli</w:t>
+            </w:r>
+            <w:r>
+              <w:rPr>
+                <w:rFonts w:ascii="Times New Roman" w:cs="Times New Roman" w:eastAsia="Times New Roman" w:hAnsi="Times New Roman"/>
+                <w:b w:val="false"/>
+                <w:bCs w:val="false"/>
+                <w:sz w:val="19"/>
+                <w:szCs w:val="19"/>
+              </w:rPr>
+              <w:t xml:space="preserve">.</w:t>
+            </w:r>
+          </w:p>
+        </w:tc>
+      </w:tr>
+      <w:tr>
+        <w:trPr>
+          <w:cantSplit/>
+        </w:trPr>
+        <w:tc>
+          <w:tcPr>
+            <w:tcW w:type="dxa" w:w="1700"/>
+            <w:tcMar>
+              <w:top w:type="dxa" w:w="60"/>
+              <w:left w:type="dxa" w:w="100"/>
+              <w:bottom w:type="dxa" w:w="60"/>
+              <w:right w:type="dxa" w:w="100"/>
+            </w:tcMar>
+          </w:tcPr>
+          <w:p>
+            <w:pPr>
+              <w:keepNext/>
+              <w:spacing w:after="0"/>
+            </w:pPr>
+            <w:r>
+              <w:rPr>
+                <w:rFonts w:ascii="Courier New" w:cs="Courier New" w:eastAsia="Courier New" w:hAnsi="Courier New"/>
+                <w:sz w:val="18"/>
+                <w:szCs w:val="18"/>
+              </w:rPr>
+              <w:t xml:space="preserve">-s</w:t>
+            </w:r>
+          </w:p>
+        </w:tc>
+        <w:tc>
+          <w:tcPr>
+            <w:tcW w:type="dxa" w:w="7938"/>
+            <w:tcMar>
+              <w:top w:type="dxa" w:w="60"/>
+              <w:left w:type="dxa" w:w="100"/>
+              <w:bottom w:type="dxa" w:w="60"/>
+              <w:right w:type="dxa" w:w="100"/>
+            </w:tcMar>
+          </w:tcPr>
+          <w:p>
+            <w:pPr>
+              <w:keepNext/>
+              <w:spacing w:after="0"/>
+            </w:pPr>
+            <w:r>
+              <w:rPr>
+                <w:rFonts w:ascii="Times New Roman" w:cs="Times New Roman" w:eastAsia="Times New Roman" w:hAnsi="Times New Roman"/>
+                <w:b w:val="false"/>
+                <w:bCs w:val="false"/>
+                <w:sz w:val="19"/>
+                <w:szCs w:val="19"/>
+              </w:rPr>
+              <w:t xml:space="preserve">Check array subscripts at run time and raise SUBSCRIPTRANGE. The prefix </w:t>
+            </w:r>
+            <w:r>
+              <w:rPr>
+                <w:rFonts w:ascii="Courier New" w:cs="Courier New" w:eastAsia="Courier New" w:hAnsi="Courier New"/>
+                <w:sz w:val="18"/>
+                <w:szCs w:val="18"/>
+              </w:rPr>
+              <w:t xml:space="preserve">(SUBSCRIPTRANGE):</w:t>
+            </w:r>
+            <w:r>
+              <w:rPr>
+                <w:rFonts w:ascii="Times New Roman" w:cs="Times New Roman" w:eastAsia="Times New Roman" w:hAnsi="Times New Roman"/>
+                <w:b w:val="false"/>
+                <w:bCs w:val="false"/>
+                <w:sz w:val="19"/>
+                <w:szCs w:val="19"/>
+              </w:rPr>
               <w:t xml:space="preserve"> on a procedure does the same for that procedure alone.</w:t>
             </w:r>
           </w:p>
@@ -4447,7 +4956,7 @@
           <w:sz w:val="21"/>
           <w:szCs w:val="21"/>
         </w:rPr>
-        <w:t xml:space="preserve">, which are linked statically and need no DLL. Both pass the whole test suite under Wine. Translate with </w:t>
+        <w:t xml:space="preserve">, which are linked statically and need no DLL. Both pass the whole test suite under Wine. The zip also holds a small C compiler, TinyCC, in the directory </w:t>
       </w:r>
       <w:r>
         <w:rPr>
@@ -4455,17 +4964,17 @@
           <w:sz w:val="19"/>
           <w:szCs w:val="19"/>
         </w:rPr>
-        <w:t xml:space="preserve">pli prog.pli -o prog.c</w:t>
-      </w:r>
-      <w:r>
-        <w:rPr>
-          <w:rFonts w:ascii="Times New Roman" w:cs="Times New Roman" w:eastAsia="Times New Roman" w:hAnsi="Times New Roman"/>
-          <w:b w:val="false"/>
-          <w:bCs w:val="false"/>
-          <w:sz w:val="21"/>
-          <w:szCs w:val="21"/>
-        </w:rPr>
-        <w:t xml:space="preserve"> and compile the C file with any Windows C compiler, for example </w:t>
+        <w:t xml:space="preserve">tcc</w:t>
+      </w:r>
+      <w:r>
+        <w:rPr>
+          <w:rFonts w:ascii="Times New Roman" w:cs="Times New Roman" w:eastAsia="Times New Roman" w:hAnsi="Times New Roman"/>
+          <w:b w:val="false"/>
+          <w:bCs w:val="false"/>
+          <w:sz w:val="21"/>
+          <w:szCs w:val="21"/>
+        </w:rPr>
+        <w:t xml:space="preserve">, so no other software is needed: </w:t>
       </w:r>
       <w:r>
         <w:rPr>
@@ -4473,17 +4982,17 @@
           <w:sz w:val="19"/>
           <w:szCs w:val="19"/>
         </w:rPr>
-        <w:t xml:space="preserve">gcc -std=c89 -I. prog.c -o prog.exe -lm</w:t>
-      </w:r>
-      <w:r>
-        <w:rPr>
-          <w:rFonts w:ascii="Times New Roman" w:cs="Times New Roman" w:eastAsia="Times New Roman" w:hAnsi="Times New Roman"/>
-          <w:b w:val="false"/>
-          <w:bCs w:val="false"/>
-          <w:sz w:val="21"/>
-          <w:szCs w:val="21"/>
-        </w:rPr>
-        <w:t xml:space="preserve">, with </w:t>
+        <w:t xml:space="preserve">pli -c prog.pli</w:t>
+      </w:r>
+      <w:r>
+        <w:rPr>
+          <w:rFonts w:ascii="Times New Roman" w:cs="Times New Roman" w:eastAsia="Times New Roman" w:hAnsi="Times New Roman"/>
+          <w:b w:val="false"/>
+          <w:bCs w:val="false"/>
+          <w:sz w:val="21"/>
+          <w:szCs w:val="21"/>
+        </w:rPr>
+        <w:t xml:space="preserve"> translates the program and builds </w:t>
       </w:r>
       <w:r>
         <w:rPr>
@@ -4491,17 +5000,17 @@
           <w:sz w:val="19"/>
           <w:szCs w:val="19"/>
         </w:rPr>
-        <w:t xml:space="preserve">plirt.h</w:t>
-      </w:r>
-      <w:r>
-        <w:rPr>
-          <w:rFonts w:ascii="Times New Roman" w:cs="Times New Roman" w:eastAsia="Times New Roman" w:hAnsi="Times New Roman"/>
-          <w:b w:val="false"/>
-          <w:bCs w:val="false"/>
-          <w:sz w:val="21"/>
-          <w:szCs w:val="21"/>
-        </w:rPr>
-        <w:t xml:space="preserve"> in the include path. The runtime prints floating-point exponents with two digits on every system, and record files are opened in binary mode.</w:t>
+        <w:t xml:space="preserve">prog.exe</w:t>
+      </w:r>
+      <w:r>
+        <w:rPr>
+          <w:rFonts w:ascii="Times New Roman" w:cs="Times New Roman" w:eastAsia="Times New Roman" w:hAnsi="Times New Roman"/>
+          <w:b w:val="false"/>
+          <w:bCs w:val="false"/>
+          <w:sz w:val="21"/>
+          <w:szCs w:val="21"/>
+        </w:rPr>
+        <w:t xml:space="preserve"> in one step. The runtime prints floating-point exponents with two digits on every system, and record files are opened in binary mode.</w:t>
       </w:r>
     </w:p>
     <w:p>

</xml_diff>

<commit_message>
Programs of several source files: ENTRY and EXTERNAL across files, file names in messages
Co-Authored-By: Claude Sonnet 5.5 <noreply@anthropic.com>
Claude-Session: https://claude.ai/code/session_01JnKSjwwiAQX8ZZcaJLvQEV
</commit_message>
<xml_diff>
--- a/docs/PLI-User-Guide.docx
+++ b/docs/PLI-User-Guide.docx
@@ -1154,7 +1154,7 @@
           <w:sz w:val="20"/>
           <w:szCs w:val="20"/>
         </w:rPr>
-        <w:t xml:space="preserve">The preprocessor</w:t>
+        <w:t xml:space="preserve">Programs of several source files</w:t>
       </w:r>
       <w:r>
         <w:rPr>
@@ -1165,6 +1165,35 @@
           <w:szCs w:val="20"/>
         </w:rPr>
         <w:t xml:space="preserve">	14</w:t>
+      </w:r>
+    </w:p>
+    <w:p>
+      <w:pPr>
+        <w:tabs>
+          <w:tab w:val="right" w:pos="9638" w:leader="dot"/>
+        </w:tabs>
+        <w:spacing w:after="20" w:before="20"/>
+        <w:ind w:left="400"/>
+      </w:pPr>
+      <w:r>
+        <w:rPr>
+          <w:rFonts w:ascii="Times New Roman" w:cs="Times New Roman" w:eastAsia="Times New Roman" w:hAnsi="Times New Roman"/>
+          <w:b w:val="false"/>
+          <w:bCs w:val="false"/>
+          <w:sz w:val="20"/>
+          <w:szCs w:val="20"/>
+        </w:rPr>
+        <w:t xml:space="preserve">The preprocessor</w:t>
+      </w:r>
+      <w:r>
+        <w:rPr>
+          <w:rFonts w:ascii="Times New Roman" w:cs="Times New Roman" w:eastAsia="Times New Roman" w:hAnsi="Times New Roman"/>
+          <w:b w:val="false"/>
+          <w:bCs w:val="false"/>
+          <w:sz w:val="20"/>
+          <w:szCs w:val="20"/>
+        </w:rPr>
+        <w:t xml:space="preserve">	15</w:t>
       </w:r>
     </w:p>
     <w:p>
@@ -1193,7 +1222,7 @@
           <w:sz w:val="21"/>
           <w:szCs w:val="21"/>
         </w:rPr>
-        <w:t xml:space="preserve">	15</w:t>
+        <w:t xml:space="preserve">	17</w:t>
       </w:r>
     </w:p>
     <w:p>
@@ -1222,7 +1251,7 @@
           <w:sz w:val="20"/>
           <w:szCs w:val="20"/>
         </w:rPr>
-        <w:t xml:space="preserve">	15</w:t>
+        <w:t xml:space="preserve">	17</w:t>
       </w:r>
     </w:p>
     <w:p>
@@ -1251,7 +1280,7 @@
           <w:sz w:val="20"/>
           <w:szCs w:val="20"/>
         </w:rPr>
-        <w:t xml:space="preserve">	15</w:t>
+        <w:t xml:space="preserve">	17</w:t>
       </w:r>
     </w:p>
     <w:p>
@@ -1280,7 +1309,7 @@
           <w:sz w:val="20"/>
           <w:szCs w:val="20"/>
         </w:rPr>
-        <w:t xml:space="preserve">	16</w:t>
+        <w:t xml:space="preserve">	18</w:t>
       </w:r>
     </w:p>
     <w:p>
@@ -1309,7 +1338,7 @@
           <w:sz w:val="20"/>
           <w:szCs w:val="20"/>
         </w:rPr>
-        <w:t xml:space="preserve">	16</w:t>
+        <w:t xml:space="preserve">	18</w:t>
       </w:r>
     </w:p>
     <w:p>
@@ -1338,7 +1367,7 @@
           <w:sz w:val="20"/>
           <w:szCs w:val="20"/>
         </w:rPr>
-        <w:t xml:space="preserve">	17</w:t>
+        <w:t xml:space="preserve">	19</w:t>
       </w:r>
     </w:p>
     <w:p>
@@ -1367,7 +1396,7 @@
           <w:sz w:val="20"/>
           <w:szCs w:val="20"/>
         </w:rPr>
-        <w:t xml:space="preserve">	17</w:t>
+        <w:t xml:space="preserve">	19</w:t>
       </w:r>
     </w:p>
     <w:p>
@@ -1396,7 +1425,7 @@
           <w:sz w:val="21"/>
           <w:szCs w:val="21"/>
         </w:rPr>
-        <w:t xml:space="preserve">	18</w:t>
+        <w:t xml:space="preserve">	20</w:t>
       </w:r>
     </w:p>
     <w:p>
@@ -1425,7 +1454,7 @@
           <w:sz w:val="20"/>
           <w:szCs w:val="20"/>
         </w:rPr>
-        <w:t xml:space="preserve">	18</w:t>
+        <w:t xml:space="preserve">	20</w:t>
       </w:r>
     </w:p>
     <w:p>
@@ -1454,7 +1483,7 @@
           <w:sz w:val="20"/>
           <w:szCs w:val="20"/>
         </w:rPr>
-        <w:t xml:space="preserve">	18</w:t>
+        <w:t xml:space="preserve">	20</w:t>
       </w:r>
     </w:p>
     <w:p>
@@ -1483,7 +1512,7 @@
           <w:sz w:val="20"/>
           <w:szCs w:val="20"/>
         </w:rPr>
-        <w:t xml:space="preserve">	19</w:t>
+        <w:t xml:space="preserve">	21</w:t>
       </w:r>
     </w:p>
     <w:p>
@@ -1512,7 +1541,7 @@
           <w:sz w:val="20"/>
           <w:szCs w:val="20"/>
         </w:rPr>
-        <w:t xml:space="preserve">	19</w:t>
+        <w:t xml:space="preserve">	21</w:t>
       </w:r>
     </w:p>
     <w:p>
@@ -1541,7 +1570,7 @@
           <w:sz w:val="20"/>
           <w:szCs w:val="20"/>
         </w:rPr>
-        <w:t xml:space="preserve">	20</w:t>
+        <w:t xml:space="preserve">	22</w:t>
       </w:r>
     </w:p>
     <w:p>
@@ -1570,7 +1599,7 @@
           <w:sz w:val="20"/>
           <w:szCs w:val="20"/>
         </w:rPr>
-        <w:t xml:space="preserve">	20</w:t>
+        <w:t xml:space="preserve">	22</w:t>
       </w:r>
     </w:p>
     <w:p>
@@ -1599,7 +1628,7 @@
           <w:sz w:val="21"/>
           <w:szCs w:val="21"/>
         </w:rPr>
-        <w:t xml:space="preserve">	21</w:t>
+        <w:t xml:space="preserve">	23</w:t>
       </w:r>
     </w:p>
     <w:p>
@@ -1628,7 +1657,7 @@
           <w:sz w:val="20"/>
           <w:szCs w:val="20"/>
         </w:rPr>
-        <w:t xml:space="preserve">	21</w:t>
+        <w:t xml:space="preserve">	23</w:t>
       </w:r>
     </w:p>
     <w:p>
@@ -1657,7 +1686,7 @@
           <w:sz w:val="20"/>
           <w:szCs w:val="20"/>
         </w:rPr>
-        <w:t xml:space="preserve">	21</w:t>
+        <w:t xml:space="preserve">	23</w:t>
       </w:r>
     </w:p>
     <w:p>
@@ -1686,7 +1715,7 @@
           <w:sz w:val="20"/>
           <w:szCs w:val="20"/>
         </w:rPr>
-        <w:t xml:space="preserve">	22</w:t>
+        <w:t xml:space="preserve">	24</w:t>
       </w:r>
     </w:p>
     <w:p>
@@ -1715,7 +1744,7 @@
           <w:sz w:val="20"/>
           <w:szCs w:val="20"/>
         </w:rPr>
-        <w:t xml:space="preserve">	23</w:t>
+        <w:t xml:space="preserve">	25</w:t>
       </w:r>
     </w:p>
     <w:p>
@@ -1744,7 +1773,7 @@
           <w:sz w:val="20"/>
           <w:szCs w:val="20"/>
         </w:rPr>
-        <w:t xml:space="preserve">	23</w:t>
+        <w:t xml:space="preserve">	25</w:t>
       </w:r>
     </w:p>
     <w:p>
@@ -1773,7 +1802,7 @@
           <w:sz w:val="21"/>
           <w:szCs w:val="21"/>
         </w:rPr>
-        <w:t xml:space="preserve">	25</w:t>
+        <w:t xml:space="preserve">	27</w:t>
       </w:r>
     </w:p>
     <w:p>
@@ -1802,7 +1831,7 @@
           <w:sz w:val="20"/>
           <w:szCs w:val="20"/>
         </w:rPr>
-        <w:t xml:space="preserve">	25</w:t>
+        <w:t xml:space="preserve">	27</w:t>
       </w:r>
     </w:p>
     <w:p>
@@ -1831,7 +1860,7 @@
           <w:sz w:val="20"/>
           <w:szCs w:val="20"/>
         </w:rPr>
-        <w:t xml:space="preserve">	25</w:t>
+        <w:t xml:space="preserve">	27</w:t>
       </w:r>
     </w:p>
     <w:p>
@@ -1860,7 +1889,7 @@
           <w:sz w:val="20"/>
           <w:szCs w:val="20"/>
         </w:rPr>
-        <w:t xml:space="preserve">	26</w:t>
+        <w:t xml:space="preserve">	28</w:t>
       </w:r>
     </w:p>
     <w:p>
@@ -1889,7 +1918,7 @@
           <w:sz w:val="21"/>
           <w:szCs w:val="21"/>
         </w:rPr>
-        <w:t xml:space="preserve">	27</w:t>
+        <w:t xml:space="preserve">	29</w:t>
       </w:r>
     </w:p>
     <w:p>
@@ -1918,7 +1947,7 @@
           <w:sz w:val="20"/>
           <w:szCs w:val="20"/>
         </w:rPr>
-        <w:t xml:space="preserve">	27</w:t>
+        <w:t xml:space="preserve">	29</w:t>
       </w:r>
     </w:p>
     <w:p>
@@ -1947,7 +1976,7 @@
           <w:sz w:val="20"/>
           <w:szCs w:val="20"/>
         </w:rPr>
-        <w:t xml:space="preserve">	27</w:t>
+        <w:t xml:space="preserve">	29</w:t>
       </w:r>
     </w:p>
     <w:p>
@@ -1976,7 +2005,7 @@
           <w:sz w:val="20"/>
           <w:szCs w:val="20"/>
         </w:rPr>
-        <w:t xml:space="preserve">	27</w:t>
+        <w:t xml:space="preserve">	29</w:t>
       </w:r>
     </w:p>
     <w:p>
@@ -2005,7 +2034,7 @@
           <w:sz w:val="21"/>
           <w:szCs w:val="21"/>
         </w:rPr>
-        <w:t xml:space="preserve">	29</w:t>
+        <w:t xml:space="preserve">	31</w:t>
       </w:r>
     </w:p>
     <w:p>
@@ -2034,7 +2063,7 @@
           <w:sz w:val="20"/>
           <w:szCs w:val="20"/>
         </w:rPr>
-        <w:t xml:space="preserve">	29</w:t>
+        <w:t xml:space="preserve">	31</w:t>
       </w:r>
     </w:p>
     <w:p>
@@ -2063,7 +2092,7 @@
           <w:sz w:val="20"/>
           <w:szCs w:val="20"/>
         </w:rPr>
-        <w:t xml:space="preserve">	29</w:t>
+        <w:t xml:space="preserve">	31</w:t>
       </w:r>
     </w:p>
     <w:p>
@@ -2092,7 +2121,7 @@
           <w:sz w:val="21"/>
           <w:szCs w:val="21"/>
         </w:rPr>
-        <w:t xml:space="preserve">	31</w:t>
+        <w:t xml:space="preserve">	33</w:t>
       </w:r>
     </w:p>
     <w:p>
@@ -14748,7 +14777,7 @@
         <w:pStyle w:val="Heading2"/>
       </w:pPr>
       <w:r>
-        <w:t xml:space="preserve">The preprocessor</w:t>
+        <w:t xml:space="preserve">Programs of several source files</w:t>
       </w:r>
     </w:p>
     <w:p>
@@ -14764,7 +14793,7 @@
           <w:sz w:val="21"/>
           <w:szCs w:val="21"/>
         </w:rPr>
-        <w:t xml:space="preserve">Two preprocessor statements are executed while the source is read. </w:t>
+        <w:t xml:space="preserve">A program may be spread over several source files, which the translator reads together: </w:t>
       </w:r>
       <w:r>
         <w:rPr>
@@ -14772,37 +14801,33 @@
           <w:sz w:val="19"/>
           <w:szCs w:val="19"/>
         </w:rPr>
-        <w:t xml:space="preserve">%REPLACE name BY value;</w:t>
-      </w:r>
-      <w:r>
-        <w:rPr>
-          <w:rFonts w:ascii="Times New Roman" w:cs="Times New Roman" w:eastAsia="Times New Roman" w:hAnsi="Times New Roman"/>
-          <w:b w:val="false"/>
-          <w:bCs w:val="false"/>
-          <w:sz w:val="21"/>
-          <w:szCs w:val="21"/>
-        </w:rPr>
-        <w:t xml:space="preserve"> replaces every later occurrence of the identifier </w:t>
-      </w:r>
-      <w:r>
-        <w:rPr>
-          <w:rFonts w:ascii="Times New Roman" w:cs="Times New Roman" w:eastAsia="Times New Roman" w:hAnsi="Times New Roman"/>
-          <w:i/>
-          <w:iCs/>
-          <w:sz w:val="21"/>
-          <w:szCs w:val="21"/>
-        </w:rPr>
-        <w:t xml:space="preserve">name</w:t>
-      </w:r>
-      <w:r>
-        <w:rPr>
-          <w:rFonts w:ascii="Times New Roman" w:cs="Times New Roman" w:eastAsia="Times New Roman" w:hAnsi="Times New Roman"/>
-          <w:b w:val="false"/>
-          <w:bCs w:val="false"/>
-          <w:sz w:val="21"/>
-          <w:szCs w:val="21"/>
-        </w:rPr>
-        <w:t xml:space="preserve"> by a number or string. </w:t>
+        <w:t xml:space="preserve">pli main.pli util.pli -c -o prog</w:t>
+      </w:r>
+      <w:r>
+        <w:rPr>
+          <w:rFonts w:ascii="Times New Roman" w:cs="Times New Roman" w:eastAsia="Times New Roman" w:hAnsi="Times New Roman"/>
+          <w:b w:val="false"/>
+          <w:bCs w:val="false"/>
+          <w:sz w:val="21"/>
+          <w:szCs w:val="21"/>
+        </w:rPr>
+        <w:t xml:space="preserve">. The files make one program, so a procedure in one file can call a procedure of any other, and the order of the files does not matter. Exactly one procedure may have OPTIONS(MAIN). Error messages name the file.</w:t>
+      </w:r>
+    </w:p>
+    <w:p>
+      <w:pPr>
+        <w:keepNext w:val="false"/>
+        <w:spacing w:after="120" w:before="0"/>
+      </w:pPr>
+      <w:r>
+        <w:rPr>
+          <w:rFonts w:ascii="Times New Roman" w:cs="Times New Roman" w:eastAsia="Times New Roman" w:hAnsi="Times New Roman"/>
+          <w:b w:val="false"/>
+          <w:bCs w:val="false"/>
+          <w:sz w:val="21"/>
+          <w:szCs w:val="21"/>
+        </w:rPr>
+        <w:t xml:space="preserve">A call to a procedure in another file is best declared with an ENTRY declaration, </w:t>
       </w:r>
       <w:r>
         <w:rPr>
@@ -14810,37 +14835,17 @@
           <w:sz w:val="19"/>
           <w:szCs w:val="19"/>
         </w:rPr>
-        <w:t xml:space="preserve">%INCLUDE name;</w:t>
-      </w:r>
-      <w:r>
-        <w:rPr>
-          <w:rFonts w:ascii="Times New Roman" w:cs="Times New Roman" w:eastAsia="Times New Roman" w:hAnsi="Times New Roman"/>
-          <w:b w:val="false"/>
-          <w:bCs w:val="false"/>
-          <w:sz w:val="21"/>
-          <w:szCs w:val="21"/>
-        </w:rPr>
-        <w:t xml:space="preserve"> inserts the text of the file </w:t>
-      </w:r>
-      <w:r>
-        <w:rPr>
-          <w:rFonts w:ascii="Times New Roman" w:cs="Times New Roman" w:eastAsia="Times New Roman" w:hAnsi="Times New Roman"/>
-          <w:i/>
-          <w:iCs/>
-          <w:sz w:val="21"/>
-          <w:szCs w:val="21"/>
-        </w:rPr>
-        <w:t xml:space="preserve">name</w:t>
-      </w:r>
-      <w:r>
-        <w:rPr>
-          <w:rFonts w:ascii="Times New Roman" w:cs="Times New Roman" w:eastAsia="Times New Roman" w:hAnsi="Times New Roman"/>
-          <w:b w:val="false"/>
-          <w:bCs w:val="false"/>
-          <w:sz w:val="21"/>
-          <w:szCs w:val="21"/>
-        </w:rPr>
-        <w:t xml:space="preserve"> at this point: the translator looks for </w:t>
+        <w:t xml:space="preserve">DECLARE SQUARE ENTRY(FIXED BINARY(31)) RETURNS(FIXED BINARY(31));</w:t>
+      </w:r>
+      <w:r>
+        <w:rPr>
+          <w:rFonts w:ascii="Times New Roman" w:cs="Times New Roman" w:eastAsia="Times New Roman" w:hAnsi="Times New Roman"/>
+          <w:b w:val="false"/>
+          <w:bCs w:val="false"/>
+          <w:sz w:val="21"/>
+          <w:szCs w:val="21"/>
+        </w:rPr>
+        <w:t xml:space="preserve">, as in PL/I; the translator then finds the procedure of that name. The parameter descriptions in the ENTRY declaration are accepted but not checked against the procedure. A variable that is shared between files is declared </w:t>
       </w:r>
       <w:r>
         <w:rPr>
@@ -14848,53 +14853,17 @@
           <w:sz w:val="19"/>
           <w:szCs w:val="19"/>
         </w:rPr>
-        <w:t xml:space="preserve">name</w:t>
-      </w:r>
-      <w:r>
-        <w:rPr>
-          <w:rFonts w:ascii="Times New Roman" w:cs="Times New Roman" w:eastAsia="Times New Roman" w:hAnsi="Times New Roman"/>
-          <w:b w:val="false"/>
-          <w:bCs w:val="false"/>
-          <w:sz w:val="21"/>
-          <w:szCs w:val="21"/>
-        </w:rPr>
-        <w:t xml:space="preserve">, </w:t>
-      </w:r>
-      <w:r>
-        <w:rPr>
-          <w:rFonts w:ascii="Courier New" w:cs="Courier New" w:eastAsia="Courier New" w:hAnsi="Courier New"/>
-          <w:sz w:val="19"/>
-          <w:szCs w:val="19"/>
-        </w:rPr>
-        <w:t xml:space="preserve">name.inc</w:t>
-      </w:r>
-      <w:r>
-        <w:rPr>
-          <w:rFonts w:ascii="Times New Roman" w:cs="Times New Roman" w:eastAsia="Times New Roman" w:hAnsi="Times New Roman"/>
-          <w:b w:val="false"/>
-          <w:bCs w:val="false"/>
-          <w:sz w:val="21"/>
-          <w:szCs w:val="21"/>
-        </w:rPr>
-        <w:t xml:space="preserve">, </w:t>
-      </w:r>
-      <w:r>
-        <w:rPr>
-          <w:rFonts w:ascii="Courier New" w:cs="Courier New" w:eastAsia="Courier New" w:hAnsi="Courier New"/>
-          <w:sz w:val="19"/>
-          <w:szCs w:val="19"/>
-        </w:rPr>
-        <w:t xml:space="preserve">name.pli</w:t>
-      </w:r>
-      <w:r>
-        <w:rPr>
-          <w:rFonts w:ascii="Times New Roman" w:cs="Times New Roman" w:eastAsia="Times New Roman" w:hAnsi="Times New Roman"/>
-          <w:b w:val="false"/>
-          <w:bCs w:val="false"/>
-          <w:sz w:val="21"/>
-          <w:szCs w:val="21"/>
-        </w:rPr>
-        <w:t xml:space="preserve">, and then in the directory of the including file. Includes may be nested to 8 levels. The statements %PAGE, %SKIP, %NOPRINT and %NOTE are accepted and ignored.</w:t>
+        <w:t xml:space="preserve">EXTERNAL</w:t>
+      </w:r>
+      <w:r>
+        <w:rPr>
+          <w:rFonts w:ascii="Times New Roman" w:cs="Times New Roman" w:eastAsia="Times New Roman" w:hAnsi="Times New Roman"/>
+          <w:b w:val="false"/>
+          <w:bCs w:val="false"/>
+          <w:sz w:val="21"/>
+          <w:szCs w:val="21"/>
+        </w:rPr>
+        <w:t xml:space="preserve"> in every file that uses it; there is one copy of it, and it may be declared inside a procedure or outside. If several declarations have an INITIAL attribute, the first one wins. EXTERNAL structures are not shared.</w:t>
       </w:r>
     </w:p>
     <w:tbl>
@@ -14939,49 +14908,77 @@
                 <w:sz w:val="17"/>
                 <w:szCs w:val="17"/>
               </w:rPr>
-              <w:t xml:space="preserve">DEMO: PROCEDURE OPTIONS(MAIN);</w:t>
-            </w:r>
-          </w:p>
-          <w:p>
-            <w:pPr>
-              <w:keepNext/>
-              <w:spacing w:after="0" w:line="228"/>
-            </w:pPr>
-            <w:r>
-              <w:rPr>
-                <w:rFonts w:ascii="Courier New" w:cs="Courier New" w:eastAsia="Courier New" w:hAnsi="Courier New"/>
-                <w:sz w:val="17"/>
-                <w:szCs w:val="17"/>
-              </w:rPr>
-              <w:t xml:space="preserve">%REPLACE N BY 5;</w:t>
-            </w:r>
-          </w:p>
-          <w:p>
-            <w:pPr>
-              <w:keepNext/>
-              <w:spacing w:after="0" w:line="228"/>
-            </w:pPr>
-            <w:r>
-              <w:rPr>
-                <w:rFonts w:ascii="Courier New" w:cs="Courier New" w:eastAsia="Courier New" w:hAnsi="Courier New"/>
-                <w:sz w:val="17"/>
-                <w:szCs w:val="17"/>
-              </w:rPr>
-              <w:t xml:space="preserve">%REPLACE GREETING BY 'hi';</w:t>
-            </w:r>
-          </w:p>
-          <w:p>
-            <w:pPr>
-              <w:keepNext/>
-              <w:spacing w:after="0" w:line="228"/>
-            </w:pPr>
-            <w:r>
-              <w:rPr>
-                <w:rFonts w:ascii="Courier New" w:cs="Courier New" w:eastAsia="Courier New" w:hAnsi="Courier New"/>
-                <w:sz w:val="17"/>
-                <w:szCs w:val="17"/>
-              </w:rPr>
-              <w:t xml:space="preserve">  DECLARE A(N) FIXED BINARY(31);</w:t>
+              <w:t xml:space="preserve">/* main.pli */</w:t>
+            </w:r>
+          </w:p>
+          <w:p>
+            <w:pPr>
+              <w:keepNext/>
+              <w:spacing w:after="0" w:line="228"/>
+            </w:pPr>
+            <w:r>
+              <w:rPr>
+                <w:rFonts w:ascii="Courier New" w:cs="Courier New" w:eastAsia="Courier New" w:hAnsi="Courier New"/>
+                <w:sz w:val="17"/>
+                <w:szCs w:val="17"/>
+              </w:rPr>
+              <w:t xml:space="preserve">/* main program */</w:t>
+            </w:r>
+          </w:p>
+          <w:p>
+            <w:pPr>
+              <w:keepNext/>
+              <w:spacing w:after="0" w:line="228"/>
+            </w:pPr>
+            <w:r>
+              <w:rPr>
+                <w:rFonts w:ascii="Courier New" w:cs="Courier New" w:eastAsia="Courier New" w:hAnsi="Courier New"/>
+                <w:sz w:val="17"/>
+                <w:szCs w:val="17"/>
+              </w:rPr>
+              <w:t xml:space="preserve">MAIN: PROCEDURE OPTIONS(MAIN);</w:t>
+            </w:r>
+          </w:p>
+          <w:p>
+            <w:pPr>
+              <w:keepNext/>
+              <w:spacing w:after="0" w:line="228"/>
+            </w:pPr>
+            <w:r>
+              <w:rPr>
+                <w:rFonts w:ascii="Courier New" w:cs="Courier New" w:eastAsia="Courier New" w:hAnsi="Courier New"/>
+                <w:sz w:val="17"/>
+                <w:szCs w:val="17"/>
+              </w:rPr>
+              <w:t xml:space="preserve">  DECLARE SQUARE ENTRY(FIXED BINARY(31)) RETURNS(FIXED BINARY(31));</w:t>
+            </w:r>
+          </w:p>
+          <w:p>
+            <w:pPr>
+              <w:keepNext/>
+              <w:spacing w:after="0" w:line="228"/>
+            </w:pPr>
+            <w:r>
+              <w:rPr>
+                <w:rFonts w:ascii="Courier New" w:cs="Courier New" w:eastAsia="Courier New" w:hAnsi="Courier New"/>
+                <w:sz w:val="17"/>
+                <w:szCs w:val="17"/>
+              </w:rPr>
+              <w:t xml:space="preserve">  DECLARE SHOW ENTRY(CHAR(*));</w:t>
+            </w:r>
+          </w:p>
+          <w:p>
+            <w:pPr>
+              <w:keepNext/>
+              <w:spacing w:after="0" w:line="228"/>
+            </w:pPr>
+            <w:r>
+              <w:rPr>
+                <w:rFonts w:ascii="Courier New" w:cs="Courier New" w:eastAsia="Courier New" w:hAnsi="Courier New"/>
+                <w:sz w:val="17"/>
+                <w:szCs w:val="17"/>
+              </w:rPr>
+              <w:t xml:space="preserve">  DECLARE COUNTER FIXED BINARY(31) EXTERNAL INITIAL(0);</w:t>
             </w:r>
           </w:p>
           <w:p>
@@ -15009,21 +15006,35 @@
                 <w:sz w:val="17"/>
                 <w:szCs w:val="17"/>
               </w:rPr>
-              <w:t xml:space="preserve">  DO I = 1 TO N;</w:t>
-            </w:r>
-          </w:p>
-          <w:p>
-            <w:pPr>
-              <w:keepNext/>
-              <w:spacing w:after="0" w:line="228"/>
-            </w:pPr>
-            <w:r>
-              <w:rPr>
-                <w:rFonts w:ascii="Courier New" w:cs="Courier New" w:eastAsia="Courier New" w:hAnsi="Courier New"/>
-                <w:sz w:val="17"/>
-                <w:szCs w:val="17"/>
-              </w:rPr>
-              <w:t xml:space="preserve">    A(I) = I * N;</w:t>
+              <w:t xml:space="preserve">  DO I = 1 TO 3;</w:t>
+            </w:r>
+          </w:p>
+          <w:p>
+            <w:pPr>
+              <w:keepNext/>
+              <w:spacing w:after="0" w:line="228"/>
+            </w:pPr>
+            <w:r>
+              <w:rPr>
+                <w:rFonts w:ascii="Courier New" w:cs="Courier New" w:eastAsia="Courier New" w:hAnsi="Courier New"/>
+                <w:sz w:val="17"/>
+                <w:szCs w:val="17"/>
+              </w:rPr>
+              <w:t xml:space="preserve">    CALL SHOW('square of ' || I);</w:t>
+            </w:r>
+          </w:p>
+          <w:p>
+            <w:pPr>
+              <w:keepNext/>
+              <w:spacing w:after="0" w:line="228"/>
+            </w:pPr>
+            <w:r>
+              <w:rPr>
+                <w:rFonts w:ascii="Courier New" w:cs="Courier New" w:eastAsia="Courier New" w:hAnsi="Courier New"/>
+                <w:sz w:val="17"/>
+                <w:szCs w:val="17"/>
+              </w:rPr>
+              <w:t xml:space="preserve">    PUT SKIP LIST(SQUARE(I));</w:t>
             </w:r>
           </w:p>
           <w:p>
@@ -15051,21 +15062,21 @@
                 <w:sz w:val="17"/>
                 <w:szCs w:val="17"/>
               </w:rPr>
-              <w:t xml:space="preserve">  PUT SKIP LIST(GREETING, A);</w:t>
-            </w:r>
-          </w:p>
-          <w:p>
-            <w:pPr>
-              <w:keepNext/>
-              <w:spacing w:after="0" w:line="228"/>
-            </w:pPr>
-            <w:r>
-              <w:rPr>
-                <w:rFonts w:ascii="Courier New" w:cs="Courier New" w:eastAsia="Courier New" w:hAnsi="Courier New"/>
-                <w:sz w:val="17"/>
-                <w:szCs w:val="17"/>
-              </w:rPr>
-              <w:t xml:space="preserve">END DEMO;</w:t>
+              <w:t xml:space="preserve">  PUT SKIP LIST('calls', COUNTER);</w:t>
+            </w:r>
+          </w:p>
+          <w:p>
+            <w:pPr>
+              <w:keepNext/>
+              <w:spacing w:after="0" w:line="228"/>
+            </w:pPr>
+            <w:r>
+              <w:rPr>
+                <w:rFonts w:ascii="Courier New" w:cs="Courier New" w:eastAsia="Courier New" w:hAnsi="Courier New"/>
+                <w:sz w:val="17"/>
+                <w:szCs w:val="17"/>
+              </w:rPr>
+              <w:t xml:space="preserve">END MAIN;</w:t>
             </w:r>
           </w:p>
           <w:p>
@@ -15093,6 +15104,230 @@
                 <w:sz w:val="17"/>
                 <w:szCs w:val="17"/>
               </w:rPr>
+              <w:t xml:space="preserve">/* util.pli */</w:t>
+            </w:r>
+          </w:p>
+          <w:p>
+            <w:pPr>
+              <w:keepNext/>
+              <w:spacing w:after="0" w:line="228"/>
+            </w:pPr>
+            <w:r>
+              <w:rPr>
+                <w:rFonts w:ascii="Courier New" w:cs="Courier New" w:eastAsia="Courier New" w:hAnsi="Courier New"/>
+                <w:sz w:val="17"/>
+                <w:szCs w:val="17"/>
+              </w:rPr>
+              <w:t xml:space="preserve">/* utilities */</w:t>
+            </w:r>
+          </w:p>
+          <w:p>
+            <w:pPr>
+              <w:keepNext/>
+              <w:spacing w:after="0" w:line="228"/>
+            </w:pPr>
+            <w:r>
+              <w:rPr>
+                <w:rFonts w:ascii="Courier New" w:cs="Courier New" w:eastAsia="Courier New" w:hAnsi="Courier New"/>
+                <w:sz w:val="17"/>
+                <w:szCs w:val="17"/>
+              </w:rPr>
+              <w:t xml:space="preserve">DECLARE COUNTER FIXED BINARY(31) EXTERNAL;</w:t>
+            </w:r>
+          </w:p>
+          <w:p>
+            <w:pPr>
+              <w:keepNext/>
+              <w:spacing w:after="0" w:line="228"/>
+            </w:pPr>
+            <w:r>
+              <w:rPr>
+                <w:rFonts w:ascii="Courier New" w:cs="Courier New" w:eastAsia="Courier New" w:hAnsi="Courier New"/>
+                <w:sz w:val="17"/>
+                <w:szCs w:val="17"/>
+              </w:rPr>
+              <w:t xml:space="preserve"> </w:t>
+            </w:r>
+          </w:p>
+          <w:p>
+            <w:pPr>
+              <w:keepNext/>
+              <w:spacing w:after="0" w:line="228"/>
+            </w:pPr>
+            <w:r>
+              <w:rPr>
+                <w:rFonts w:ascii="Courier New" w:cs="Courier New" w:eastAsia="Courier New" w:hAnsi="Courier New"/>
+                <w:sz w:val="17"/>
+                <w:szCs w:val="17"/>
+              </w:rPr>
+              <w:t xml:space="preserve">SQUARE: PROCEDURE(N) RETURNS(FIXED BINARY(31));</w:t>
+            </w:r>
+          </w:p>
+          <w:p>
+            <w:pPr>
+              <w:keepNext/>
+              <w:spacing w:after="0" w:line="228"/>
+            </w:pPr>
+            <w:r>
+              <w:rPr>
+                <w:rFonts w:ascii="Courier New" w:cs="Courier New" w:eastAsia="Courier New" w:hAnsi="Courier New"/>
+                <w:sz w:val="17"/>
+                <w:szCs w:val="17"/>
+              </w:rPr>
+              <w:t xml:space="preserve">  DECLARE N FIXED BINARY(31);</w:t>
+            </w:r>
+          </w:p>
+          <w:p>
+            <w:pPr>
+              <w:keepNext/>
+              <w:spacing w:after="0" w:line="228"/>
+            </w:pPr>
+            <w:r>
+              <w:rPr>
+                <w:rFonts w:ascii="Courier New" w:cs="Courier New" w:eastAsia="Courier New" w:hAnsi="Courier New"/>
+                <w:sz w:val="17"/>
+                <w:szCs w:val="17"/>
+              </w:rPr>
+              <w:t xml:space="preserve">  COUNTER = COUNTER + 1;</w:t>
+            </w:r>
+          </w:p>
+          <w:p>
+            <w:pPr>
+              <w:keepNext/>
+              <w:spacing w:after="0" w:line="228"/>
+            </w:pPr>
+            <w:r>
+              <w:rPr>
+                <w:rFonts w:ascii="Courier New" w:cs="Courier New" w:eastAsia="Courier New" w:hAnsi="Courier New"/>
+                <w:sz w:val="17"/>
+                <w:szCs w:val="17"/>
+              </w:rPr>
+              <w:t xml:space="preserve">  RETURN(N * N);</w:t>
+            </w:r>
+          </w:p>
+          <w:p>
+            <w:pPr>
+              <w:keepNext/>
+              <w:spacing w:after="0" w:line="228"/>
+            </w:pPr>
+            <w:r>
+              <w:rPr>
+                <w:rFonts w:ascii="Courier New" w:cs="Courier New" w:eastAsia="Courier New" w:hAnsi="Courier New"/>
+                <w:sz w:val="17"/>
+                <w:szCs w:val="17"/>
+              </w:rPr>
+              <w:t xml:space="preserve">END SQUARE;</w:t>
+            </w:r>
+          </w:p>
+          <w:p>
+            <w:pPr>
+              <w:keepNext/>
+              <w:spacing w:after="0" w:line="228"/>
+            </w:pPr>
+            <w:r>
+              <w:rPr>
+                <w:rFonts w:ascii="Courier New" w:cs="Courier New" w:eastAsia="Courier New" w:hAnsi="Courier New"/>
+                <w:sz w:val="17"/>
+                <w:szCs w:val="17"/>
+              </w:rPr>
+              <w:t xml:space="preserve"> </w:t>
+            </w:r>
+          </w:p>
+          <w:p>
+            <w:pPr>
+              <w:keepNext/>
+              <w:spacing w:after="0" w:line="228"/>
+            </w:pPr>
+            <w:r>
+              <w:rPr>
+                <w:rFonts w:ascii="Courier New" w:cs="Courier New" w:eastAsia="Courier New" w:hAnsi="Courier New"/>
+                <w:sz w:val="17"/>
+                <w:szCs w:val="17"/>
+              </w:rPr>
+              <w:t xml:space="preserve">SHOW: PROCEDURE(T);</w:t>
+            </w:r>
+          </w:p>
+          <w:p>
+            <w:pPr>
+              <w:keepNext/>
+              <w:spacing w:after="0" w:line="228"/>
+            </w:pPr>
+            <w:r>
+              <w:rPr>
+                <w:rFonts w:ascii="Courier New" w:cs="Courier New" w:eastAsia="Courier New" w:hAnsi="Courier New"/>
+                <w:sz w:val="17"/>
+                <w:szCs w:val="17"/>
+              </w:rPr>
+              <w:t xml:space="preserve">  DECLARE T CHAR(*);</w:t>
+            </w:r>
+          </w:p>
+          <w:p>
+            <w:pPr>
+              <w:keepNext/>
+              <w:spacing w:after="0" w:line="228"/>
+            </w:pPr>
+            <w:r>
+              <w:rPr>
+                <w:rFonts w:ascii="Courier New" w:cs="Courier New" w:eastAsia="Courier New" w:hAnsi="Courier New"/>
+                <w:sz w:val="17"/>
+                <w:szCs w:val="17"/>
+              </w:rPr>
+              <w:t xml:space="preserve">  PUT SKIP LIST('&gt;', T);</w:t>
+            </w:r>
+          </w:p>
+          <w:p>
+            <w:pPr>
+              <w:keepNext/>
+              <w:spacing w:after="0" w:line="228"/>
+            </w:pPr>
+            <w:r>
+              <w:rPr>
+                <w:rFonts w:ascii="Courier New" w:cs="Courier New" w:eastAsia="Courier New" w:hAnsi="Courier New"/>
+                <w:sz w:val="17"/>
+                <w:szCs w:val="17"/>
+              </w:rPr>
+              <w:t xml:space="preserve">END SHOW;</w:t>
+            </w:r>
+          </w:p>
+          <w:p>
+            <w:pPr>
+              <w:keepNext/>
+              <w:spacing w:after="0" w:line="228"/>
+            </w:pPr>
+            <w:r>
+              <w:rPr>
+                <w:rFonts w:ascii="Courier New" w:cs="Courier New" w:eastAsia="Courier New" w:hAnsi="Courier New"/>
+                <w:sz w:val="17"/>
+                <w:szCs w:val="17"/>
+              </w:rPr>
+              <w:t xml:space="preserve"> </w:t>
+            </w:r>
+          </w:p>
+          <w:p>
+            <w:pPr>
+              <w:keepNext/>
+              <w:spacing w:after="0" w:line="228"/>
+            </w:pPr>
+            <w:r>
+              <w:rPr>
+                <w:rFonts w:ascii="Courier New" w:cs="Courier New" w:eastAsia="Courier New" w:hAnsi="Courier New"/>
+                <w:sz w:val="17"/>
+                <w:szCs w:val="17"/>
+              </w:rPr>
+              <w:t xml:space="preserve">/* pli main.pli util.pli */</w:t>
+            </w:r>
+          </w:p>
+          <w:p>
+            <w:pPr>
+              <w:keepNext/>
+              <w:spacing w:after="0" w:line="228"/>
+            </w:pPr>
+            <w:r>
+              <w:rPr>
+                <w:rFonts w:ascii="Courier New" w:cs="Courier New" w:eastAsia="Courier New" w:hAnsi="Courier New"/>
+                <w:sz w:val="17"/>
+                <w:szCs w:val="17"/>
+              </w:rPr>
               <w:t xml:space="preserve">/* prints */</w:t>
             </w:r>
           </w:p>
@@ -15107,21 +15342,91 @@
                 <w:sz w:val="17"/>
                 <w:szCs w:val="17"/>
               </w:rPr>
-              <w:t xml:space="preserve">hi                      5                       10                      15                      20</w:t>
-            </w:r>
-          </w:p>
-          <w:p>
-            <w:pPr>
-              <w:keepNext/>
-              <w:spacing w:after="0" w:line="228"/>
-            </w:pPr>
-            <w:r>
-              <w:rPr>
-                <w:rFonts w:ascii="Courier New" w:cs="Courier New" w:eastAsia="Courier New" w:hAnsi="Courier New"/>
-                <w:sz w:val="17"/>
-                <w:szCs w:val="17"/>
-              </w:rPr>
-              <w:t xml:space="preserve">25</w:t>
+              <w:t xml:space="preserve">&gt;                       square of 1</w:t>
+            </w:r>
+          </w:p>
+          <w:p>
+            <w:pPr>
+              <w:keepNext/>
+              <w:spacing w:after="0" w:line="228"/>
+            </w:pPr>
+            <w:r>
+              <w:rPr>
+                <w:rFonts w:ascii="Courier New" w:cs="Courier New" w:eastAsia="Courier New" w:hAnsi="Courier New"/>
+                <w:sz w:val="17"/>
+                <w:szCs w:val="17"/>
+              </w:rPr>
+              <w:t xml:space="preserve">1</w:t>
+            </w:r>
+          </w:p>
+          <w:p>
+            <w:pPr>
+              <w:keepNext/>
+              <w:spacing w:after="0" w:line="228"/>
+            </w:pPr>
+            <w:r>
+              <w:rPr>
+                <w:rFonts w:ascii="Courier New" w:cs="Courier New" w:eastAsia="Courier New" w:hAnsi="Courier New"/>
+                <w:sz w:val="17"/>
+                <w:szCs w:val="17"/>
+              </w:rPr>
+              <w:t xml:space="preserve">&gt;                       square of 2</w:t>
+            </w:r>
+          </w:p>
+          <w:p>
+            <w:pPr>
+              <w:keepNext/>
+              <w:spacing w:after="0" w:line="228"/>
+            </w:pPr>
+            <w:r>
+              <w:rPr>
+                <w:rFonts w:ascii="Courier New" w:cs="Courier New" w:eastAsia="Courier New" w:hAnsi="Courier New"/>
+                <w:sz w:val="17"/>
+                <w:szCs w:val="17"/>
+              </w:rPr>
+              <w:t xml:space="preserve">4</w:t>
+            </w:r>
+          </w:p>
+          <w:p>
+            <w:pPr>
+              <w:keepNext/>
+              <w:spacing w:after="0" w:line="228"/>
+            </w:pPr>
+            <w:r>
+              <w:rPr>
+                <w:rFonts w:ascii="Courier New" w:cs="Courier New" w:eastAsia="Courier New" w:hAnsi="Courier New"/>
+                <w:sz w:val="17"/>
+                <w:szCs w:val="17"/>
+              </w:rPr>
+              <w:t xml:space="preserve">&gt;                       square of 3</w:t>
+            </w:r>
+          </w:p>
+          <w:p>
+            <w:pPr>
+              <w:keepNext/>
+              <w:spacing w:after="0" w:line="228"/>
+            </w:pPr>
+            <w:r>
+              <w:rPr>
+                <w:rFonts w:ascii="Courier New" w:cs="Courier New" w:eastAsia="Courier New" w:hAnsi="Courier New"/>
+                <w:sz w:val="17"/>
+                <w:szCs w:val="17"/>
+              </w:rPr>
+              <w:t xml:space="preserve">9</w:t>
+            </w:r>
+          </w:p>
+          <w:p>
+            <w:pPr>
+              <w:keepNext/>
+              <w:spacing w:after="0" w:line="228"/>
+            </w:pPr>
+            <w:r>
+              <w:rPr>
+                <w:rFonts w:ascii="Courier New" w:cs="Courier New" w:eastAsia="Courier New" w:hAnsi="Courier New"/>
+                <w:sz w:val="17"/>
+                <w:szCs w:val="17"/>
+              </w:rPr>
+              <w:t xml:space="preserve">calls                   3</w:t>
             </w:r>
           </w:p>
         </w:tc>
@@ -15140,6 +15445,429 @@
           <w:szCs w:val="18"/>
         </w:rPr>
         <w:t xml:space="preserve">Figure 21. </w:t>
+      </w:r>
+      <w:r>
+        <w:rPr>
+          <w:rFonts w:ascii="Arial" w:cs="Arial" w:eastAsia="Arial" w:hAnsi="Arial"/>
+          <w:sz w:val="18"/>
+          <w:szCs w:val="18"/>
+        </w:rPr>
+        <w:t xml:space="preserve">A program of two source files</w:t>
+      </w:r>
+    </w:p>
+    <w:p>
+      <w:pPr>
+        <w:keepNext w:val="false"/>
+        <w:spacing w:after="120" w:before="0"/>
+      </w:pPr>
+      <w:r>
+        <w:rPr>
+          <w:rFonts w:ascii="Times New Roman" w:cs="Times New Roman" w:eastAsia="Times New Roman" w:hAnsi="Times New Roman"/>
+          <w:b w:val="false"/>
+          <w:bCs w:val="false"/>
+          <w:sz w:val="21"/>
+          <w:szCs w:val="21"/>
+        </w:rPr>
+        <w:t xml:space="preserve">This is whole-program translation. The files are not compiled separately and there are no object modules, so a change to one file means translating them all again. Because the result is one C file, it needs no linker features beyond those of a single program, and it builds the same way on CMS.</w:t>
+      </w:r>
+    </w:p>
+    <w:p>
+      <w:pPr>
+        <w:pStyle w:val="Heading2"/>
+      </w:pPr>
+      <w:r>
+        <w:t xml:space="preserve">The preprocessor</w:t>
+      </w:r>
+    </w:p>
+    <w:p>
+      <w:pPr>
+        <w:keepNext w:val="false"/>
+        <w:spacing w:after="120" w:before="0"/>
+      </w:pPr>
+      <w:r>
+        <w:rPr>
+          <w:rFonts w:ascii="Times New Roman" w:cs="Times New Roman" w:eastAsia="Times New Roman" w:hAnsi="Times New Roman"/>
+          <w:b w:val="false"/>
+          <w:bCs w:val="false"/>
+          <w:sz w:val="21"/>
+          <w:szCs w:val="21"/>
+        </w:rPr>
+        <w:t xml:space="preserve">Two preprocessor statements are executed while the source is read. </w:t>
+      </w:r>
+      <w:r>
+        <w:rPr>
+          <w:rFonts w:ascii="Courier New" w:cs="Courier New" w:eastAsia="Courier New" w:hAnsi="Courier New"/>
+          <w:sz w:val="19"/>
+          <w:szCs w:val="19"/>
+        </w:rPr>
+        <w:t xml:space="preserve">%REPLACE name BY value;</w:t>
+      </w:r>
+      <w:r>
+        <w:rPr>
+          <w:rFonts w:ascii="Times New Roman" w:cs="Times New Roman" w:eastAsia="Times New Roman" w:hAnsi="Times New Roman"/>
+          <w:b w:val="false"/>
+          <w:bCs w:val="false"/>
+          <w:sz w:val="21"/>
+          <w:szCs w:val="21"/>
+        </w:rPr>
+        <w:t xml:space="preserve"> replaces every later occurrence of the identifier </w:t>
+      </w:r>
+      <w:r>
+        <w:rPr>
+          <w:rFonts w:ascii="Times New Roman" w:cs="Times New Roman" w:eastAsia="Times New Roman" w:hAnsi="Times New Roman"/>
+          <w:i/>
+          <w:iCs/>
+          <w:sz w:val="21"/>
+          <w:szCs w:val="21"/>
+        </w:rPr>
+        <w:t xml:space="preserve">name</w:t>
+      </w:r>
+      <w:r>
+        <w:rPr>
+          <w:rFonts w:ascii="Times New Roman" w:cs="Times New Roman" w:eastAsia="Times New Roman" w:hAnsi="Times New Roman"/>
+          <w:b w:val="false"/>
+          <w:bCs w:val="false"/>
+          <w:sz w:val="21"/>
+          <w:szCs w:val="21"/>
+        </w:rPr>
+        <w:t xml:space="preserve"> by a number or string. </w:t>
+      </w:r>
+      <w:r>
+        <w:rPr>
+          <w:rFonts w:ascii="Courier New" w:cs="Courier New" w:eastAsia="Courier New" w:hAnsi="Courier New"/>
+          <w:sz w:val="19"/>
+          <w:szCs w:val="19"/>
+        </w:rPr>
+        <w:t xml:space="preserve">%INCLUDE name;</w:t>
+      </w:r>
+      <w:r>
+        <w:rPr>
+          <w:rFonts w:ascii="Times New Roman" w:cs="Times New Roman" w:eastAsia="Times New Roman" w:hAnsi="Times New Roman"/>
+          <w:b w:val="false"/>
+          <w:bCs w:val="false"/>
+          <w:sz w:val="21"/>
+          <w:szCs w:val="21"/>
+        </w:rPr>
+        <w:t xml:space="preserve"> inserts the text of the file </w:t>
+      </w:r>
+      <w:r>
+        <w:rPr>
+          <w:rFonts w:ascii="Times New Roman" w:cs="Times New Roman" w:eastAsia="Times New Roman" w:hAnsi="Times New Roman"/>
+          <w:i/>
+          <w:iCs/>
+          <w:sz w:val="21"/>
+          <w:szCs w:val="21"/>
+        </w:rPr>
+        <w:t xml:space="preserve">name</w:t>
+      </w:r>
+      <w:r>
+        <w:rPr>
+          <w:rFonts w:ascii="Times New Roman" w:cs="Times New Roman" w:eastAsia="Times New Roman" w:hAnsi="Times New Roman"/>
+          <w:b w:val="false"/>
+          <w:bCs w:val="false"/>
+          <w:sz w:val="21"/>
+          <w:szCs w:val="21"/>
+        </w:rPr>
+        <w:t xml:space="preserve"> at this point: the translator looks for </w:t>
+      </w:r>
+      <w:r>
+        <w:rPr>
+          <w:rFonts w:ascii="Courier New" w:cs="Courier New" w:eastAsia="Courier New" w:hAnsi="Courier New"/>
+          <w:sz w:val="19"/>
+          <w:szCs w:val="19"/>
+        </w:rPr>
+        <w:t xml:space="preserve">name</w:t>
+      </w:r>
+      <w:r>
+        <w:rPr>
+          <w:rFonts w:ascii="Times New Roman" w:cs="Times New Roman" w:eastAsia="Times New Roman" w:hAnsi="Times New Roman"/>
+          <w:b w:val="false"/>
+          <w:bCs w:val="false"/>
+          <w:sz w:val="21"/>
+          <w:szCs w:val="21"/>
+        </w:rPr>
+        <w:t xml:space="preserve">, </w:t>
+      </w:r>
+      <w:r>
+        <w:rPr>
+          <w:rFonts w:ascii="Courier New" w:cs="Courier New" w:eastAsia="Courier New" w:hAnsi="Courier New"/>
+          <w:sz w:val="19"/>
+          <w:szCs w:val="19"/>
+        </w:rPr>
+        <w:t xml:space="preserve">name.inc</w:t>
+      </w:r>
+      <w:r>
+        <w:rPr>
+          <w:rFonts w:ascii="Times New Roman" w:cs="Times New Roman" w:eastAsia="Times New Roman" w:hAnsi="Times New Roman"/>
+          <w:b w:val="false"/>
+          <w:bCs w:val="false"/>
+          <w:sz w:val="21"/>
+          <w:szCs w:val="21"/>
+        </w:rPr>
+        <w:t xml:space="preserve">, </w:t>
+      </w:r>
+      <w:r>
+        <w:rPr>
+          <w:rFonts w:ascii="Courier New" w:cs="Courier New" w:eastAsia="Courier New" w:hAnsi="Courier New"/>
+          <w:sz w:val="19"/>
+          <w:szCs w:val="19"/>
+        </w:rPr>
+        <w:t xml:space="preserve">name.pli</w:t>
+      </w:r>
+      <w:r>
+        <w:rPr>
+          <w:rFonts w:ascii="Times New Roman" w:cs="Times New Roman" w:eastAsia="Times New Roman" w:hAnsi="Times New Roman"/>
+          <w:b w:val="false"/>
+          <w:bCs w:val="false"/>
+          <w:sz w:val="21"/>
+          <w:szCs w:val="21"/>
+        </w:rPr>
+        <w:t xml:space="preserve">, and then in the directory of the including file. Includes may be nested to 8 levels. The statements %PAGE, %SKIP, %NOPRINT and %NOTE are accepted and ignored.</w:t>
+      </w:r>
+    </w:p>
+    <w:tbl>
+      <w:tblPr>
+        <w:tblW w:type="dxa" w:w="9638"/>
+        <w:tblBorders>
+          <w:top w:val="single" w:color="000000" w:sz="4"/>
+          <w:left w:val="single" w:color="000000" w:sz="4"/>
+          <w:bottom w:val="single" w:color="000000" w:sz="4"/>
+          <w:right w:val="single" w:color="000000" w:sz="4"/>
+          <w:insideH w:val="single" w:color="000000" w:sz="4"/>
+          <w:insideV w:val="single" w:color="000000" w:sz="4"/>
+        </w:tblBorders>
+        <w:tblLayout w:type="fixed"/>
+      </w:tblPr>
+      <w:tblGrid>
+        <w:gridCol w:w="9638"/>
+      </w:tblGrid>
+      <w:tr>
+        <w:trPr>
+          <w:cantSplit/>
+        </w:trPr>
+        <w:tc>
+          <w:tcPr>
+            <w:tcW w:type="dxa" w:w="9638"/>
+            <w:shd w:fill="F2F2F2" w:color="auto" w:val="clear"/>
+            <w:tcMar>
+              <w:top w:type="dxa" w:w="100"/>
+              <w:left w:type="dxa" w:w="140"/>
+              <w:bottom w:type="dxa" w:w="100"/>
+              <w:right w:type="dxa" w:w="140"/>
+            </w:tcMar>
+          </w:tcPr>
+          <w:p>
+            <w:pPr>
+              <w:keepNext/>
+              <w:spacing w:after="0" w:line="228"/>
+            </w:pPr>
+            <w:r>
+              <w:rPr>
+                <w:rFonts w:ascii="Courier New" w:cs="Courier New" w:eastAsia="Courier New" w:hAnsi="Courier New"/>
+                <w:sz w:val="17"/>
+                <w:szCs w:val="17"/>
+              </w:rPr>
+              <w:t xml:space="preserve">DEMO: PROCEDURE OPTIONS(MAIN);</w:t>
+            </w:r>
+          </w:p>
+          <w:p>
+            <w:pPr>
+              <w:keepNext/>
+              <w:spacing w:after="0" w:line="228"/>
+            </w:pPr>
+            <w:r>
+              <w:rPr>
+                <w:rFonts w:ascii="Courier New" w:cs="Courier New" w:eastAsia="Courier New" w:hAnsi="Courier New"/>
+                <w:sz w:val="17"/>
+                <w:szCs w:val="17"/>
+              </w:rPr>
+              <w:t xml:space="preserve">%REPLACE N BY 5;</w:t>
+            </w:r>
+          </w:p>
+          <w:p>
+            <w:pPr>
+              <w:keepNext/>
+              <w:spacing w:after="0" w:line="228"/>
+            </w:pPr>
+            <w:r>
+              <w:rPr>
+                <w:rFonts w:ascii="Courier New" w:cs="Courier New" w:eastAsia="Courier New" w:hAnsi="Courier New"/>
+                <w:sz w:val="17"/>
+                <w:szCs w:val="17"/>
+              </w:rPr>
+              <w:t xml:space="preserve">%REPLACE GREETING BY 'hi';</w:t>
+            </w:r>
+          </w:p>
+          <w:p>
+            <w:pPr>
+              <w:keepNext/>
+              <w:spacing w:after="0" w:line="228"/>
+            </w:pPr>
+            <w:r>
+              <w:rPr>
+                <w:rFonts w:ascii="Courier New" w:cs="Courier New" w:eastAsia="Courier New" w:hAnsi="Courier New"/>
+                <w:sz w:val="17"/>
+                <w:szCs w:val="17"/>
+              </w:rPr>
+              <w:t xml:space="preserve">  DECLARE A(N) FIXED BINARY(31);</w:t>
+            </w:r>
+          </w:p>
+          <w:p>
+            <w:pPr>
+              <w:keepNext/>
+              <w:spacing w:after="0" w:line="228"/>
+            </w:pPr>
+            <w:r>
+              <w:rPr>
+                <w:rFonts w:ascii="Courier New" w:cs="Courier New" w:eastAsia="Courier New" w:hAnsi="Courier New"/>
+                <w:sz w:val="17"/>
+                <w:szCs w:val="17"/>
+              </w:rPr>
+              <w:t xml:space="preserve">  DECLARE I FIXED BINARY(31);</w:t>
+            </w:r>
+          </w:p>
+          <w:p>
+            <w:pPr>
+              <w:keepNext/>
+              <w:spacing w:after="0" w:line="228"/>
+            </w:pPr>
+            <w:r>
+              <w:rPr>
+                <w:rFonts w:ascii="Courier New" w:cs="Courier New" w:eastAsia="Courier New" w:hAnsi="Courier New"/>
+                <w:sz w:val="17"/>
+                <w:szCs w:val="17"/>
+              </w:rPr>
+              <w:t xml:space="preserve">  DO I = 1 TO N;</w:t>
+            </w:r>
+          </w:p>
+          <w:p>
+            <w:pPr>
+              <w:keepNext/>
+              <w:spacing w:after="0" w:line="228"/>
+            </w:pPr>
+            <w:r>
+              <w:rPr>
+                <w:rFonts w:ascii="Courier New" w:cs="Courier New" w:eastAsia="Courier New" w:hAnsi="Courier New"/>
+                <w:sz w:val="17"/>
+                <w:szCs w:val="17"/>
+              </w:rPr>
+              <w:t xml:space="preserve">    A(I) = I * N;</w:t>
+            </w:r>
+          </w:p>
+          <w:p>
+            <w:pPr>
+              <w:keepNext/>
+              <w:spacing w:after="0" w:line="228"/>
+            </w:pPr>
+            <w:r>
+              <w:rPr>
+                <w:rFonts w:ascii="Courier New" w:cs="Courier New" w:eastAsia="Courier New" w:hAnsi="Courier New"/>
+                <w:sz w:val="17"/>
+                <w:szCs w:val="17"/>
+              </w:rPr>
+              <w:t xml:space="preserve">  END;</w:t>
+            </w:r>
+          </w:p>
+          <w:p>
+            <w:pPr>
+              <w:keepNext/>
+              <w:spacing w:after="0" w:line="228"/>
+            </w:pPr>
+            <w:r>
+              <w:rPr>
+                <w:rFonts w:ascii="Courier New" w:cs="Courier New" w:eastAsia="Courier New" w:hAnsi="Courier New"/>
+                <w:sz w:val="17"/>
+                <w:szCs w:val="17"/>
+              </w:rPr>
+              <w:t xml:space="preserve">  PUT SKIP LIST(GREETING, A);</w:t>
+            </w:r>
+          </w:p>
+          <w:p>
+            <w:pPr>
+              <w:keepNext/>
+              <w:spacing w:after="0" w:line="228"/>
+            </w:pPr>
+            <w:r>
+              <w:rPr>
+                <w:rFonts w:ascii="Courier New" w:cs="Courier New" w:eastAsia="Courier New" w:hAnsi="Courier New"/>
+                <w:sz w:val="17"/>
+                <w:szCs w:val="17"/>
+              </w:rPr>
+              <w:t xml:space="preserve">END DEMO;</w:t>
+            </w:r>
+          </w:p>
+          <w:p>
+            <w:pPr>
+              <w:keepNext/>
+              <w:spacing w:after="0" w:line="228"/>
+            </w:pPr>
+            <w:r>
+              <w:rPr>
+                <w:rFonts w:ascii="Courier New" w:cs="Courier New" w:eastAsia="Courier New" w:hAnsi="Courier New"/>
+                <w:sz w:val="17"/>
+                <w:szCs w:val="17"/>
+              </w:rPr>
+              <w:t xml:space="preserve"> </w:t>
+            </w:r>
+          </w:p>
+          <w:p>
+            <w:pPr>
+              <w:keepNext/>
+              <w:spacing w:after="0" w:line="228"/>
+            </w:pPr>
+            <w:r>
+              <w:rPr>
+                <w:rFonts w:ascii="Courier New" w:cs="Courier New" w:eastAsia="Courier New" w:hAnsi="Courier New"/>
+                <w:sz w:val="17"/>
+                <w:szCs w:val="17"/>
+              </w:rPr>
+              <w:t xml:space="preserve">/* prints */</w:t>
+            </w:r>
+          </w:p>
+          <w:p>
+            <w:pPr>
+              <w:keepNext/>
+              <w:spacing w:after="0" w:line="228"/>
+            </w:pPr>
+            <w:r>
+              <w:rPr>
+                <w:rFonts w:ascii="Courier New" w:cs="Courier New" w:eastAsia="Courier New" w:hAnsi="Courier New"/>
+                <w:sz w:val="17"/>
+                <w:szCs w:val="17"/>
+              </w:rPr>
+              <w:t xml:space="preserve">hi                      5                       10                      15                      20</w:t>
+            </w:r>
+          </w:p>
+          <w:p>
+            <w:pPr>
+              <w:keepNext/>
+              <w:spacing w:after="0" w:line="228"/>
+            </w:pPr>
+            <w:r>
+              <w:rPr>
+                <w:rFonts w:ascii="Courier New" w:cs="Courier New" w:eastAsia="Courier New" w:hAnsi="Courier New"/>
+                <w:sz w:val="17"/>
+                <w:szCs w:val="17"/>
+              </w:rPr>
+              <w:t xml:space="preserve">25</w:t>
+            </w:r>
+          </w:p>
+        </w:tc>
+      </w:tr>
+    </w:tbl>
+    <w:p>
+      <w:pPr>
+        <w:spacing w:after="200" w:before="80"/>
+      </w:pPr>
+      <w:r>
+        <w:rPr>
+          <w:rFonts w:ascii="Arial" w:cs="Arial" w:eastAsia="Arial" w:hAnsi="Arial"/>
+          <w:b/>
+          <w:bCs/>
+          <w:sz w:val="18"/>
+          <w:szCs w:val="18"/>
+        </w:rPr>
+        <w:t xml:space="preserve">Figure 22. </w:t>
       </w:r>
       <w:r>
         <w:rPr>
@@ -15973,7 +16701,7 @@
           <w:sz w:val="18"/>
           <w:szCs w:val="18"/>
         </w:rPr>
-        <w:t xml:space="preserve">Figure 22. </w:t>
+        <w:t xml:space="preserve">Figure 23. </w:t>
       </w:r>
       <w:r>
         <w:rPr>
@@ -16390,7 +17118,7 @@
           <w:sz w:val="18"/>
           <w:szCs w:val="18"/>
         </w:rPr>
-        <w:t xml:space="preserve">Figure 23. </w:t>
+        <w:t xml:space="preserve">Figure 24. </w:t>
       </w:r>
       <w:r>
         <w:rPr>
@@ -16793,7 +17521,7 @@
           <w:sz w:val="18"/>
           <w:szCs w:val="18"/>
         </w:rPr>
-        <w:t xml:space="preserve">Figure 24. </w:t>
+        <w:t xml:space="preserve">Figure 25. </w:t>
       </w:r>
       <w:r>
         <w:rPr>
@@ -17068,7 +17796,7 @@
           <w:sz w:val="18"/>
           <w:szCs w:val="18"/>
         </w:rPr>
-        <w:t xml:space="preserve">Figure 25. </w:t>
+        <w:t xml:space="preserve">Figure 26. </w:t>
       </w:r>
       <w:r>
         <w:rPr>
@@ -17479,7 +18207,7 @@
           <w:sz w:val="18"/>
           <w:szCs w:val="18"/>
         </w:rPr>
-        <w:t xml:space="preserve">Figure 26. </w:t>
+        <w:t xml:space="preserve">Figure 27. </w:t>
       </w:r>
       <w:r>
         <w:rPr>
@@ -18556,7 +19284,7 @@
           <w:sz w:val="18"/>
           <w:szCs w:val="18"/>
         </w:rPr>
-        <w:t xml:space="preserve">Figure 27. </w:t>
+        <w:t xml:space="preserve">Figure 28. </w:t>
       </w:r>
       <w:r>
         <w:rPr>
@@ -19208,7 +19936,7 @@
           <w:sz w:val="18"/>
           <w:szCs w:val="18"/>
         </w:rPr>
-        <w:t xml:space="preserve">Figure 28. </w:t>
+        <w:t xml:space="preserve">Figure 29. </w:t>
       </w:r>
       <w:r>
         <w:rPr>
@@ -19491,7 +20219,7 @@
           <w:sz w:val="18"/>
           <w:szCs w:val="18"/>
         </w:rPr>
-        <w:t xml:space="preserve">Figure 29. </w:t>
+        <w:t xml:space="preserve">Figure 30. </w:t>
       </w:r>
       <w:r>
         <w:rPr>
@@ -19828,7 +20556,7 @@
           <w:sz w:val="18"/>
           <w:szCs w:val="18"/>
         </w:rPr>
-        <w:t xml:space="preserve">Figure 30. </w:t>
+        <w:t xml:space="preserve">Figure 31. </w:t>
       </w:r>
       <w:r>
         <w:rPr>
@@ -20727,7 +21455,7 @@
           <w:sz w:val="18"/>
           <w:szCs w:val="18"/>
         </w:rPr>
-        <w:t xml:space="preserve">Figure 31. </w:t>
+        <w:t xml:space="preserve">Figure 32. </w:t>
       </w:r>
       <w:r>
         <w:rPr>
@@ -20994,7 +21722,7 @@
           <w:sz w:val="18"/>
           <w:szCs w:val="18"/>
         </w:rPr>
-        <w:t xml:space="preserve">Figure 32. </w:t>
+        <w:t xml:space="preserve">Figure 33. </w:t>
       </w:r>
       <w:r>
         <w:rPr>
@@ -21442,7 +22170,7 @@
           <w:sz w:val="18"/>
           <w:szCs w:val="18"/>
         </w:rPr>
-        <w:t xml:space="preserve">Figure 33. </w:t>
+        <w:t xml:space="preserve">Figure 34. </w:t>
       </w:r>
       <w:r>
         <w:rPr>
@@ -21986,7 +22714,7 @@
           <w:sz w:val="18"/>
           <w:szCs w:val="18"/>
         </w:rPr>
-        <w:t xml:space="preserve">Figure 34. </w:t>
+        <w:t xml:space="preserve">Figure 35. </w:t>
       </w:r>
       <w:r>
         <w:rPr>
@@ -22502,7 +23230,7 @@
           <w:sz w:val="18"/>
           <w:szCs w:val="18"/>
         </w:rPr>
-        <w:t xml:space="preserve">Figure 35. </w:t>
+        <w:t xml:space="preserve">Figure 36. </w:t>
       </w:r>
       <w:r>
         <w:rPr>
@@ -22975,7 +23703,7 @@
           <w:sz w:val="18"/>
           <w:szCs w:val="18"/>
         </w:rPr>
-        <w:t xml:space="preserve">Figure 36. </w:t>
+        <w:t xml:space="preserve">Figure 37. </w:t>
       </w:r>
       <w:r>
         <w:rPr>
@@ -23364,7 +24092,7 @@
           <w:sz w:val="18"/>
           <w:szCs w:val="18"/>
         </w:rPr>
-        <w:t xml:space="preserve">Figure 37. </w:t>
+        <w:t xml:space="preserve">Figure 38. </w:t>
       </w:r>
       <w:r>
         <w:rPr>
@@ -23939,7 +24667,7 @@
           <w:sz w:val="18"/>
           <w:szCs w:val="18"/>
         </w:rPr>
-        <w:t xml:space="preserve">Figure 38. </w:t>
+        <w:t xml:space="preserve">Figure 39. </w:t>
       </w:r>
       <w:r>
         <w:rPr>
@@ -24384,7 +25112,7 @@
           <w:sz w:val="18"/>
           <w:szCs w:val="18"/>
         </w:rPr>
-        <w:t xml:space="preserve">Figure 39. </w:t>
+        <w:t xml:space="preserve">Figure 40. </w:t>
       </w:r>
       <w:r>
         <w:rPr>
@@ -25067,7 +25795,7 @@
           <w:sz w:val="18"/>
           <w:szCs w:val="18"/>
         </w:rPr>
-        <w:t xml:space="preserve">Figure 40. </w:t>
+        <w:t xml:space="preserve">Figure 41. </w:t>
       </w:r>
       <w:r>
         <w:rPr>
@@ -26179,7 +26907,7 @@
           <w:sz w:val="18"/>
           <w:szCs w:val="18"/>
         </w:rPr>
-        <w:t xml:space="preserve">Figure 41. </w:t>
+        <w:t xml:space="preserve">Figure 42. </w:t>
       </w:r>
       <w:r>
         <w:rPr>
@@ -27035,7 +27763,7 @@
           <w:sz w:val="18"/>
           <w:szCs w:val="18"/>
         </w:rPr>
-        <w:t xml:space="preserve">Figure 42. </w:t>
+        <w:t xml:space="preserve">Figure 43. </w:t>
       </w:r>
       <w:r>
         <w:rPr>
@@ -28037,7 +28765,7 @@
           <w:sz w:val="18"/>
           <w:szCs w:val="18"/>
         </w:rPr>
-        <w:t xml:space="preserve">Figure 43. </w:t>
+        <w:t xml:space="preserve">Figure 44. </w:t>
       </w:r>
       <w:r>
         <w:rPr>
@@ -29072,7 +29800,7 @@
           <w:sz w:val="18"/>
           <w:szCs w:val="18"/>
         </w:rPr>
-        <w:t xml:space="preserve">Figure 44. </w:t>
+        <w:t xml:space="preserve">Figure 45. </w:t>
       </w:r>
       <w:r>
         <w:rPr>
@@ -29842,7 +30570,7 @@
           <w:sz w:val="18"/>
           <w:szCs w:val="18"/>
         </w:rPr>
-        <w:t xml:space="preserve">Figure 45. </w:t>
+        <w:t xml:space="preserve">Figure 46. </w:t>
       </w:r>
       <w:r>
         <w:rPr>
@@ -30114,6 +30842,26 @@
           <w:szCs w:val="21"/>
         </w:rPr>
         <w:t xml:space="preserve">GET DATA, REWRITE, keyed access and the options KEY, KEYFROM and KEYTO are not available. READ INTO an array is not supported.</w:t>
+      </w:r>
+    </w:p>
+    <w:p>
+      <w:pPr>
+        <w:pStyle w:val="ListParagraph"/>
+        <w:numPr>
+          <w:ilvl w:val="0"/>
+          <w:numId w:val="2"/>
+        </w:numPr>
+        <w:spacing w:after="60"/>
+      </w:pPr>
+      <w:r>
+        <w:rPr>
+          <w:rFonts w:ascii="Times New Roman" w:cs="Times New Roman" w:eastAsia="Times New Roman" w:hAnsi="Times New Roman"/>
+          <w:b w:val="false"/>
+          <w:bCs w:val="false"/>
+          <w:sz w:val="21"/>
+          <w:szCs w:val="21"/>
+        </w:rPr>
+        <w:t xml:space="preserve">Source files are translated together; there is no separate compilation and no linking of object modules.</w:t>
       </w:r>
     </w:p>
     <w:p>

</xml_diff>

<commit_message>
I/O: keyed and update record files, REWRITE, DELETE, FILE parameters, GET DATA, READ INTO arrays
Co-Authored-By: Claude Sonnet 5.5 <noreply@anthropic.com>
Claude-Session: https://claude.ai/code/session_01JnKSjwwiAQX8ZZcaJLvQEV
</commit_message>
<xml_diff>
--- a/docs/PLI-User-Guide.docx
+++ b/docs/PLI-User-Guide.docx
@@ -1473,7 +1473,7 @@
           <w:sz w:val="20"/>
           <w:szCs w:val="20"/>
         </w:rPr>
-        <w:t xml:space="preserve">Operator messages</w:t>
+        <w:t xml:space="preserve">Keyed and updatable record files</w:t>
       </w:r>
       <w:r>
         <w:rPr>
@@ -1484,6 +1484,35 @@
           <w:szCs w:val="20"/>
         </w:rPr>
         <w:t xml:space="preserve">	23</w:t>
+      </w:r>
+    </w:p>
+    <w:p>
+      <w:pPr>
+        <w:tabs>
+          <w:tab w:val="right" w:pos="9638" w:leader="dot"/>
+        </w:tabs>
+        <w:spacing w:after="20" w:before="20"/>
+        <w:ind w:left="400"/>
+      </w:pPr>
+      <w:r>
+        <w:rPr>
+          <w:rFonts w:ascii="Times New Roman" w:cs="Times New Roman" w:eastAsia="Times New Roman" w:hAnsi="Times New Roman"/>
+          <w:b w:val="false"/>
+          <w:bCs w:val="false"/>
+          <w:sz w:val="20"/>
+          <w:szCs w:val="20"/>
+        </w:rPr>
+        <w:t xml:space="preserve">Operator messages</w:t>
+      </w:r>
+      <w:r>
+        <w:rPr>
+          <w:rFonts w:ascii="Times New Roman" w:cs="Times New Roman" w:eastAsia="Times New Roman" w:hAnsi="Times New Roman"/>
+          <w:b w:val="false"/>
+          <w:bCs w:val="false"/>
+          <w:sz w:val="20"/>
+          <w:szCs w:val="20"/>
+        </w:rPr>
+        <w:t xml:space="preserve">	24</w:t>
       </w:r>
     </w:p>
     <w:p>
@@ -1512,7 +1541,7 @@
           <w:sz w:val="21"/>
           <w:szCs w:val="21"/>
         </w:rPr>
-        <w:t xml:space="preserve">	24</w:t>
+        <w:t xml:space="preserve">	25</w:t>
       </w:r>
     </w:p>
     <w:p>
@@ -1541,7 +1570,7 @@
           <w:sz w:val="20"/>
           <w:szCs w:val="20"/>
         </w:rPr>
-        <w:t xml:space="preserve">	24</w:t>
+        <w:t xml:space="preserve">	25</w:t>
       </w:r>
     </w:p>
     <w:p>
@@ -1570,7 +1599,7 @@
           <w:sz w:val="20"/>
           <w:szCs w:val="20"/>
         </w:rPr>
-        <w:t xml:space="preserve">	24</w:t>
+        <w:t xml:space="preserve">	25</w:t>
       </w:r>
     </w:p>
     <w:p>
@@ -1599,7 +1628,7 @@
           <w:sz w:val="20"/>
           <w:szCs w:val="20"/>
         </w:rPr>
-        <w:t xml:space="preserve">	25</w:t>
+        <w:t xml:space="preserve">	26</w:t>
       </w:r>
     </w:p>
     <w:p>
@@ -1628,7 +1657,7 @@
           <w:sz w:val="20"/>
           <w:szCs w:val="20"/>
         </w:rPr>
-        <w:t xml:space="preserve">	25</w:t>
+        <w:t xml:space="preserve">	26</w:t>
       </w:r>
     </w:p>
     <w:p>
@@ -1657,7 +1686,7 @@
           <w:sz w:val="20"/>
           <w:szCs w:val="20"/>
         </w:rPr>
-        <w:t xml:space="preserve">	26</w:t>
+        <w:t xml:space="preserve">	27</w:t>
       </w:r>
     </w:p>
     <w:p>
@@ -1686,7 +1715,7 @@
           <w:sz w:val="20"/>
           <w:szCs w:val="20"/>
         </w:rPr>
-        <w:t xml:space="preserve">	26</w:t>
+        <w:t xml:space="preserve">	27</w:t>
       </w:r>
     </w:p>
     <w:p>
@@ -1715,7 +1744,7 @@
           <w:sz w:val="21"/>
           <w:szCs w:val="21"/>
         </w:rPr>
-        <w:t xml:space="preserve">	27</w:t>
+        <w:t xml:space="preserve">	28</w:t>
       </w:r>
     </w:p>
     <w:p>
@@ -1744,7 +1773,7 @@
           <w:sz w:val="20"/>
           <w:szCs w:val="20"/>
         </w:rPr>
-        <w:t xml:space="preserve">	27</w:t>
+        <w:t xml:space="preserve">	28</w:t>
       </w:r>
     </w:p>
     <w:p>
@@ -1773,7 +1802,7 @@
           <w:sz w:val="20"/>
           <w:szCs w:val="20"/>
         </w:rPr>
-        <w:t xml:space="preserve">	27</w:t>
+        <w:t xml:space="preserve">	28</w:t>
       </w:r>
     </w:p>
     <w:p>
@@ -1802,7 +1831,7 @@
           <w:sz w:val="20"/>
           <w:szCs w:val="20"/>
         </w:rPr>
-        <w:t xml:space="preserve">	28</w:t>
+        <w:t xml:space="preserve">	29</w:t>
       </w:r>
     </w:p>
     <w:p>
@@ -1831,7 +1860,7 @@
           <w:sz w:val="20"/>
           <w:szCs w:val="20"/>
         </w:rPr>
-        <w:t xml:space="preserve">	29</w:t>
+        <w:t xml:space="preserve">	30</w:t>
       </w:r>
     </w:p>
     <w:p>
@@ -1860,7 +1889,7 @@
           <w:sz w:val="20"/>
           <w:szCs w:val="20"/>
         </w:rPr>
-        <w:t xml:space="preserve">	29</w:t>
+        <w:t xml:space="preserve">	30</w:t>
       </w:r>
     </w:p>
     <w:p>
@@ -1889,7 +1918,7 @@
           <w:sz w:val="21"/>
           <w:szCs w:val="21"/>
         </w:rPr>
-        <w:t xml:space="preserve">	31</w:t>
+        <w:t xml:space="preserve">	32</w:t>
       </w:r>
     </w:p>
     <w:p>
@@ -1918,7 +1947,7 @@
           <w:sz w:val="20"/>
           <w:szCs w:val="20"/>
         </w:rPr>
-        <w:t xml:space="preserve">	31</w:t>
+        <w:t xml:space="preserve">	32</w:t>
       </w:r>
     </w:p>
     <w:p>
@@ -1947,7 +1976,7 @@
           <w:sz w:val="20"/>
           <w:szCs w:val="20"/>
         </w:rPr>
-        <w:t xml:space="preserve">	31</w:t>
+        <w:t xml:space="preserve">	32</w:t>
       </w:r>
     </w:p>
     <w:p>
@@ -1976,7 +2005,7 @@
           <w:sz w:val="20"/>
           <w:szCs w:val="20"/>
         </w:rPr>
-        <w:t xml:space="preserve">	32</w:t>
+        <w:t xml:space="preserve">	33</w:t>
       </w:r>
     </w:p>
     <w:p>
@@ -2005,7 +2034,7 @@
           <w:sz w:val="21"/>
           <w:szCs w:val="21"/>
         </w:rPr>
-        <w:t xml:space="preserve">	33</w:t>
+        <w:t xml:space="preserve">	34</w:t>
       </w:r>
     </w:p>
     <w:p>
@@ -2034,7 +2063,7 @@
           <w:sz w:val="20"/>
           <w:szCs w:val="20"/>
         </w:rPr>
-        <w:t xml:space="preserve">	33</w:t>
+        <w:t xml:space="preserve">	34</w:t>
       </w:r>
     </w:p>
     <w:p>
@@ -2063,7 +2092,7 @@
           <w:sz w:val="20"/>
           <w:szCs w:val="20"/>
         </w:rPr>
-        <w:t xml:space="preserve">	33</w:t>
+        <w:t xml:space="preserve">	34</w:t>
       </w:r>
     </w:p>
     <w:p>
@@ -2092,7 +2121,7 @@
           <w:sz w:val="20"/>
           <w:szCs w:val="20"/>
         </w:rPr>
-        <w:t xml:space="preserve">	33</w:t>
+        <w:t xml:space="preserve">	34</w:t>
       </w:r>
     </w:p>
     <w:p>
@@ -2121,7 +2150,7 @@
           <w:sz w:val="21"/>
           <w:szCs w:val="21"/>
         </w:rPr>
-        <w:t xml:space="preserve">	35</w:t>
+        <w:t xml:space="preserve">	36</w:t>
       </w:r>
     </w:p>
     <w:p>
@@ -2150,7 +2179,7 @@
           <w:sz w:val="20"/>
           <w:szCs w:val="20"/>
         </w:rPr>
-        <w:t xml:space="preserve">	35</w:t>
+        <w:t xml:space="preserve">	36</w:t>
       </w:r>
     </w:p>
     <w:p>
@@ -2179,7 +2208,7 @@
           <w:sz w:val="20"/>
           <w:szCs w:val="20"/>
         </w:rPr>
-        <w:t xml:space="preserve">	35</w:t>
+        <w:t xml:space="preserve">	36</w:t>
       </w:r>
     </w:p>
     <w:p>
@@ -12581,7 +12610,25 @@
           <w:sz w:val="21"/>
           <w:szCs w:val="21"/>
         </w:rPr>
-        <w:t xml:space="preserve"> takes its length from the argument. A structure can be passed to a parameter declared with the same layout. An array of structures cannot be passed, and neither can a FILE.</w:t>
+        <w:t xml:space="preserve"> takes its length from the argument. A structure can be passed to a parameter declared with the same layout. An array of structures cannot be passed. A FILE can be passed: declare the parameter </w:t>
+      </w:r>
+      <w:r>
+        <w:rPr>
+          <w:rFonts w:ascii="Courier New" w:cs="Courier New" w:eastAsia="Courier New" w:hAnsi="Courier New"/>
+          <w:sz w:val="19"/>
+          <w:szCs w:val="19"/>
+        </w:rPr>
+        <w:t xml:space="preserve">DECLARE F FILE;</w:t>
+      </w:r>
+      <w:r>
+        <w:rPr>
+          <w:rFonts w:ascii="Times New Roman" w:cs="Times New Roman" w:eastAsia="Times New Roman" w:hAnsi="Times New Roman"/>
+          <w:b w:val="false"/>
+          <w:bCs w:val="false"/>
+          <w:sz w:val="21"/>
+          <w:szCs w:val="21"/>
+        </w:rPr>
+        <w:t xml:space="preserve"> and the argument is the file name.</w:t>
       </w:r>
     </w:p>
     <w:tbl>
@@ -21346,7 +21393,43 @@
           <w:sz w:val="21"/>
           <w:szCs w:val="21"/>
         </w:rPr>
-        <w:t xml:space="preserve"> without a list is not supported. GET DATA is not supported.</w:t>
+        <w:t xml:space="preserve"> without a list is not supported. </w:t>
+      </w:r>
+      <w:r>
+        <w:rPr>
+          <w:rFonts w:ascii="Courier New" w:cs="Courier New" w:eastAsia="Courier New" w:hAnsi="Courier New"/>
+          <w:sz w:val="19"/>
+          <w:szCs w:val="19"/>
+        </w:rPr>
+        <w:t xml:space="preserve">GET DATA(a, b, c);</w:t>
+      </w:r>
+      <w:r>
+        <w:rPr>
+          <w:rFonts w:ascii="Times New Roman" w:cs="Times New Roman" w:eastAsia="Times New Roman" w:hAnsi="Times New Roman"/>
+          <w:b w:val="false"/>
+          <w:bCs w:val="false"/>
+          <w:sz w:val="21"/>
+          <w:szCs w:val="21"/>
+        </w:rPr>
+        <w:t xml:space="preserve"> reads such assignments from the input: </w:t>
+      </w:r>
+      <w:r>
+        <w:rPr>
+          <w:rFonts w:ascii="Courier New" w:cs="Courier New" w:eastAsia="Courier New" w:hAnsi="Courier New"/>
+          <w:sz w:val="19"/>
+          <w:szCs w:val="19"/>
+        </w:rPr>
+        <w:t xml:space="preserve">A=3, B='text'; </w:t>
+      </w:r>
+      <w:r>
+        <w:rPr>
+          <w:rFonts w:ascii="Times New Roman" w:cs="Times New Roman" w:eastAsia="Times New Roman" w:hAnsi="Times New Roman"/>
+          <w:b w:val="false"/>
+          <w:bCs w:val="false"/>
+          <w:sz w:val="21"/>
+          <w:szCs w:val="21"/>
+        </w:rPr>
+        <w:t xml:space="preserve"> The names may come in any order and over several lines, and the statement reads up to the semicolon. Only scalar variables are allowed, and GET DATA without a list is not supported.</w:t>
       </w:r>
     </w:p>
     <w:p>
@@ -22016,7 +22099,7 @@
           <w:sz w:val="21"/>
           <w:szCs w:val="21"/>
         </w:rPr>
-        <w:t xml:space="preserve"> reads the next record into x. A CHARACTER variable is written as a line of text, without trailing blanks, and read as one line, padded with blanks; any other variable is transferred as raw bytes. Reading an array with READ is not supported, nor are the options KEY, KEYFROM, KEYTO or SET, nor REWRITE.</w:t>
+        <w:t xml:space="preserve"> reads the next record into x. A CHARACTER variable is written as a line of text, without trailing blanks, and read as one line, padded with blanks; any other variable is transferred as raw bytes. An array or structure is transferred whole, as raw bytes, and READ INTO an array reads the bytes of the whole array. The options KEY, KEYFROM and KEYTO are described below; SET is not supported.</w:t>
       </w:r>
     </w:p>
     <w:tbl>
@@ -22368,6 +22451,893 @@
           <w:szCs w:val="18"/>
         </w:rPr>
         <w:t xml:space="preserve">Record files</w:t>
+      </w:r>
+    </w:p>
+    <w:p>
+      <w:pPr>
+        <w:pStyle w:val="Heading2"/>
+      </w:pPr>
+      <w:r>
+        <w:t xml:space="preserve">Keyed and updatable record files</w:t>
+      </w:r>
+    </w:p>
+    <w:p>
+      <w:pPr>
+        <w:keepNext w:val="false"/>
+        <w:spacing w:after="120" w:before="0"/>
+      </w:pPr>
+      <w:r>
+        <w:rPr>
+          <w:rFonts w:ascii="Times New Roman" w:cs="Times New Roman" w:eastAsia="Times New Roman" w:hAnsi="Times New Roman"/>
+          <w:b w:val="false"/>
+          <w:bCs w:val="false"/>
+          <w:sz w:val="21"/>
+          <w:szCs w:val="21"/>
+        </w:rPr>
+        <w:t xml:space="preserve">A file declared or opened with KEYED (or DIRECT) holds records that are found by a key. Declare it </w:t>
+      </w:r>
+      <w:r>
+        <w:rPr>
+          <w:rFonts w:ascii="Courier New" w:cs="Courier New" w:eastAsia="Courier New" w:hAnsi="Courier New"/>
+          <w:sz w:val="19"/>
+          <w:szCs w:val="19"/>
+        </w:rPr>
+        <w:t xml:space="preserve">DECLARE F FILE RECORD KEYED UPDATE;</w:t>
+      </w:r>
+      <w:r>
+        <w:rPr>
+          <w:rFonts w:ascii="Times New Roman" w:cs="Times New Roman" w:eastAsia="Times New Roman" w:hAnsi="Times New Roman"/>
+          <w:b w:val="false"/>
+          <w:bCs w:val="false"/>
+          <w:sz w:val="21"/>
+          <w:szCs w:val="21"/>
+        </w:rPr>
+        <w:t xml:space="preserve"> or give KEYED in OPEN. </w:t>
+      </w:r>
+      <w:r>
+        <w:rPr>
+          <w:rFonts w:ascii="Courier New" w:cs="Courier New" w:eastAsia="Courier New" w:hAnsi="Courier New"/>
+          <w:sz w:val="19"/>
+          <w:szCs w:val="19"/>
+        </w:rPr>
+        <w:t xml:space="preserve">WRITE FILE(F) FROM(x) KEYFROM(k);</w:t>
+      </w:r>
+      <w:r>
+        <w:rPr>
+          <w:rFonts w:ascii="Times New Roman" w:cs="Times New Roman" w:eastAsia="Times New Roman" w:hAnsi="Times New Roman"/>
+          <w:b w:val="false"/>
+          <w:bCs w:val="false"/>
+          <w:sz w:val="21"/>
+          <w:szCs w:val="21"/>
+        </w:rPr>
+        <w:t xml:space="preserve"> adds a record, and the records are kept in key order. </w:t>
+      </w:r>
+      <w:r>
+        <w:rPr>
+          <w:rFonts w:ascii="Courier New" w:cs="Courier New" w:eastAsia="Courier New" w:hAnsi="Courier New"/>
+          <w:sz w:val="19"/>
+          <w:szCs w:val="19"/>
+        </w:rPr>
+        <w:t xml:space="preserve">READ FILE(F) INTO(x) KEY(k);</w:t>
+      </w:r>
+      <w:r>
+        <w:rPr>
+          <w:rFonts w:ascii="Times New Roman" w:cs="Times New Roman" w:eastAsia="Times New Roman" w:hAnsi="Times New Roman"/>
+          <w:b w:val="false"/>
+          <w:bCs w:val="false"/>
+          <w:sz w:val="21"/>
+          <w:szCs w:val="21"/>
+        </w:rPr>
+        <w:t xml:space="preserve"> reads the record with that key. A READ without KEY reads the next record in key order, and </w:t>
+      </w:r>
+      <w:r>
+        <w:rPr>
+          <w:rFonts w:ascii="Courier New" w:cs="Courier New" w:eastAsia="Courier New" w:hAnsi="Courier New"/>
+          <w:sz w:val="19"/>
+          <w:szCs w:val="19"/>
+        </w:rPr>
+        <w:t xml:space="preserve">KEYTO(v)</w:t>
+      </w:r>
+      <w:r>
+        <w:rPr>
+          <w:rFonts w:ascii="Times New Roman" w:cs="Times New Roman" w:eastAsia="Times New Roman" w:hAnsi="Times New Roman"/>
+          <w:b w:val="false"/>
+          <w:bCs w:val="false"/>
+          <w:sz w:val="21"/>
+          <w:szCs w:val="21"/>
+        </w:rPr>
+        <w:t xml:space="preserve"> stores its key in the string variable v. </w:t>
+      </w:r>
+      <w:r>
+        <w:rPr>
+          <w:rFonts w:ascii="Courier New" w:cs="Courier New" w:eastAsia="Courier New" w:hAnsi="Courier New"/>
+          <w:sz w:val="19"/>
+          <w:szCs w:val="19"/>
+        </w:rPr>
+        <w:t xml:space="preserve">REWRITE FILE(F) FROM(x);</w:t>
+      </w:r>
+      <w:r>
+        <w:rPr>
+          <w:rFonts w:ascii="Times New Roman" w:cs="Times New Roman" w:eastAsia="Times New Roman" w:hAnsi="Times New Roman"/>
+          <w:b w:val="false"/>
+          <w:bCs w:val="false"/>
+          <w:sz w:val="21"/>
+          <w:szCs w:val="21"/>
+        </w:rPr>
+        <w:t xml:space="preserve"> replaces the record that was read last; with </w:t>
+      </w:r>
+      <w:r>
+        <w:rPr>
+          <w:rFonts w:ascii="Courier New" w:cs="Courier New" w:eastAsia="Courier New" w:hAnsi="Courier New"/>
+          <w:sz w:val="19"/>
+          <w:szCs w:val="19"/>
+        </w:rPr>
+        <w:t xml:space="preserve">KEY(k)</w:t>
+      </w:r>
+      <w:r>
+        <w:rPr>
+          <w:rFonts w:ascii="Times New Roman" w:cs="Times New Roman" w:eastAsia="Times New Roman" w:hAnsi="Times New Roman"/>
+          <w:b w:val="false"/>
+          <w:bCs w:val="false"/>
+          <w:sz w:val="21"/>
+          <w:szCs w:val="21"/>
+        </w:rPr>
+        <w:t xml:space="preserve"> it replaces the record with key k. </w:t>
+      </w:r>
+      <w:r>
+        <w:rPr>
+          <w:rFonts w:ascii="Courier New" w:cs="Courier New" w:eastAsia="Courier New" w:hAnsi="Courier New"/>
+          <w:sz w:val="19"/>
+          <w:szCs w:val="19"/>
+        </w:rPr>
+        <w:t xml:space="preserve">DELETE FILE(F) KEY(k);</w:t>
+      </w:r>
+      <w:r>
+        <w:rPr>
+          <w:rFonts w:ascii="Times New Roman" w:cs="Times New Roman" w:eastAsia="Times New Roman" w:hAnsi="Times New Roman"/>
+          <w:b w:val="false"/>
+          <w:bCs w:val="false"/>
+          <w:sz w:val="21"/>
+          <w:szCs w:val="21"/>
+        </w:rPr>
+        <w:t xml:space="preserve"> removes a record, or the record read last if there is no KEY. Keys are compared as strings without their trailing blanks.</w:t>
+      </w:r>
+    </w:p>
+    <w:p>
+      <w:pPr>
+        <w:keepNext w:val="false"/>
+        <w:spacing w:after="120" w:before="0"/>
+      </w:pPr>
+      <w:r>
+        <w:rPr>
+          <w:rFonts w:ascii="Times New Roman" w:cs="Times New Roman" w:eastAsia="Times New Roman" w:hAnsi="Times New Roman"/>
+          <w:b w:val="false"/>
+          <w:bCs w:val="false"/>
+          <w:sz w:val="21"/>
+          <w:szCs w:val="21"/>
+        </w:rPr>
+        <w:t xml:space="preserve">The condition KEY is raised if a record is not found (ONCODE 51) or a key is written twice (ONCODE 52). Without an ON KEY unit the program ends with ERROR. A file opened for UPDATE without KEYED has no keys, but READ, REWRITE and WRITE work in the same way: REWRITE replaces the record just read. This also works for ordinary text files, where a record is a line.</w:t>
+      </w:r>
+    </w:p>
+    <w:p>
+      <w:pPr>
+        <w:keepNext w:val="false"/>
+        <w:spacing w:after="120" w:before="0"/>
+      </w:pPr>
+      <w:r>
+        <w:rPr>
+          <w:rFonts w:ascii="Times New Roman" w:cs="Times New Roman" w:eastAsia="Times New Roman" w:hAnsi="Times New Roman"/>
+          <w:b w:val="false"/>
+          <w:bCs w:val="false"/>
+          <w:sz w:val="21"/>
+          <w:szCs w:val="21"/>
+        </w:rPr>
+        <w:t xml:space="preserve">A KEYED or UPDATE file is held in memory while it is open and written back when it is closed. The data set is in the format of the translator, a four-byte mark </w:t>
+      </w:r>
+      <w:r>
+        <w:rPr>
+          <w:rFonts w:ascii="Courier New" w:cs="Courier New" w:eastAsia="Courier New" w:hAnsi="Courier New"/>
+          <w:sz w:val="19"/>
+          <w:szCs w:val="19"/>
+        </w:rPr>
+        <w:t xml:space="preserve">PLR1</w:t>
+      </w:r>
+      <w:r>
+        <w:rPr>
+          <w:rFonts w:ascii="Times New Roman" w:cs="Times New Roman" w:eastAsia="Times New Roman" w:hAnsi="Times New Roman"/>
+          <w:b w:val="false"/>
+          <w:bCs w:val="false"/>
+          <w:sz w:val="21"/>
+          <w:szCs w:val="21"/>
+        </w:rPr>
+        <w:t xml:space="preserve"> followed by the records, unless it was a text file; a text file that is opened for UPDATE is written back as text. Plain INPUT and OUTPUT files are not changed: a CHARACTER record is a line, any other record is raw bytes.</w:t>
+      </w:r>
+    </w:p>
+    <w:tbl>
+      <w:tblPr>
+        <w:tblW w:type="dxa" w:w="9638"/>
+        <w:tblBorders>
+          <w:top w:val="single" w:color="000000" w:sz="4"/>
+          <w:left w:val="single" w:color="000000" w:sz="4"/>
+          <w:bottom w:val="single" w:color="000000" w:sz="4"/>
+          <w:right w:val="single" w:color="000000" w:sz="4"/>
+          <w:insideH w:val="single" w:color="000000" w:sz="4"/>
+          <w:insideV w:val="single" w:color="000000" w:sz="4"/>
+        </w:tblBorders>
+        <w:tblLayout w:type="fixed"/>
+      </w:tblPr>
+      <w:tblGrid>
+        <w:gridCol w:w="9638"/>
+      </w:tblGrid>
+      <w:tr>
+        <w:trPr>
+          <w:cantSplit/>
+        </w:trPr>
+        <w:tc>
+          <w:tcPr>
+            <w:tcW w:type="dxa" w:w="9638"/>
+            <w:shd w:fill="F2F2F2" w:color="auto" w:val="clear"/>
+            <w:tcMar>
+              <w:top w:type="dxa" w:w="100"/>
+              <w:left w:type="dxa" w:w="140"/>
+              <w:bottom w:type="dxa" w:w="100"/>
+              <w:right w:type="dxa" w:w="140"/>
+            </w:tcMar>
+          </w:tcPr>
+          <w:p>
+            <w:pPr>
+              <w:keepNext/>
+              <w:spacing w:after="0" w:line="228"/>
+            </w:pPr>
+            <w:r>
+              <w:rPr>
+                <w:rFonts w:ascii="Courier New" w:cs="Courier New" w:eastAsia="Courier New" w:hAnsi="Courier New"/>
+                <w:sz w:val="17"/>
+                <w:szCs w:val="17"/>
+              </w:rPr>
+              <w:t xml:space="preserve">/* Keyed record file: add, read, rewrite, delete, list by key */</w:t>
+            </w:r>
+          </w:p>
+          <w:p>
+            <w:pPr>
+              <w:keepNext/>
+              <w:spacing w:after="0" w:line="228"/>
+            </w:pPr>
+            <w:r>
+              <w:rPr>
+                <w:rFonts w:ascii="Courier New" w:cs="Courier New" w:eastAsia="Courier New" w:hAnsi="Courier New"/>
+                <w:sz w:val="17"/>
+                <w:szCs w:val="17"/>
+              </w:rPr>
+              <w:t xml:space="preserve">KEYED: PROCEDURE OPTIONS(MAIN);</w:t>
+            </w:r>
+          </w:p>
+          <w:p>
+            <w:pPr>
+              <w:keepNext/>
+              <w:spacing w:after="0" w:line="228"/>
+            </w:pPr>
+            <w:r>
+              <w:rPr>
+                <w:rFonts w:ascii="Courier New" w:cs="Courier New" w:eastAsia="Courier New" w:hAnsi="Courier New"/>
+                <w:sz w:val="17"/>
+                <w:szCs w:val="17"/>
+              </w:rPr>
+              <w:t xml:space="preserve">  DECLARE EMP FILE RECORD KEYED UPDATE;</w:t>
+            </w:r>
+          </w:p>
+          <w:p>
+            <w:pPr>
+              <w:keepNext/>
+              <w:spacing w:after="0" w:line="228"/>
+            </w:pPr>
+            <w:r>
+              <w:rPr>
+                <w:rFonts w:ascii="Courier New" w:cs="Courier New" w:eastAsia="Courier New" w:hAnsi="Courier New"/>
+                <w:sz w:val="17"/>
+                <w:szCs w:val="17"/>
+              </w:rPr>
+              <w:t xml:space="preserve">  DECLARE REC CHARACTER(20);</w:t>
+            </w:r>
+          </w:p>
+          <w:p>
+            <w:pPr>
+              <w:keepNext/>
+              <w:spacing w:after="0" w:line="228"/>
+            </w:pPr>
+            <w:r>
+              <w:rPr>
+                <w:rFonts w:ascii="Courier New" w:cs="Courier New" w:eastAsia="Courier New" w:hAnsi="Courier New"/>
+                <w:sz w:val="17"/>
+                <w:szCs w:val="17"/>
+              </w:rPr>
+              <w:t xml:space="preserve"> </w:t>
+            </w:r>
+          </w:p>
+          <w:p>
+            <w:pPr>
+              <w:keepNext/>
+              <w:spacing w:after="0" w:line="228"/>
+            </w:pPr>
+            <w:r>
+              <w:rPr>
+                <w:rFonts w:ascii="Courier New" w:cs="Courier New" w:eastAsia="Courier New" w:hAnsi="Courier New"/>
+                <w:sz w:val="17"/>
+                <w:szCs w:val="17"/>
+              </w:rPr>
+              <w:t xml:space="preserve">  LISTALL: PROCEDURE(F);</w:t>
+            </w:r>
+          </w:p>
+          <w:p>
+            <w:pPr>
+              <w:keepNext/>
+              <w:spacing w:after="0" w:line="228"/>
+            </w:pPr>
+            <w:r>
+              <w:rPr>
+                <w:rFonts w:ascii="Courier New" w:cs="Courier New" w:eastAsia="Courier New" w:hAnsi="Courier New"/>
+                <w:sz w:val="17"/>
+                <w:szCs w:val="17"/>
+              </w:rPr>
+              <w:t xml:space="preserve">    DECLARE F FILE;</w:t>
+            </w:r>
+          </w:p>
+          <w:p>
+            <w:pPr>
+              <w:keepNext/>
+              <w:spacing w:after="0" w:line="228"/>
+            </w:pPr>
+            <w:r>
+              <w:rPr>
+                <w:rFonts w:ascii="Courier New" w:cs="Courier New" w:eastAsia="Courier New" w:hAnsi="Courier New"/>
+                <w:sz w:val="17"/>
+                <w:szCs w:val="17"/>
+              </w:rPr>
+              <w:t xml:space="preserve">    DECLARE R CHARACTER(20), KY CHARACTER(5);</w:t>
+            </w:r>
+          </w:p>
+          <w:p>
+            <w:pPr>
+              <w:keepNext/>
+              <w:spacing w:after="0" w:line="228"/>
+            </w:pPr>
+            <w:r>
+              <w:rPr>
+                <w:rFonts w:ascii="Courier New" w:cs="Courier New" w:eastAsia="Courier New" w:hAnsi="Courier New"/>
+                <w:sz w:val="17"/>
+                <w:szCs w:val="17"/>
+              </w:rPr>
+              <w:t xml:space="preserve">    ON ENDFILE(F) GOTO DONE;</w:t>
+            </w:r>
+          </w:p>
+          <w:p>
+            <w:pPr>
+              <w:keepNext/>
+              <w:spacing w:after="0" w:line="228"/>
+            </w:pPr>
+            <w:r>
+              <w:rPr>
+                <w:rFonts w:ascii="Courier New" w:cs="Courier New" w:eastAsia="Courier New" w:hAnsi="Courier New"/>
+                <w:sz w:val="17"/>
+                <w:szCs w:val="17"/>
+              </w:rPr>
+              <w:t xml:space="preserve">    DO WHILE ('1'B);</w:t>
+            </w:r>
+          </w:p>
+          <w:p>
+            <w:pPr>
+              <w:keepNext/>
+              <w:spacing w:after="0" w:line="228"/>
+            </w:pPr>
+            <w:r>
+              <w:rPr>
+                <w:rFonts w:ascii="Courier New" w:cs="Courier New" w:eastAsia="Courier New" w:hAnsi="Courier New"/>
+                <w:sz w:val="17"/>
+                <w:szCs w:val="17"/>
+              </w:rPr>
+              <w:t xml:space="preserve">      READ FILE(F) INTO(R) KEYTO(KY);</w:t>
+            </w:r>
+          </w:p>
+          <w:p>
+            <w:pPr>
+              <w:keepNext/>
+              <w:spacing w:after="0" w:line="228"/>
+            </w:pPr>
+            <w:r>
+              <w:rPr>
+                <w:rFonts w:ascii="Courier New" w:cs="Courier New" w:eastAsia="Courier New" w:hAnsi="Courier New"/>
+                <w:sz w:val="17"/>
+                <w:szCs w:val="17"/>
+              </w:rPr>
+              <w:t xml:space="preserve">      PUT SKIP LIST(KY, R);</w:t>
+            </w:r>
+          </w:p>
+          <w:p>
+            <w:pPr>
+              <w:keepNext/>
+              <w:spacing w:after="0" w:line="228"/>
+            </w:pPr>
+            <w:r>
+              <w:rPr>
+                <w:rFonts w:ascii="Courier New" w:cs="Courier New" w:eastAsia="Courier New" w:hAnsi="Courier New"/>
+                <w:sz w:val="17"/>
+                <w:szCs w:val="17"/>
+              </w:rPr>
+              <w:t xml:space="preserve">    END;</w:t>
+            </w:r>
+          </w:p>
+          <w:p>
+            <w:pPr>
+              <w:keepNext/>
+              <w:spacing w:after="0" w:line="228"/>
+            </w:pPr>
+            <w:r>
+              <w:rPr>
+                <w:rFonts w:ascii="Courier New" w:cs="Courier New" w:eastAsia="Courier New" w:hAnsi="Courier New"/>
+                <w:sz w:val="17"/>
+                <w:szCs w:val="17"/>
+              </w:rPr>
+              <w:t xml:space="preserve">  DONE: ;</w:t>
+            </w:r>
+          </w:p>
+          <w:p>
+            <w:pPr>
+              <w:keepNext/>
+              <w:spacing w:after="0" w:line="228"/>
+            </w:pPr>
+            <w:r>
+              <w:rPr>
+                <w:rFonts w:ascii="Courier New" w:cs="Courier New" w:eastAsia="Courier New" w:hAnsi="Courier New"/>
+                <w:sz w:val="17"/>
+                <w:szCs w:val="17"/>
+              </w:rPr>
+              <w:t xml:space="preserve">  END LISTALL;</w:t>
+            </w:r>
+          </w:p>
+          <w:p>
+            <w:pPr>
+              <w:keepNext/>
+              <w:spacing w:after="0" w:line="228"/>
+            </w:pPr>
+            <w:r>
+              <w:rPr>
+                <w:rFonts w:ascii="Courier New" w:cs="Courier New" w:eastAsia="Courier New" w:hAnsi="Courier New"/>
+                <w:sz w:val="17"/>
+                <w:szCs w:val="17"/>
+              </w:rPr>
+              <w:t xml:space="preserve"> </w:t>
+            </w:r>
+          </w:p>
+          <w:p>
+            <w:pPr>
+              <w:keepNext/>
+              <w:spacing w:after="0" w:line="228"/>
+            </w:pPr>
+            <w:r>
+              <w:rPr>
+                <w:rFonts w:ascii="Courier New" w:cs="Courier New" w:eastAsia="Courier New" w:hAnsi="Courier New"/>
+                <w:sz w:val="17"/>
+                <w:szCs w:val="17"/>
+              </w:rPr>
+              <w:t xml:space="preserve">  OPEN FILE(EMP) TITLE('emp.dat') OUTPUT KEYED;</w:t>
+            </w:r>
+          </w:p>
+          <w:p>
+            <w:pPr>
+              <w:keepNext/>
+              <w:spacing w:after="0" w:line="228"/>
+            </w:pPr>
+            <w:r>
+              <w:rPr>
+                <w:rFonts w:ascii="Courier New" w:cs="Courier New" w:eastAsia="Courier New" w:hAnsi="Courier New"/>
+                <w:sz w:val="17"/>
+                <w:szCs w:val="17"/>
+              </w:rPr>
+              <w:t xml:space="preserve">  WRITE FILE(EMP) FROM('Smith, J') KEYFROM('E0300');</w:t>
+            </w:r>
+          </w:p>
+          <w:p>
+            <w:pPr>
+              <w:keepNext/>
+              <w:spacing w:after="0" w:line="228"/>
+            </w:pPr>
+            <w:r>
+              <w:rPr>
+                <w:rFonts w:ascii="Courier New" w:cs="Courier New" w:eastAsia="Courier New" w:hAnsi="Courier New"/>
+                <w:sz w:val="17"/>
+                <w:szCs w:val="17"/>
+              </w:rPr>
+              <w:t xml:space="preserve">  WRITE FILE(EMP) FROM('Adams, B') KEYFROM('E0100');</w:t>
+            </w:r>
+          </w:p>
+          <w:p>
+            <w:pPr>
+              <w:keepNext/>
+              <w:spacing w:after="0" w:line="228"/>
+            </w:pPr>
+            <w:r>
+              <w:rPr>
+                <w:rFonts w:ascii="Courier New" w:cs="Courier New" w:eastAsia="Courier New" w:hAnsi="Courier New"/>
+                <w:sz w:val="17"/>
+                <w:szCs w:val="17"/>
+              </w:rPr>
+              <w:t xml:space="preserve">  WRITE FILE(EMP) FROM('Jones, K') KEYFROM('E0200');</w:t>
+            </w:r>
+          </w:p>
+          <w:p>
+            <w:pPr>
+              <w:keepNext/>
+              <w:spacing w:after="0" w:line="228"/>
+            </w:pPr>
+            <w:r>
+              <w:rPr>
+                <w:rFonts w:ascii="Courier New" w:cs="Courier New" w:eastAsia="Courier New" w:hAnsi="Courier New"/>
+                <w:sz w:val="17"/>
+                <w:szCs w:val="17"/>
+              </w:rPr>
+              <w:t xml:space="preserve">  ON KEY(EMP) BEGIN;</w:t>
+            </w:r>
+          </w:p>
+          <w:p>
+            <w:pPr>
+              <w:keepNext/>
+              <w:spacing w:after="0" w:line="228"/>
+            </w:pPr>
+            <w:r>
+              <w:rPr>
+                <w:rFonts w:ascii="Courier New" w:cs="Courier New" w:eastAsia="Courier New" w:hAnsi="Courier New"/>
+                <w:sz w:val="17"/>
+                <w:szCs w:val="17"/>
+              </w:rPr>
+              <w:t xml:space="preserve">    PUT SKIP LIST('KEY condition, ONCODE', ONCODE);</w:t>
+            </w:r>
+          </w:p>
+          <w:p>
+            <w:pPr>
+              <w:keepNext/>
+              <w:spacing w:after="0" w:line="228"/>
+            </w:pPr>
+            <w:r>
+              <w:rPr>
+                <w:rFonts w:ascii="Courier New" w:cs="Courier New" w:eastAsia="Courier New" w:hAnsi="Courier New"/>
+                <w:sz w:val="17"/>
+                <w:szCs w:val="17"/>
+              </w:rPr>
+              <w:t xml:space="preserve">  END;</w:t>
+            </w:r>
+          </w:p>
+          <w:p>
+            <w:pPr>
+              <w:keepNext/>
+              <w:spacing w:after="0" w:line="228"/>
+            </w:pPr>
+            <w:r>
+              <w:rPr>
+                <w:rFonts w:ascii="Courier New" w:cs="Courier New" w:eastAsia="Courier New" w:hAnsi="Courier New"/>
+                <w:sz w:val="17"/>
+                <w:szCs w:val="17"/>
+              </w:rPr>
+              <w:t xml:space="preserve">  WRITE FILE(EMP) FROM('Duplicate') KEYFROM('E0100');</w:t>
+            </w:r>
+          </w:p>
+          <w:p>
+            <w:pPr>
+              <w:keepNext/>
+              <w:spacing w:after="0" w:line="228"/>
+            </w:pPr>
+            <w:r>
+              <w:rPr>
+                <w:rFonts w:ascii="Courier New" w:cs="Courier New" w:eastAsia="Courier New" w:hAnsi="Courier New"/>
+                <w:sz w:val="17"/>
+                <w:szCs w:val="17"/>
+              </w:rPr>
+              <w:t xml:space="preserve">  CLOSE FILE(EMP);</w:t>
+            </w:r>
+          </w:p>
+          <w:p>
+            <w:pPr>
+              <w:keepNext/>
+              <w:spacing w:after="0" w:line="228"/>
+            </w:pPr>
+            <w:r>
+              <w:rPr>
+                <w:rFonts w:ascii="Courier New" w:cs="Courier New" w:eastAsia="Courier New" w:hAnsi="Courier New"/>
+                <w:sz w:val="17"/>
+                <w:szCs w:val="17"/>
+              </w:rPr>
+              <w:t xml:space="preserve"> </w:t>
+            </w:r>
+          </w:p>
+          <w:p>
+            <w:pPr>
+              <w:keepNext/>
+              <w:spacing w:after="0" w:line="228"/>
+            </w:pPr>
+            <w:r>
+              <w:rPr>
+                <w:rFonts w:ascii="Courier New" w:cs="Courier New" w:eastAsia="Courier New" w:hAnsi="Courier New"/>
+                <w:sz w:val="17"/>
+                <w:szCs w:val="17"/>
+              </w:rPr>
+              <w:t xml:space="preserve">  OPEN FILE(EMP) TITLE('emp.dat') UPDATE KEYED;</w:t>
+            </w:r>
+          </w:p>
+          <w:p>
+            <w:pPr>
+              <w:keepNext/>
+              <w:spacing w:after="0" w:line="228"/>
+            </w:pPr>
+            <w:r>
+              <w:rPr>
+                <w:rFonts w:ascii="Courier New" w:cs="Courier New" w:eastAsia="Courier New" w:hAnsi="Courier New"/>
+                <w:sz w:val="17"/>
+                <w:szCs w:val="17"/>
+              </w:rPr>
+              <w:t xml:space="preserve">  READ FILE(EMP) INTO(REC) KEY('E0200');</w:t>
+            </w:r>
+          </w:p>
+          <w:p>
+            <w:pPr>
+              <w:keepNext/>
+              <w:spacing w:after="0" w:line="228"/>
+            </w:pPr>
+            <w:r>
+              <w:rPr>
+                <w:rFonts w:ascii="Courier New" w:cs="Courier New" w:eastAsia="Courier New" w:hAnsi="Courier New"/>
+                <w:sz w:val="17"/>
+                <w:szCs w:val="17"/>
+              </w:rPr>
+              <w:t xml:space="preserve">  PUT SKIP LIST('E0200 is', REC);</w:t>
+            </w:r>
+          </w:p>
+          <w:p>
+            <w:pPr>
+              <w:keepNext/>
+              <w:spacing w:after="0" w:line="228"/>
+            </w:pPr>
+            <w:r>
+              <w:rPr>
+                <w:rFonts w:ascii="Courier New" w:cs="Courier New" w:eastAsia="Courier New" w:hAnsi="Courier New"/>
+                <w:sz w:val="17"/>
+                <w:szCs w:val="17"/>
+              </w:rPr>
+              <w:t xml:space="preserve">  REWRITE FILE(EMP) FROM('Jones, Karen');</w:t>
+            </w:r>
+          </w:p>
+          <w:p>
+            <w:pPr>
+              <w:keepNext/>
+              <w:spacing w:after="0" w:line="228"/>
+            </w:pPr>
+            <w:r>
+              <w:rPr>
+                <w:rFonts w:ascii="Courier New" w:cs="Courier New" w:eastAsia="Courier New" w:hAnsi="Courier New"/>
+                <w:sz w:val="17"/>
+                <w:szCs w:val="17"/>
+              </w:rPr>
+              <w:t xml:space="preserve">  DELETE FILE(EMP) KEY('E0300');</w:t>
+            </w:r>
+          </w:p>
+          <w:p>
+            <w:pPr>
+              <w:keepNext/>
+              <w:spacing w:after="0" w:line="228"/>
+            </w:pPr>
+            <w:r>
+              <w:rPr>
+                <w:rFonts w:ascii="Courier New" w:cs="Courier New" w:eastAsia="Courier New" w:hAnsi="Courier New"/>
+                <w:sz w:val="17"/>
+                <w:szCs w:val="17"/>
+              </w:rPr>
+              <w:t xml:space="preserve">  READ FILE(EMP) INTO(REC) KEY('E9999');</w:t>
+            </w:r>
+          </w:p>
+          <w:p>
+            <w:pPr>
+              <w:keepNext/>
+              <w:spacing w:after="0" w:line="228"/>
+            </w:pPr>
+            <w:r>
+              <w:rPr>
+                <w:rFonts w:ascii="Courier New" w:cs="Courier New" w:eastAsia="Courier New" w:hAnsi="Courier New"/>
+                <w:sz w:val="17"/>
+                <w:szCs w:val="17"/>
+              </w:rPr>
+              <w:t xml:space="preserve">  CLOSE FILE(EMP);</w:t>
+            </w:r>
+          </w:p>
+          <w:p>
+            <w:pPr>
+              <w:keepNext/>
+              <w:spacing w:after="0" w:line="228"/>
+            </w:pPr>
+            <w:r>
+              <w:rPr>
+                <w:rFonts w:ascii="Courier New" w:cs="Courier New" w:eastAsia="Courier New" w:hAnsi="Courier New"/>
+                <w:sz w:val="17"/>
+                <w:szCs w:val="17"/>
+              </w:rPr>
+              <w:t xml:space="preserve"> </w:t>
+            </w:r>
+          </w:p>
+          <w:p>
+            <w:pPr>
+              <w:keepNext/>
+              <w:spacing w:after="0" w:line="228"/>
+            </w:pPr>
+            <w:r>
+              <w:rPr>
+                <w:rFonts w:ascii="Courier New" w:cs="Courier New" w:eastAsia="Courier New" w:hAnsi="Courier New"/>
+                <w:sz w:val="17"/>
+                <w:szCs w:val="17"/>
+              </w:rPr>
+              <w:t xml:space="preserve">  OPEN FILE(EMP) TITLE('emp.dat') INPUT KEYED;</w:t>
+            </w:r>
+          </w:p>
+          <w:p>
+            <w:pPr>
+              <w:keepNext/>
+              <w:spacing w:after="0" w:line="228"/>
+            </w:pPr>
+            <w:r>
+              <w:rPr>
+                <w:rFonts w:ascii="Courier New" w:cs="Courier New" w:eastAsia="Courier New" w:hAnsi="Courier New"/>
+                <w:sz w:val="17"/>
+                <w:szCs w:val="17"/>
+              </w:rPr>
+              <w:t xml:space="preserve">  CALL LISTALL(EMP);</w:t>
+            </w:r>
+          </w:p>
+          <w:p>
+            <w:pPr>
+              <w:keepNext/>
+              <w:spacing w:after="0" w:line="228"/>
+            </w:pPr>
+            <w:r>
+              <w:rPr>
+                <w:rFonts w:ascii="Courier New" w:cs="Courier New" w:eastAsia="Courier New" w:hAnsi="Courier New"/>
+                <w:sz w:val="17"/>
+                <w:szCs w:val="17"/>
+              </w:rPr>
+              <w:t xml:space="preserve">  CLOSE FILE(EMP);</w:t>
+            </w:r>
+          </w:p>
+          <w:p>
+            <w:pPr>
+              <w:keepNext/>
+              <w:spacing w:after="0" w:line="228"/>
+            </w:pPr>
+            <w:r>
+              <w:rPr>
+                <w:rFonts w:ascii="Courier New" w:cs="Courier New" w:eastAsia="Courier New" w:hAnsi="Courier New"/>
+                <w:sz w:val="17"/>
+                <w:szCs w:val="17"/>
+              </w:rPr>
+              <w:t xml:space="preserve">END KEYED;</w:t>
+            </w:r>
+          </w:p>
+          <w:p>
+            <w:pPr>
+              <w:keepNext/>
+              <w:spacing w:after="0" w:line="228"/>
+            </w:pPr>
+            <w:r>
+              <w:rPr>
+                <w:rFonts w:ascii="Courier New" w:cs="Courier New" w:eastAsia="Courier New" w:hAnsi="Courier New"/>
+                <w:sz w:val="17"/>
+                <w:szCs w:val="17"/>
+              </w:rPr>
+              <w:t xml:space="preserve"> </w:t>
+            </w:r>
+          </w:p>
+          <w:p>
+            <w:pPr>
+              <w:keepNext/>
+              <w:spacing w:after="0" w:line="228"/>
+            </w:pPr>
+            <w:r>
+              <w:rPr>
+                <w:rFonts w:ascii="Courier New" w:cs="Courier New" w:eastAsia="Courier New" w:hAnsi="Courier New"/>
+                <w:sz w:val="17"/>
+                <w:szCs w:val="17"/>
+              </w:rPr>
+              <w:t xml:space="preserve">/* prints */</w:t>
+            </w:r>
+          </w:p>
+          <w:p>
+            <w:pPr>
+              <w:keepNext/>
+              <w:spacing w:after="0" w:line="228"/>
+            </w:pPr>
+            <w:r>
+              <w:rPr>
+                <w:rFonts w:ascii="Courier New" w:cs="Courier New" w:eastAsia="Courier New" w:hAnsi="Courier New"/>
+                <w:sz w:val="17"/>
+                <w:szCs w:val="17"/>
+              </w:rPr>
+              <w:t xml:space="preserve">KEY condition, ONCODE   52</w:t>
+            </w:r>
+          </w:p>
+          <w:p>
+            <w:pPr>
+              <w:keepNext/>
+              <w:spacing w:after="0" w:line="228"/>
+            </w:pPr>
+            <w:r>
+              <w:rPr>
+                <w:rFonts w:ascii="Courier New" w:cs="Courier New" w:eastAsia="Courier New" w:hAnsi="Courier New"/>
+                <w:sz w:val="17"/>
+                <w:szCs w:val="17"/>
+              </w:rPr>
+              <w:t xml:space="preserve">E0200 is                Jones, K            </w:t>
+            </w:r>
+          </w:p>
+          <w:p>
+            <w:pPr>
+              <w:keepNext/>
+              <w:spacing w:after="0" w:line="228"/>
+            </w:pPr>
+            <w:r>
+              <w:rPr>
+                <w:rFonts w:ascii="Courier New" w:cs="Courier New" w:eastAsia="Courier New" w:hAnsi="Courier New"/>
+                <w:sz w:val="17"/>
+                <w:szCs w:val="17"/>
+              </w:rPr>
+              <w:t xml:space="preserve">KEY condition, ONCODE   51</w:t>
+            </w:r>
+          </w:p>
+          <w:p>
+            <w:pPr>
+              <w:keepNext/>
+              <w:spacing w:after="0" w:line="228"/>
+            </w:pPr>
+            <w:r>
+              <w:rPr>
+                <w:rFonts w:ascii="Courier New" w:cs="Courier New" w:eastAsia="Courier New" w:hAnsi="Courier New"/>
+                <w:sz w:val="17"/>
+                <w:szCs w:val="17"/>
+              </w:rPr>
+              <w:t xml:space="preserve">E0100                   Adams, B            </w:t>
+            </w:r>
+          </w:p>
+          <w:p>
+            <w:pPr>
+              <w:keepNext/>
+              <w:spacing w:after="0" w:line="228"/>
+            </w:pPr>
+            <w:r>
+              <w:rPr>
+                <w:rFonts w:ascii="Courier New" w:cs="Courier New" w:eastAsia="Courier New" w:hAnsi="Courier New"/>
+                <w:sz w:val="17"/>
+                <w:szCs w:val="17"/>
+              </w:rPr>
+              <w:t xml:space="preserve">E0200                   Jones, Karen        </w:t>
+            </w:r>
+          </w:p>
+        </w:tc>
+      </w:tr>
+    </w:tbl>
+    <w:p>
+      <w:pPr>
+        <w:spacing w:after="200" w:before="80"/>
+      </w:pPr>
+      <w:r>
+        <w:rPr>
+          <w:rFonts w:ascii="Arial" w:cs="Arial" w:eastAsia="Arial" w:hAnsi="Arial"/>
+          <w:b/>
+          <w:bCs/>
+          <w:sz w:val="18"/>
+          <w:szCs w:val="18"/>
+        </w:rPr>
+        <w:t xml:space="preserve">Figure 33. </w:t>
+      </w:r>
+      <w:r>
+        <w:rPr>
+          <w:rFonts w:ascii="Arial" w:cs="Arial" w:eastAsia="Arial" w:hAnsi="Arial"/>
+          <w:sz w:val="18"/>
+          <w:szCs w:val="18"/>
+        </w:rPr>
+        <w:t xml:space="preserve">A keyed file</w:t>
       </w:r>
     </w:p>
     <w:p>
@@ -23436,7 +24406,7 @@
           <w:sz w:val="18"/>
           <w:szCs w:val="18"/>
         </w:rPr>
-        <w:t xml:space="preserve">Figure 33. </w:t>
+        <w:t xml:space="preserve">Figure 34. </w:t>
       </w:r>
       <w:r>
         <w:rPr>
@@ -24088,7 +25058,7 @@
           <w:sz w:val="18"/>
           <w:szCs w:val="18"/>
         </w:rPr>
-        <w:t xml:space="preserve">Figure 34. </w:t>
+        <w:t xml:space="preserve">Figure 35. </w:t>
       </w:r>
       <w:r>
         <w:rPr>
@@ -24371,7 +25341,7 @@
           <w:sz w:val="18"/>
           <w:szCs w:val="18"/>
         </w:rPr>
-        <w:t xml:space="preserve">Figure 35. </w:t>
+        <w:t xml:space="preserve">Figure 36. </w:t>
       </w:r>
       <w:r>
         <w:rPr>
@@ -24708,7 +25678,7 @@
           <w:sz w:val="18"/>
           <w:szCs w:val="18"/>
         </w:rPr>
-        <w:t xml:space="preserve">Figure 36. </w:t>
+        <w:t xml:space="preserve">Figure 37. </w:t>
       </w:r>
       <w:r>
         <w:rPr>
@@ -25607,7 +26577,7 @@
           <w:sz w:val="18"/>
           <w:szCs w:val="18"/>
         </w:rPr>
-        <w:t xml:space="preserve">Figure 37. </w:t>
+        <w:t xml:space="preserve">Figure 38. </w:t>
       </w:r>
       <w:r>
         <w:rPr>
@@ -25874,7 +26844,7 @@
           <w:sz w:val="18"/>
           <w:szCs w:val="18"/>
         </w:rPr>
-        <w:t xml:space="preserve">Figure 38. </w:t>
+        <w:t xml:space="preserve">Figure 39. </w:t>
       </w:r>
       <w:r>
         <w:rPr>
@@ -26322,7 +27292,7 @@
           <w:sz w:val="18"/>
           <w:szCs w:val="18"/>
         </w:rPr>
-        <w:t xml:space="preserve">Figure 39. </w:t>
+        <w:t xml:space="preserve">Figure 40. </w:t>
       </w:r>
       <w:r>
         <w:rPr>
@@ -26866,7 +27836,7 @@
           <w:sz w:val="18"/>
           <w:szCs w:val="18"/>
         </w:rPr>
-        <w:t xml:space="preserve">Figure 40. </w:t>
+        <w:t xml:space="preserve">Figure 41. </w:t>
       </w:r>
       <w:r>
         <w:rPr>
@@ -27382,7 +28352,7 @@
           <w:sz w:val="18"/>
           <w:szCs w:val="18"/>
         </w:rPr>
-        <w:t xml:space="preserve">Figure 41. </w:t>
+        <w:t xml:space="preserve">Figure 42. </w:t>
       </w:r>
       <w:r>
         <w:rPr>
@@ -27855,7 +28825,7 @@
           <w:sz w:val="18"/>
           <w:szCs w:val="18"/>
         </w:rPr>
-        <w:t xml:space="preserve">Figure 42. </w:t>
+        <w:t xml:space="preserve">Figure 43. </w:t>
       </w:r>
       <w:r>
         <w:rPr>
@@ -28244,7 +29214,7 @@
           <w:sz w:val="18"/>
           <w:szCs w:val="18"/>
         </w:rPr>
-        <w:t xml:space="preserve">Figure 43. </w:t>
+        <w:t xml:space="preserve">Figure 44. </w:t>
       </w:r>
       <w:r>
         <w:rPr>
@@ -28819,7 +29789,7 @@
           <w:sz w:val="18"/>
           <w:szCs w:val="18"/>
         </w:rPr>
-        <w:t xml:space="preserve">Figure 44. </w:t>
+        <w:t xml:space="preserve">Figure 45. </w:t>
       </w:r>
       <w:r>
         <w:rPr>
@@ -29264,7 +30234,7 @@
           <w:sz w:val="18"/>
           <w:szCs w:val="18"/>
         </w:rPr>
-        <w:t xml:space="preserve">Figure 45. </w:t>
+        <w:t xml:space="preserve">Figure 46. </w:t>
       </w:r>
       <w:r>
         <w:rPr>
@@ -29947,7 +30917,7 @@
           <w:sz w:val="18"/>
           <w:szCs w:val="18"/>
         </w:rPr>
-        <w:t xml:space="preserve">Figure 46. </w:t>
+        <w:t xml:space="preserve">Figure 47. </w:t>
       </w:r>
       <w:r>
         <w:rPr>
@@ -30660,7 +31630,7 @@
                 <w:sz w:val="19"/>
                 <w:szCs w:val="19"/>
               </w:rPr>
-              <w:t xml:space="preserve">KEYED and INDEXED record files, REWRITE, DELETE, LOCATE</w:t>
+              <w:t xml:space="preserve">KEYED and INDEXED record files, REWRITE, DELETE</w:t>
             </w:r>
           </w:p>
         </w:tc>
@@ -30687,7 +31657,7 @@
                 <w:sz w:val="19"/>
                 <w:szCs w:val="19"/>
               </w:rPr>
-              <w:t xml:space="preserve">Not supported. Only sequential record files.</w:t>
+              <w:t xml:space="preserve">KEYED and UPDATE files are supported, held in memory (chapter 5). LOCATE and VSAM data sets are not.</w:t>
             </w:r>
           </w:p>
         </w:tc>
@@ -30864,7 +31834,7 @@
                 <w:sz w:val="19"/>
                 <w:szCs w:val="19"/>
               </w:rPr>
-              <w:t xml:space="preserve">Not supported (PUT DATA is).</w:t>
+              <w:t xml:space="preserve">Supported with a list of scalar variables.</w:t>
             </w:r>
           </w:p>
         </w:tc>
@@ -31059,7 +32029,7 @@
           <w:sz w:val="18"/>
           <w:szCs w:val="18"/>
         </w:rPr>
-        <w:t xml:space="preserve">Figure 47. </w:t>
+        <w:t xml:space="preserve">Figure 48. </w:t>
       </w:r>
       <w:r>
         <w:rPr>
@@ -31915,7 +32885,7 @@
           <w:sz w:val="18"/>
           <w:szCs w:val="18"/>
         </w:rPr>
-        <w:t xml:space="preserve">Figure 48. </w:t>
+        <w:t xml:space="preserve">Figure 49. </w:t>
       </w:r>
       <w:r>
         <w:rPr>
@@ -32917,7 +33887,7 @@
           <w:sz w:val="18"/>
           <w:szCs w:val="18"/>
         </w:rPr>
-        <w:t xml:space="preserve">Figure 49. </w:t>
+        <w:t xml:space="preserve">Figure 50. </w:t>
       </w:r>
       <w:r>
         <w:rPr>
@@ -33841,7 +34811,7 @@
           </w:tcPr>
           <w:p>
             <w:pPr>
-              <w:keepNext w:val="false"/>
+              <w:keepNext/>
               <w:spacing w:after="0"/>
             </w:pPr>
             <w:r>
@@ -33850,7 +34820,7 @@
                 <w:sz w:val="18"/>
                 <w:szCs w:val="18"/>
               </w:rPr>
-              <w:t xml:space="preserve">GET DATA is not supported</w:t>
+              <w:t xml:space="preserve">array shapes differ</w:t>
             </w:r>
           </w:p>
         </w:tc>
@@ -33866,7 +34836,7 @@
           </w:tcPr>
           <w:p>
             <w:pPr>
-              <w:keepNext w:val="false"/>
+              <w:keepNext/>
               <w:spacing w:after="0"/>
             </w:pPr>
             <w:r>
@@ -33877,63 +34847,6 @@
                 <w:sz w:val="19"/>
                 <w:szCs w:val="19"/>
               </w:rPr>
-              <w:t xml:space="preserve">Not implemented.</w:t>
-            </w:r>
-          </w:p>
-        </w:tc>
-      </w:tr>
-      <w:tr>
-        <w:trPr>
-          <w:cantSplit/>
-        </w:trPr>
-        <w:tc>
-          <w:tcPr>
-            <w:tcW w:type="dxa" w:w="4200"/>
-            <w:tcMar>
-              <w:top w:type="dxa" w:w="60"/>
-              <w:left w:type="dxa" w:w="100"/>
-              <w:bottom w:type="dxa" w:w="60"/>
-              <w:right w:type="dxa" w:w="100"/>
-            </w:tcMar>
-          </w:tcPr>
-          <w:p>
-            <w:pPr>
-              <w:keepNext/>
-              <w:spacing w:after="0"/>
-            </w:pPr>
-            <w:r>
-              <w:rPr>
-                <w:rFonts w:ascii="Courier New" w:cs="Courier New" w:eastAsia="Courier New" w:hAnsi="Courier New"/>
-                <w:sz w:val="18"/>
-                <w:szCs w:val="18"/>
-              </w:rPr>
-              <w:t xml:space="preserve">array shapes differ</w:t>
-            </w:r>
-          </w:p>
-        </w:tc>
-        <w:tc>
-          <w:tcPr>
-            <w:tcW w:type="dxa" w:w="5438"/>
-            <w:tcMar>
-              <w:top w:type="dxa" w:w="60"/>
-              <w:left w:type="dxa" w:w="100"/>
-              <w:bottom w:type="dxa" w:w="60"/>
-              <w:right w:type="dxa" w:w="100"/>
-            </w:tcMar>
-          </w:tcPr>
-          <w:p>
-            <w:pPr>
-              <w:keepNext/>
-              <w:spacing w:after="0"/>
-            </w:pPr>
-            <w:r>
-              <w:rPr>
-                <w:rFonts w:ascii="Times New Roman" w:cs="Times New Roman" w:eastAsia="Times New Roman" w:hAnsi="Times New Roman"/>
-                <w:b w:val="false"/>
-                <w:bCs w:val="false"/>
-                <w:sz w:val="19"/>
-                <w:szCs w:val="19"/>
-              </w:rPr>
               <w:t xml:space="preserve">An array assignment between arrays of different shape.</w:t>
             </w:r>
           </w:p>
@@ -33952,7 +34865,7 @@
           <w:sz w:val="18"/>
           <w:szCs w:val="18"/>
         </w:rPr>
-        <w:t xml:space="preserve">Figure 50. </w:t>
+        <w:t xml:space="preserve">Figure 51. </w:t>
       </w:r>
       <w:r>
         <w:rPr>
@@ -34722,7 +35635,7 @@
           <w:sz w:val="18"/>
           <w:szCs w:val="18"/>
         </w:rPr>
-        <w:t xml:space="preserve">Figure 51. </w:t>
+        <w:t xml:space="preserve">Figure 52. </w:t>
       </w:r>
       <w:r>
         <w:rPr>
@@ -34859,7 +35772,7 @@
           <w:sz w:val="21"/>
           <w:szCs w:val="21"/>
         </w:rPr>
-        <w:t xml:space="preserve">Arrays of structures cannot be parameters; a VARYING array cannot be a parameter; a FILE cannot be a parameter.</w:t>
+        <w:t xml:space="preserve">Arrays of structures cannot be parameters; a VARYING array cannot be a parameter.</w:t>
       </w:r>
     </w:p>
     <w:p>
@@ -34993,7 +35906,7 @@
           <w:sz w:val="21"/>
           <w:szCs w:val="21"/>
         </w:rPr>
-        <w:t xml:space="preserve">GET DATA, REWRITE, keyed access and the options KEY, KEYFROM and KEYTO are not available. READ INTO an array is not supported.</w:t>
+        <w:t xml:space="preserve">GET DATA needs a list of scalar names. LOCATE, the option SET and VSAM data sets are not available; KEYED files are held in memory.</w:t>
       </w:r>
     </w:p>
     <w:p>

</xml_diff>

<commit_message>
Arithmetic: FIXEDOVERFLOW, SIZE, OVERFLOW, UNDERFLOW raised; FIXED BIN to 63 bits, FIXED DEC to 31 digits
Also fixes FIXED DECIMAL rounding for large values.

Co-Authored-By: Claude Sonnet 5.5 <noreply@anthropic.com>
Claude-Session: https://claude.ai/code/session_01JnKSjwwiAQX8ZZcaJLvQEV
</commit_message>
<xml_diff>
--- a/docs/PLI-User-Guide.docx
+++ b/docs/PLI-User-Guide.docx
@@ -3552,7 +3552,7 @@
           <w:sz w:val="21"/>
           <w:szCs w:val="21"/>
         </w:rPr>
-        <w:t xml:space="preserve">Data types FIXED BINARY (up to 31 bits), FIXED DECIMAL, FLOAT, CHARACTER (also VARYING), BIT, POINTER and FILE.</w:t>
+        <w:t xml:space="preserve">Data types FIXED BINARY (up to 63 bits), FIXED DECIMAL (up to 31 digits), FLOAT, CHARACTER (also VARYING), BIT, POINTER and FILE.</w:t>
       </w:r>
     </w:p>
     <w:p>
@@ -3710,7 +3710,7 @@
           <w:sz w:val="21"/>
           <w:szCs w:val="21"/>
         </w:rPr>
-        <w:t xml:space="preserve">The conditions ERROR, ZERODIVIDE, OVERFLOW, UNDERFLOW, SIZE, CONVERSION, SUBSCRIPTRANGE, STRINGRANGE, FINISH and ENDFILE, with ON, REVERT and SIGNAL.</w:t>
+        <w:t xml:space="preserve">The conditions ERROR, ZERODIVIDE, OVERFLOW, FIXEDOVERFLOW, UNDERFLOW, SIZE, CONVERSION, SUBSCRIPTRANGE, STRINGRANGE, FINISH and ENDFILE, with ON, REVERT and SIGNAL.</w:t>
       </w:r>
     </w:p>
     <w:p>
@@ -9468,7 +9468,7 @@
                 <w:sz w:val="19"/>
                 <w:szCs w:val="19"/>
               </w:rPr>
-              <w:t xml:space="preserve">Binary integer of p bits, p up to 31. </w:t>
+              <w:t xml:space="preserve">Binary integer of p bits, p up to 63. </w:t>
             </w:r>
             <w:r>
               <w:rPr>
@@ -9522,7 +9522,25 @@
                 <w:sz w:val="19"/>
                 <w:szCs w:val="19"/>
               </w:rPr>
-              <w:t xml:space="preserve">.</w:t>
+              <w:t xml:space="preserve"> for p up to 31 and as a </w:t>
+            </w:r>
+            <w:r>
+              <w:rPr>
+                <w:rFonts w:ascii="Courier New" w:cs="Courier New" w:eastAsia="Courier New" w:hAnsi="Courier New"/>
+                <w:sz w:val="18"/>
+                <w:szCs w:val="18"/>
+              </w:rPr>
+              <w:t xml:space="preserve">double</w:t>
+            </w:r>
+            <w:r>
+              <w:rPr>
+                <w:rFonts w:ascii="Times New Roman" w:cs="Times New Roman" w:eastAsia="Times New Roman" w:hAnsi="Times New Roman"/>
+                <w:b w:val="false"/>
+                <w:bCs w:val="false"/>
+                <w:sz w:val="19"/>
+                <w:szCs w:val="19"/>
+              </w:rPr>
+              <w:t xml:space="preserve"> above that, so a value is exact only up to about 9E15.</w:t>
             </w:r>
           </w:p>
         </w:tc>
@@ -9579,7 +9597,7 @@
                 <w:sz w:val="19"/>
                 <w:szCs w:val="19"/>
               </w:rPr>
-              <w:t xml:space="preserve">Decimal number with p digits, q of them after the point. Calculations are done in floating point (</w:t>
+              <w:t xml:space="preserve">Decimal number with p digits (up to 31), q of them after the point. Calculations are done in floating point (</w:t>
             </w:r>
             <w:r>
               <w:rPr>
@@ -14089,7 +14107,7 @@
                 <w:sz w:val="19"/>
                 <w:szCs w:val="19"/>
               </w:rPr>
-              <w:t xml:space="preserve">Only by SIGNAL; the runtime does not detect overflow.</w:t>
+              <w:t xml:space="preserve">A floating-point result is too large; it is stored as the largest number. Without an ON-unit the condition becomes ERROR.</w:t>
             </w:r>
           </w:p>
         </w:tc>
@@ -14119,7 +14137,7 @@
                 <w:sz w:val="18"/>
                 <w:szCs w:val="18"/>
               </w:rPr>
-              <w:t xml:space="preserve">UNDERFLOW</w:t>
+              <w:t xml:space="preserve">FIXEDOVERFLOW</w:t>
             </w:r>
           </w:p>
         </w:tc>
@@ -14146,7 +14164,7 @@
                 <w:sz w:val="19"/>
                 <w:szCs w:val="19"/>
               </w:rPr>
-              <w:t xml:space="preserve">330</w:t>
+              <w:t xml:space="preserve">310</w:t>
             </w:r>
           </w:p>
         </w:tc>
@@ -14173,7 +14191,7 @@
                 <w:sz w:val="19"/>
                 <w:szCs w:val="19"/>
               </w:rPr>
-              <w:t xml:space="preserve">Only by SIGNAL.</w:t>
+              <w:t xml:space="preserve">A FIXED result does not fit the 31 bits of a FIXED BINARY variable of 31 bits or less; the result is stored as the largest value.</w:t>
             </w:r>
           </w:p>
         </w:tc>
@@ -14203,7 +14221,7 @@
                 <w:sz w:val="18"/>
                 <w:szCs w:val="18"/>
               </w:rPr>
-              <w:t xml:space="preserve">SIZE</w:t>
+              <w:t xml:space="preserve">UNDERFLOW</w:t>
             </w:r>
           </w:p>
         </w:tc>
@@ -14230,7 +14248,7 @@
                 <w:sz w:val="19"/>
                 <w:szCs w:val="19"/>
               </w:rPr>
-              <w:t xml:space="preserve">340</w:t>
+              <w:t xml:space="preserve">330</w:t>
             </w:r>
           </w:p>
         </w:tc>
@@ -14257,7 +14275,109 @@
                 <w:sz w:val="19"/>
                 <w:szCs w:val="19"/>
               </w:rPr>
-              <w:t xml:space="preserve">Only by SIGNAL; a value that is too big for its target is truncated without a condition.</w:t>
+              <w:t xml:space="preserve">A floating-point result that is not zero is too small (below 2.2E-308, or a product or quotient that becomes zero). The value is stored as zero. Without an ON-unit a message is written and the program continues.</w:t>
+            </w:r>
+          </w:p>
+        </w:tc>
+      </w:tr>
+      <w:tr>
+        <w:trPr>
+          <w:cantSplit/>
+        </w:trPr>
+        <w:tc>
+          <w:tcPr>
+            <w:tcW w:type="dxa" w:w="2400"/>
+            <w:tcMar>
+              <w:top w:type="dxa" w:w="60"/>
+              <w:left w:type="dxa" w:w="100"/>
+              <w:bottom w:type="dxa" w:w="60"/>
+              <w:right w:type="dxa" w:w="100"/>
+            </w:tcMar>
+          </w:tcPr>
+          <w:p>
+            <w:pPr>
+              <w:keepNext w:val="false"/>
+              <w:spacing w:after="0"/>
+            </w:pPr>
+            <w:r>
+              <w:rPr>
+                <w:rFonts w:ascii="Courier New" w:cs="Courier New" w:eastAsia="Courier New" w:hAnsi="Courier New"/>
+                <w:sz w:val="18"/>
+                <w:szCs w:val="18"/>
+              </w:rPr>
+              <w:t xml:space="preserve">SIZE</w:t>
+            </w:r>
+          </w:p>
+        </w:tc>
+        <w:tc>
+          <w:tcPr>
+            <w:tcW w:type="dxa" w:w="1100"/>
+            <w:tcMar>
+              <w:top w:type="dxa" w:w="60"/>
+              <w:left w:type="dxa" w:w="100"/>
+              <w:bottom w:type="dxa" w:w="60"/>
+              <w:right w:type="dxa" w:w="100"/>
+            </w:tcMar>
+          </w:tcPr>
+          <w:p>
+            <w:pPr>
+              <w:keepNext w:val="false"/>
+              <w:spacing w:after="0"/>
+            </w:pPr>
+            <w:r>
+              <w:rPr>
+                <w:rFonts w:ascii="Times New Roman" w:cs="Times New Roman" w:eastAsia="Times New Roman" w:hAnsi="Times New Roman"/>
+                <w:b w:val="false"/>
+                <w:bCs w:val="false"/>
+                <w:sz w:val="19"/>
+                <w:szCs w:val="19"/>
+              </w:rPr>
+              <w:t xml:space="preserve">340</w:t>
+            </w:r>
+          </w:p>
+        </w:tc>
+        <w:tc>
+          <w:tcPr>
+            <w:tcW w:type="dxa" w:w="6138"/>
+            <w:tcMar>
+              <w:top w:type="dxa" w:w="60"/>
+              <w:left w:type="dxa" w:w="100"/>
+              <w:bottom w:type="dxa" w:w="60"/>
+              <w:right w:type="dxa" w:w="100"/>
+            </w:tcMar>
+          </w:tcPr>
+          <w:p>
+            <w:pPr>
+              <w:keepNext w:val="false"/>
+              <w:spacing w:after="0"/>
+            </w:pPr>
+            <w:r>
+              <w:rPr>
+                <w:rFonts w:ascii="Times New Roman" w:cs="Times New Roman" w:eastAsia="Times New Roman" w:hAnsi="Times New Roman"/>
+                <w:b w:val="false"/>
+                <w:bCs w:val="false"/>
+                <w:sz w:val="19"/>
+                <w:szCs w:val="19"/>
+              </w:rPr>
+              <w:t xml:space="preserve">A value is too big for the precision of the FIXED variable it is assigned to. This is checked only under the prefix </w:t>
+            </w:r>
+            <w:r>
+              <w:rPr>
+                <w:rFonts w:ascii="Courier New" w:cs="Courier New" w:eastAsia="Courier New" w:hAnsi="Courier New"/>
+                <w:sz w:val="18"/>
+                <w:szCs w:val="18"/>
+              </w:rPr>
+              <w:t xml:space="preserve">(SIZE):</w:t>
+            </w:r>
+            <w:r>
+              <w:rPr>
+                <w:rFonts w:ascii="Times New Roman" w:cs="Times New Roman" w:eastAsia="Times New Roman" w:hAnsi="Times New Roman"/>
+                <w:b w:val="false"/>
+                <w:bCs w:val="false"/>
+                <w:sz w:val="19"/>
+                <w:szCs w:val="19"/>
+              </w:rPr>
+              <w:t xml:space="preserve">, as in the F compiler.</w:t>
             </w:r>
           </w:p>
         </w:tc>
@@ -17563,6 +17683,71 @@
                 <w:sz w:val="18"/>
                 <w:szCs w:val="18"/>
               </w:rPr>
+              <w:t xml:space="preserve">FIXED BINARY(p)</w:t>
+            </w:r>
+            <w:r>
+              <w:rPr>
+                <w:rFonts w:ascii="Times New Roman" w:cs="Times New Roman" w:eastAsia="Times New Roman" w:hAnsi="Times New Roman"/>
+                <w:b w:val="false"/>
+                <w:bCs w:val="false"/>
+                <w:sz w:val="19"/>
+                <w:szCs w:val="19"/>
+              </w:rPr>
+              <w:t xml:space="preserve">, p from 32 to 63</w:t>
+            </w:r>
+          </w:p>
+        </w:tc>
+        <w:tc>
+          <w:tcPr>
+            <w:tcW w:type="dxa" w:w="6338"/>
+            <w:tcMar>
+              <w:top w:type="dxa" w:w="60"/>
+              <w:left w:type="dxa" w:w="100"/>
+              <w:bottom w:type="dxa" w:w="60"/>
+              <w:right w:type="dxa" w:w="100"/>
+            </w:tcMar>
+          </w:tcPr>
+          <w:p>
+            <w:pPr>
+              <w:keepNext w:val="false"/>
+              <w:spacing w:after="0"/>
+            </w:pPr>
+            <w:r>
+              <w:rPr>
+                <w:rFonts w:ascii="Courier New" w:cs="Courier New" w:eastAsia="Courier New" w:hAnsi="Courier New"/>
+                <w:sz w:val="18"/>
+                <w:szCs w:val="18"/>
+              </w:rPr>
+              <w:t xml:space="preserve">double</w:t>
+            </w:r>
+          </w:p>
+        </w:tc>
+      </w:tr>
+      <w:tr>
+        <w:trPr>
+          <w:cantSplit/>
+        </w:trPr>
+        <w:tc>
+          <w:tcPr>
+            <w:tcW w:type="dxa" w:w="3300"/>
+            <w:tcMar>
+              <w:top w:type="dxa" w:w="60"/>
+              <w:left w:type="dxa" w:w="100"/>
+              <w:bottom w:type="dxa" w:w="60"/>
+              <w:right w:type="dxa" w:w="100"/>
+            </w:tcMar>
+          </w:tcPr>
+          <w:p>
+            <w:pPr>
+              <w:keepNext w:val="false"/>
+              <w:spacing w:after="0"/>
+            </w:pPr>
+            <w:r>
+              <w:rPr>
+                <w:rFonts w:ascii="Courier New" w:cs="Courier New" w:eastAsia="Courier New" w:hAnsi="Courier New"/>
+                <w:sz w:val="18"/>
+                <w:szCs w:val="18"/>
+              </w:rPr>
               <w:t xml:space="preserve">FIXED DECIMAL(p)</w:t>
             </w:r>
             <w:r>
@@ -31952,7 +32137,7 @@
                 <w:sz w:val="19"/>
                 <w:szCs w:val="19"/>
               </w:rPr>
-              <w:t xml:space="preserve">Not supported.</w:t>
+              <w:t xml:space="preserve">Accepted up to 63 bits and 31 digits, but exact only up to about 9E15 (2 to the power 53); see Chapter 4.</w:t>
             </w:r>
           </w:p>
         </w:tc>
@@ -32011,7 +32196,25 @@
                 <w:sz w:val="19"/>
                 <w:szCs w:val="19"/>
               </w:rPr>
-              <w:t xml:space="preserve">The conditions exist but are not raised by the runtime.</w:t>
+              <w:t xml:space="preserve">FIXEDOVERFLOW is raised when a FIXED BINARY(31) result is out of range; SIZE under the prefix </w:t>
+            </w:r>
+            <w:r>
+              <w:rPr>
+                <w:rFonts w:ascii="Courier New" w:cs="Courier New" w:eastAsia="Courier New" w:hAnsi="Courier New"/>
+                <w:sz w:val="18"/>
+                <w:szCs w:val="18"/>
+              </w:rPr>
+              <w:t xml:space="preserve">(SIZE):</w:t>
+            </w:r>
+            <w:r>
+              <w:rPr>
+                <w:rFonts w:ascii="Times New Roman" w:cs="Times New Roman" w:eastAsia="Times New Roman" w:hAnsi="Times New Roman"/>
+                <w:b w:val="false"/>
+                <w:bCs w:val="false"/>
+                <w:sz w:val="19"/>
+                <w:szCs w:val="19"/>
+              </w:rPr>
+              <w:t xml:space="preserve">.</w:t>
             </w:r>
           </w:p>
         </w:tc>
@@ -32159,7 +32362,7 @@
           <w:sz w:val="21"/>
           <w:szCs w:val="21"/>
         </w:rPr>
-        <w:t xml:space="preserve">. For 15 digits the results are the same as with decimal arithmetic.</w:t>
+        <w:t xml:space="preserve">. Up to 15 digits (and integers up to 2 to the power 53) the results are the same as with decimal arithmetic; beyond that the low-order digits are rounded.</w:t>
       </w:r>
     </w:p>
     <w:p>
@@ -35692,7 +35895,25 @@
           <w:sz w:val="21"/>
           <w:szCs w:val="21"/>
         </w:rPr>
-        <w:t xml:space="preserve">FIXED BINARY has at most 31 bits and FIXED DECIMAL at most 15 digits; there is no 64-bit integer.</w:t>
+        <w:t xml:space="preserve">FIXED BINARY has at most 63 bits and FIXED DECIMAL at most 31 digits, but arithmetic is done in floating point: numbers are exact only up to about 9E15, and a FIXED BINARY of more than 31 bits is stored as a </w:t>
+      </w:r>
+      <w:r>
+        <w:rPr>
+          <w:rFonts w:ascii="Courier New" w:cs="Courier New" w:eastAsia="Courier New" w:hAnsi="Courier New"/>
+          <w:sz w:val="19"/>
+          <w:szCs w:val="19"/>
+        </w:rPr>
+        <w:t xml:space="preserve">double</w:t>
+      </w:r>
+      <w:r>
+        <w:rPr>
+          <w:rFonts w:ascii="Times New Roman" w:cs="Times New Roman" w:eastAsia="Times New Roman" w:hAnsi="Times New Roman"/>
+          <w:b w:val="false"/>
+          <w:bCs w:val="false"/>
+          <w:sz w:val="21"/>
+          <w:szCs w:val="21"/>
+        </w:rPr>
+        <w:t xml:space="preserve">.</w:t>
       </w:r>
     </w:p>
     <w:p>
@@ -35712,7 +35933,25 @@
           <w:sz w:val="21"/>
           <w:szCs w:val="21"/>
         </w:rPr>
-        <w:t xml:space="preserve">Arithmetic is performed in floating point. The conditions OVERFLOW, UNDERFLOW and SIZE are not raised by the runtime but can be raised with SIGNAL.</w:t>
+        <w:t xml:space="preserve">OVERFLOW, UNDERFLOW, FIXEDOVERFLOW and SIZE are raised when a result is stored in a variable, not for every intermediate result. SIZE is checked only under the prefix </w:t>
+      </w:r>
+      <w:r>
+        <w:rPr>
+          <w:rFonts w:ascii="Courier New" w:cs="Courier New" w:eastAsia="Courier New" w:hAnsi="Courier New"/>
+          <w:sz w:val="19"/>
+          <w:szCs w:val="19"/>
+        </w:rPr>
+        <w:t xml:space="preserve">(SIZE):</w:t>
+      </w:r>
+      <w:r>
+        <w:rPr>
+          <w:rFonts w:ascii="Times New Roman" w:cs="Times New Roman" w:eastAsia="Times New Roman" w:hAnsi="Times New Roman"/>
+          <w:b w:val="false"/>
+          <w:bCs w:val="false"/>
+          <w:sz w:val="21"/>
+          <w:szCs w:val="21"/>
+        </w:rPr>
+        <w:t xml:space="preserve">.</w:t>
       </w:r>
     </w:p>
     <w:p>

</xml_diff>

<commit_message>
Stacked ON-units, CONTROLLED generations, run-time bounds for CONTROLLED arrays
Co-Authored-By: Claude Sonnet 5.5 <noreply@anthropic.com>
Claude-Session: https://claude.ai/code/session_01JnKSjwwiAQX8ZZcaJLvQEV
</commit_message>
<xml_diff>
--- a/docs/PLI-User-Guide.docx
+++ b/docs/PLI-User-Guide.docx
@@ -1135,7 +1135,7 @@
           <w:sz w:val="20"/>
           <w:szCs w:val="20"/>
         </w:rPr>
-        <w:t xml:space="preserve">	13</w:t>
+        <w:t xml:space="preserve">	14</w:t>
       </w:r>
     </w:p>
     <w:p>
@@ -1164,7 +1164,7 @@
           <w:sz w:val="20"/>
           <w:szCs w:val="20"/>
         </w:rPr>
-        <w:t xml:space="preserve">	14</w:t>
+        <w:t xml:space="preserve">	15</w:t>
       </w:r>
     </w:p>
     <w:p>
@@ -1193,7 +1193,7 @@
           <w:sz w:val="20"/>
           <w:szCs w:val="20"/>
         </w:rPr>
-        <w:t xml:space="preserve">	15</w:t>
+        <w:t xml:space="preserve">	16</w:t>
       </w:r>
     </w:p>
     <w:p>
@@ -1222,7 +1222,7 @@
           <w:sz w:val="20"/>
           <w:szCs w:val="20"/>
         </w:rPr>
-        <w:t xml:space="preserve">	17</w:t>
+        <w:t xml:space="preserve">	18</w:t>
       </w:r>
     </w:p>
     <w:p>
@@ -1251,7 +1251,7 @@
           <w:sz w:val="20"/>
           <w:szCs w:val="20"/>
         </w:rPr>
-        <w:t xml:space="preserve">	18</w:t>
+        <w:t xml:space="preserve">	19</w:t>
       </w:r>
     </w:p>
     <w:p>
@@ -1280,7 +1280,7 @@
           <w:sz w:val="20"/>
           <w:szCs w:val="20"/>
         </w:rPr>
-        <w:t xml:space="preserve">	19</w:t>
+        <w:t xml:space="preserve">	20</w:t>
       </w:r>
     </w:p>
     <w:p>
@@ -1309,7 +1309,7 @@
           <w:sz w:val="21"/>
           <w:szCs w:val="21"/>
         </w:rPr>
-        <w:t xml:space="preserve">	21</w:t>
+        <w:t xml:space="preserve">	22</w:t>
       </w:r>
     </w:p>
     <w:p>
@@ -1338,7 +1338,7 @@
           <w:sz w:val="20"/>
           <w:szCs w:val="20"/>
         </w:rPr>
-        <w:t xml:space="preserve">	21</w:t>
+        <w:t xml:space="preserve">	22</w:t>
       </w:r>
     </w:p>
     <w:p>
@@ -1367,7 +1367,7 @@
           <w:sz w:val="20"/>
           <w:szCs w:val="20"/>
         </w:rPr>
-        <w:t xml:space="preserve">	21</w:t>
+        <w:t xml:space="preserve">	22</w:t>
       </w:r>
     </w:p>
     <w:p>
@@ -1396,7 +1396,7 @@
           <w:sz w:val="20"/>
           <w:szCs w:val="20"/>
         </w:rPr>
-        <w:t xml:space="preserve">	22</w:t>
+        <w:t xml:space="preserve">	23</w:t>
       </w:r>
     </w:p>
     <w:p>
@@ -1425,7 +1425,7 @@
           <w:sz w:val="20"/>
           <w:szCs w:val="20"/>
         </w:rPr>
-        <w:t xml:space="preserve">	22</w:t>
+        <w:t xml:space="preserve">	23</w:t>
       </w:r>
     </w:p>
     <w:p>
@@ -1454,7 +1454,7 @@
           <w:sz w:val="20"/>
           <w:szCs w:val="20"/>
         </w:rPr>
-        <w:t xml:space="preserve">	23</w:t>
+        <w:t xml:space="preserve">	24</w:t>
       </w:r>
     </w:p>
     <w:p>
@@ -1483,7 +1483,7 @@
           <w:sz w:val="20"/>
           <w:szCs w:val="20"/>
         </w:rPr>
-        <w:t xml:space="preserve">	23</w:t>
+        <w:t xml:space="preserve">	24</w:t>
       </w:r>
     </w:p>
     <w:p>
@@ -1512,7 +1512,7 @@
           <w:sz w:val="20"/>
           <w:szCs w:val="20"/>
         </w:rPr>
-        <w:t xml:space="preserve">	24</w:t>
+        <w:t xml:space="preserve">	25</w:t>
       </w:r>
     </w:p>
     <w:p>
@@ -1541,7 +1541,7 @@
           <w:sz w:val="21"/>
           <w:szCs w:val="21"/>
         </w:rPr>
-        <w:t xml:space="preserve">	25</w:t>
+        <w:t xml:space="preserve">	26</w:t>
       </w:r>
     </w:p>
     <w:p>
@@ -1570,7 +1570,7 @@
           <w:sz w:val="20"/>
           <w:szCs w:val="20"/>
         </w:rPr>
-        <w:t xml:space="preserve">	25</w:t>
+        <w:t xml:space="preserve">	26</w:t>
       </w:r>
     </w:p>
     <w:p>
@@ -1599,7 +1599,7 @@
           <w:sz w:val="20"/>
           <w:szCs w:val="20"/>
         </w:rPr>
-        <w:t xml:space="preserve">	25</w:t>
+        <w:t xml:space="preserve">	26</w:t>
       </w:r>
     </w:p>
     <w:p>
@@ -1628,7 +1628,7 @@
           <w:sz w:val="20"/>
           <w:szCs w:val="20"/>
         </w:rPr>
-        <w:t xml:space="preserve">	26</w:t>
+        <w:t xml:space="preserve">	27</w:t>
       </w:r>
     </w:p>
     <w:p>
@@ -1657,7 +1657,7 @@
           <w:sz w:val="20"/>
           <w:szCs w:val="20"/>
         </w:rPr>
-        <w:t xml:space="preserve">	26</w:t>
+        <w:t xml:space="preserve">	27</w:t>
       </w:r>
     </w:p>
     <w:p>
@@ -1686,7 +1686,7 @@
           <w:sz w:val="20"/>
           <w:szCs w:val="20"/>
         </w:rPr>
-        <w:t xml:space="preserve">	27</w:t>
+        <w:t xml:space="preserve">	28</w:t>
       </w:r>
     </w:p>
     <w:p>
@@ -1715,7 +1715,7 @@
           <w:sz w:val="20"/>
           <w:szCs w:val="20"/>
         </w:rPr>
-        <w:t xml:space="preserve">	27</w:t>
+        <w:t xml:space="preserve">	28</w:t>
       </w:r>
     </w:p>
     <w:p>
@@ -1744,7 +1744,7 @@
           <w:sz w:val="21"/>
           <w:szCs w:val="21"/>
         </w:rPr>
-        <w:t xml:space="preserve">	28</w:t>
+        <w:t xml:space="preserve">	29</w:t>
       </w:r>
     </w:p>
     <w:p>
@@ -1773,7 +1773,7 @@
           <w:sz w:val="20"/>
           <w:szCs w:val="20"/>
         </w:rPr>
-        <w:t xml:space="preserve">	28</w:t>
+        <w:t xml:space="preserve">	29</w:t>
       </w:r>
     </w:p>
     <w:p>
@@ -1802,7 +1802,7 @@
           <w:sz w:val="20"/>
           <w:szCs w:val="20"/>
         </w:rPr>
-        <w:t xml:space="preserve">	28</w:t>
+        <w:t xml:space="preserve">	29</w:t>
       </w:r>
     </w:p>
     <w:p>
@@ -1831,7 +1831,7 @@
           <w:sz w:val="20"/>
           <w:szCs w:val="20"/>
         </w:rPr>
-        <w:t xml:space="preserve">	29</w:t>
+        <w:t xml:space="preserve">	30</w:t>
       </w:r>
     </w:p>
     <w:p>
@@ -1860,7 +1860,7 @@
           <w:sz w:val="20"/>
           <w:szCs w:val="20"/>
         </w:rPr>
-        <w:t xml:space="preserve">	30</w:t>
+        <w:t xml:space="preserve">	31</w:t>
       </w:r>
     </w:p>
     <w:p>
@@ -1889,7 +1889,7 @@
           <w:sz w:val="20"/>
           <w:szCs w:val="20"/>
         </w:rPr>
-        <w:t xml:space="preserve">	30</w:t>
+        <w:t xml:space="preserve">	31</w:t>
       </w:r>
     </w:p>
     <w:p>
@@ -1918,7 +1918,7 @@
           <w:sz w:val="21"/>
           <w:szCs w:val="21"/>
         </w:rPr>
-        <w:t xml:space="preserve">	32</w:t>
+        <w:t xml:space="preserve">	33</w:t>
       </w:r>
     </w:p>
     <w:p>
@@ -1947,7 +1947,7 @@
           <w:sz w:val="20"/>
           <w:szCs w:val="20"/>
         </w:rPr>
-        <w:t xml:space="preserve">	32</w:t>
+        <w:t xml:space="preserve">	33</w:t>
       </w:r>
     </w:p>
     <w:p>
@@ -1976,7 +1976,7 @@
           <w:sz w:val="20"/>
           <w:szCs w:val="20"/>
         </w:rPr>
-        <w:t xml:space="preserve">	32</w:t>
+        <w:t xml:space="preserve">	33</w:t>
       </w:r>
     </w:p>
     <w:p>
@@ -2005,7 +2005,7 @@
           <w:sz w:val="20"/>
           <w:szCs w:val="20"/>
         </w:rPr>
-        <w:t xml:space="preserve">	33</w:t>
+        <w:t xml:space="preserve">	34</w:t>
       </w:r>
     </w:p>
     <w:p>
@@ -2034,7 +2034,7 @@
           <w:sz w:val="21"/>
           <w:szCs w:val="21"/>
         </w:rPr>
-        <w:t xml:space="preserve">	34</w:t>
+        <w:t xml:space="preserve">	35</w:t>
       </w:r>
     </w:p>
     <w:p>
@@ -2063,7 +2063,7 @@
           <w:sz w:val="20"/>
           <w:szCs w:val="20"/>
         </w:rPr>
-        <w:t xml:space="preserve">	34</w:t>
+        <w:t xml:space="preserve">	35</w:t>
       </w:r>
     </w:p>
     <w:p>
@@ -2092,7 +2092,7 @@
           <w:sz w:val="20"/>
           <w:szCs w:val="20"/>
         </w:rPr>
-        <w:t xml:space="preserve">	34</w:t>
+        <w:t xml:space="preserve">	35</w:t>
       </w:r>
     </w:p>
     <w:p>
@@ -2121,7 +2121,7 @@
           <w:sz w:val="20"/>
           <w:szCs w:val="20"/>
         </w:rPr>
-        <w:t xml:space="preserve">	34</w:t>
+        <w:t xml:space="preserve">	35</w:t>
       </w:r>
     </w:p>
     <w:p>
@@ -2150,7 +2150,7 @@
           <w:sz w:val="21"/>
           <w:szCs w:val="21"/>
         </w:rPr>
-        <w:t xml:space="preserve">	36</w:t>
+        <w:t xml:space="preserve">	37</w:t>
       </w:r>
     </w:p>
     <w:p>
@@ -2179,7 +2179,7 @@
           <w:sz w:val="20"/>
           <w:szCs w:val="20"/>
         </w:rPr>
-        <w:t xml:space="preserve">	36</w:t>
+        <w:t xml:space="preserve">	37</w:t>
       </w:r>
     </w:p>
     <w:p>
@@ -2208,7 +2208,7 @@
           <w:sz w:val="20"/>
           <w:szCs w:val="20"/>
         </w:rPr>
-        <w:t xml:space="preserve">	36</w:t>
+        <w:t xml:space="preserve">	37</w:t>
       </w:r>
     </w:p>
     <w:p>
@@ -2237,7 +2237,7 @@
           <w:sz w:val="21"/>
           <w:szCs w:val="21"/>
         </w:rPr>
-        <w:t xml:space="preserve">	37</w:t>
+        <w:t xml:space="preserve">	38</w:t>
       </w:r>
     </w:p>
     <w:p>
@@ -10550,7 +10550,7 @@
                 <w:sz w:val="19"/>
                 <w:szCs w:val="19"/>
               </w:rPr>
-              <w:t xml:space="preserve">Storage is allocated and freed by ALLOCATE and FREE. Only one generation at a time is supported.</w:t>
+              <w:t xml:space="preserve">Storage is allocated and freed by ALLOCATE and FREE. Several generations are kept; the bounds of the first dimension are set by ALLOCATE.</w:t>
             </w:r>
           </w:p>
         </w:tc>
@@ -13680,7 +13680,7 @@
           <w:sz w:val="19"/>
           <w:szCs w:val="19"/>
         </w:rPr>
-        <w:t xml:space="preserve">DECLARE T(100) FIXED BINARY CONTROLLED;</w:t>
+        <w:t xml:space="preserve">DECLARE T(*) FIXED BINARY CONTROLLED;</w:t>
       </w:r>
       <w:r>
         <w:rPr>
@@ -13698,7 +13698,7 @@
           <w:sz w:val="19"/>
           <w:szCs w:val="19"/>
         </w:rPr>
-        <w:t xml:space="preserve">ALLOCATE T;</w:t>
+        <w:t xml:space="preserve">ALLOCATE T(N);</w:t>
       </w:r>
       <w:r>
         <w:rPr>
@@ -13726,7 +13726,7 @@
           <w:sz w:val="21"/>
           <w:szCs w:val="21"/>
         </w:rPr>
-        <w:t xml:space="preserve">. The bounds must be constants; a run-time extent is not supported. Only one generation exists at a time: a second ALLOCATE of a variable that is still allocated replaces the first. </w:t>
+        <w:t xml:space="preserve">. The bounds of the first dimension are given by ALLOCATE as </w:t>
       </w:r>
       <w:r>
         <w:rPr>
@@ -13734,6 +13734,62 @@
           <w:sz w:val="19"/>
           <w:szCs w:val="19"/>
         </w:rPr>
+        <w:t xml:space="preserve">T(n)</w:t>
+      </w:r>
+      <w:r>
+        <w:rPr>
+          <w:rFonts w:ascii="Times New Roman" w:cs="Times New Roman" w:eastAsia="Times New Roman" w:hAnsi="Times New Roman"/>
+          <w:b w:val="false"/>
+          <w:bCs w:val="false"/>
+          <w:sz w:val="21"/>
+          <w:szCs w:val="21"/>
+        </w:rPr>
+        <w:t xml:space="preserve"> or </w:t>
+      </w:r>
+      <w:r>
+        <w:rPr>
+          <w:rFonts w:ascii="Courier New" w:cs="Courier New" w:eastAsia="Courier New" w:hAnsi="Courier New"/>
+          <w:sz w:val="19"/>
+          <w:szCs w:val="19"/>
+        </w:rPr>
+        <w:t xml:space="preserve">T(lo:hi)</w:t>
+      </w:r>
+      <w:r>
+        <w:rPr>
+          <w:rFonts w:ascii="Times New Roman" w:cs="Times New Roman" w:eastAsia="Times New Roman" w:hAnsi="Times New Roman"/>
+          <w:b w:val="false"/>
+          <w:bCs w:val="false"/>
+          <w:sz w:val="21"/>
+          <w:szCs w:val="21"/>
+        </w:rPr>
+        <w:t xml:space="preserve">, and may be any expressions; when the declaration has constant bounds they are the default for an ALLOCATE without bounds. Inner dimensions must be constants. Every ALLOCATE adds a new </w:t>
+      </w:r>
+      <w:r>
+        <w:rPr>
+          <w:rFonts w:ascii="Times New Roman" w:cs="Times New Roman" w:eastAsia="Times New Roman" w:hAnsi="Times New Roman"/>
+          <w:i/>
+          <w:iCs/>
+          <w:sz w:val="21"/>
+          <w:szCs w:val="21"/>
+        </w:rPr>
+        <w:t xml:space="preserve">generation</w:t>
+      </w:r>
+      <w:r>
+        <w:rPr>
+          <w:rFonts w:ascii="Times New Roman" w:cs="Times New Roman" w:eastAsia="Times New Roman" w:hAnsi="Times New Roman"/>
+          <w:b w:val="false"/>
+          <w:bCs w:val="false"/>
+          <w:sz w:val="21"/>
+          <w:szCs w:val="21"/>
+        </w:rPr>
+        <w:t xml:space="preserve"> on top of the earlier ones, with its own bounds, and only the newest generation can be used; FREE removes it and makes the previous one current again. </w:t>
+      </w:r>
+      <w:r>
+        <w:rPr>
+          <w:rFonts w:ascii="Courier New" w:cs="Courier New" w:eastAsia="Courier New" w:hAnsi="Courier New"/>
+          <w:sz w:val="19"/>
+          <w:szCs w:val="19"/>
+        </w:rPr>
         <w:t xml:space="preserve">ALLOCATION(T)</w:t>
       </w:r>
       <w:r>
@@ -13744,7 +13800,456 @@
           <w:sz w:val="21"/>
           <w:szCs w:val="21"/>
         </w:rPr>
-        <w:t xml:space="preserve"> is 1 if T is allocated and 0 if not. For storage whose size is decided at run time, use a BASED structure holding a CHARACTER or an array of a fixed maximum size.</w:t>
+        <w:t xml:space="preserve"> is the number of generations. The INITIAL attribute is used by ALLOCATE for a CONTROLLED variable that is not an array.</w:t>
+      </w:r>
+    </w:p>
+    <w:tbl>
+      <w:tblPr>
+        <w:tblW w:type="dxa" w:w="9638"/>
+        <w:tblBorders>
+          <w:top w:val="single" w:color="000000" w:sz="4"/>
+          <w:left w:val="single" w:color="000000" w:sz="4"/>
+          <w:bottom w:val="single" w:color="000000" w:sz="4"/>
+          <w:right w:val="single" w:color="000000" w:sz="4"/>
+          <w:insideH w:val="single" w:color="000000" w:sz="4"/>
+          <w:insideV w:val="single" w:color="000000" w:sz="4"/>
+        </w:tblBorders>
+        <w:tblLayout w:type="fixed"/>
+      </w:tblPr>
+      <w:tblGrid>
+        <w:gridCol w:w="9638"/>
+      </w:tblGrid>
+      <w:tr>
+        <w:trPr>
+          <w:cantSplit/>
+        </w:trPr>
+        <w:tc>
+          <w:tcPr>
+            <w:tcW w:type="dxa" w:w="9638"/>
+            <w:shd w:fill="F2F2F2" w:color="auto" w:val="clear"/>
+            <w:tcMar>
+              <w:top w:type="dxa" w:w="100"/>
+              <w:left w:type="dxa" w:w="140"/>
+              <w:bottom w:type="dxa" w:w="100"/>
+              <w:right w:type="dxa" w:w="140"/>
+            </w:tcMar>
+          </w:tcPr>
+          <w:p>
+            <w:pPr>
+              <w:keepNext/>
+              <w:spacing w:after="0" w:line="228"/>
+            </w:pPr>
+            <w:r>
+              <w:rPr>
+                <w:rFonts w:ascii="Courier New" w:cs="Courier New" w:eastAsia="Courier New" w:hAnsi="Courier New"/>
+                <w:sz w:val="17"/>
+                <w:szCs w:val="17"/>
+              </w:rPr>
+              <w:t xml:space="preserve">T25: PROCEDURE OPTIONS(MAIN);</w:t>
+            </w:r>
+          </w:p>
+          <w:p>
+            <w:pPr>
+              <w:keepNext/>
+              <w:spacing w:after="0" w:line="228"/>
+            </w:pPr>
+            <w:r>
+              <w:rPr>
+                <w:rFonts w:ascii="Courier New" w:cs="Courier New" w:eastAsia="Courier New" w:hAnsi="Courier New"/>
+                <w:sz w:val="17"/>
+                <w:szCs w:val="17"/>
+              </w:rPr>
+              <w:t xml:space="preserve">  DECLARE T(*) FIXED BINARY(31) CONTROLLED;</w:t>
+            </w:r>
+          </w:p>
+          <w:p>
+            <w:pPr>
+              <w:keepNext/>
+              <w:spacing w:after="0" w:line="228"/>
+            </w:pPr>
+            <w:r>
+              <w:rPr>
+                <w:rFonts w:ascii="Courier New" w:cs="Courier New" w:eastAsia="Courier New" w:hAnsi="Courier New"/>
+                <w:sz w:val="17"/>
+                <w:szCs w:val="17"/>
+              </w:rPr>
+              <w:t xml:space="preserve">  DECLARE S FIXED BINARY(31) CONTROLLED;</w:t>
+            </w:r>
+          </w:p>
+          <w:p>
+            <w:pPr>
+              <w:keepNext/>
+              <w:spacing w:after="0" w:line="228"/>
+            </w:pPr>
+            <w:r>
+              <w:rPr>
+                <w:rFonts w:ascii="Courier New" w:cs="Courier New" w:eastAsia="Courier New" w:hAnsi="Courier New"/>
+                <w:sz w:val="17"/>
+                <w:szCs w:val="17"/>
+              </w:rPr>
+              <w:t xml:space="preserve">  DECLARE (I, N) FIXED BINARY(31);</w:t>
+            </w:r>
+          </w:p>
+          <w:p>
+            <w:pPr>
+              <w:keepNext/>
+              <w:spacing w:after="0" w:line="228"/>
+            </w:pPr>
+            <w:r>
+              <w:rPr>
+                <w:rFonts w:ascii="Courier New" w:cs="Courier New" w:eastAsia="Courier New" w:hAnsi="Courier New"/>
+                <w:sz w:val="17"/>
+                <w:szCs w:val="17"/>
+              </w:rPr>
+              <w:t xml:space="preserve">  N = 5;</w:t>
+            </w:r>
+          </w:p>
+          <w:p>
+            <w:pPr>
+              <w:keepNext/>
+              <w:spacing w:after="0" w:line="228"/>
+            </w:pPr>
+            <w:r>
+              <w:rPr>
+                <w:rFonts w:ascii="Courier New" w:cs="Courier New" w:eastAsia="Courier New" w:hAnsi="Courier New"/>
+                <w:sz w:val="17"/>
+                <w:szCs w:val="17"/>
+              </w:rPr>
+              <w:t xml:space="preserve">  ALLOCATE T(N);</w:t>
+            </w:r>
+          </w:p>
+          <w:p>
+            <w:pPr>
+              <w:keepNext/>
+              <w:spacing w:after="0" w:line="228"/>
+            </w:pPr>
+            <w:r>
+              <w:rPr>
+                <w:rFonts w:ascii="Courier New" w:cs="Courier New" w:eastAsia="Courier New" w:hAnsi="Courier New"/>
+                <w:sz w:val="17"/>
+                <w:szCs w:val="17"/>
+              </w:rPr>
+              <w:t xml:space="preserve">  DO I = 1 TO N; T(I) = I * I; END;</w:t>
+            </w:r>
+          </w:p>
+          <w:p>
+            <w:pPr>
+              <w:keepNext/>
+              <w:spacing w:after="0" w:line="228"/>
+            </w:pPr>
+            <w:r>
+              <w:rPr>
+                <w:rFonts w:ascii="Courier New" w:cs="Courier New" w:eastAsia="Courier New" w:hAnsi="Courier New"/>
+                <w:sz w:val="17"/>
+                <w:szCs w:val="17"/>
+              </w:rPr>
+              <w:t xml:space="preserve">  PUT SKIP LIST(LBOUND(T,1), HBOUND(T,1), T(5));</w:t>
+            </w:r>
+          </w:p>
+          <w:p>
+            <w:pPr>
+              <w:keepNext/>
+              <w:spacing w:after="0" w:line="228"/>
+            </w:pPr>
+            <w:r>
+              <w:rPr>
+                <w:rFonts w:ascii="Courier New" w:cs="Courier New" w:eastAsia="Courier New" w:hAnsi="Courier New"/>
+                <w:sz w:val="17"/>
+                <w:szCs w:val="17"/>
+              </w:rPr>
+              <w:t xml:space="preserve">  ALLOCATE T(0:2);</w:t>
+            </w:r>
+          </w:p>
+          <w:p>
+            <w:pPr>
+              <w:keepNext/>
+              <w:spacing w:after="0" w:line="228"/>
+            </w:pPr>
+            <w:r>
+              <w:rPr>
+                <w:rFonts w:ascii="Courier New" w:cs="Courier New" w:eastAsia="Courier New" w:hAnsi="Courier New"/>
+                <w:sz w:val="17"/>
+                <w:szCs w:val="17"/>
+              </w:rPr>
+              <w:t xml:space="preserve">  T(0) = 100; T(1) = 200; T(2) = 300;</w:t>
+            </w:r>
+          </w:p>
+          <w:p>
+            <w:pPr>
+              <w:keepNext/>
+              <w:spacing w:after="0" w:line="228"/>
+            </w:pPr>
+            <w:r>
+              <w:rPr>
+                <w:rFonts w:ascii="Courier New" w:cs="Courier New" w:eastAsia="Courier New" w:hAnsi="Courier New"/>
+                <w:sz w:val="17"/>
+                <w:szCs w:val="17"/>
+              </w:rPr>
+              <w:t xml:space="preserve">  PUT SKIP LIST(LBOUND(T,1), HBOUND(T,1), T(2), ALLOCATION(T));</w:t>
+            </w:r>
+          </w:p>
+          <w:p>
+            <w:pPr>
+              <w:keepNext/>
+              <w:spacing w:after="0" w:line="228"/>
+            </w:pPr>
+            <w:r>
+              <w:rPr>
+                <w:rFonts w:ascii="Courier New" w:cs="Courier New" w:eastAsia="Courier New" w:hAnsi="Courier New"/>
+                <w:sz w:val="17"/>
+                <w:szCs w:val="17"/>
+              </w:rPr>
+              <w:t xml:space="preserve">  FREE T;</w:t>
+            </w:r>
+          </w:p>
+          <w:p>
+            <w:pPr>
+              <w:keepNext/>
+              <w:spacing w:after="0" w:line="228"/>
+            </w:pPr>
+            <w:r>
+              <w:rPr>
+                <w:rFonts w:ascii="Courier New" w:cs="Courier New" w:eastAsia="Courier New" w:hAnsi="Courier New"/>
+                <w:sz w:val="17"/>
+                <w:szCs w:val="17"/>
+              </w:rPr>
+              <w:t xml:space="preserve">  PUT SKIP LIST(LBOUND(T,1), HBOUND(T,1), T(3), ALLOCATION(T));</w:t>
+            </w:r>
+          </w:p>
+          <w:p>
+            <w:pPr>
+              <w:keepNext/>
+              <w:spacing w:after="0" w:line="228"/>
+            </w:pPr>
+            <w:r>
+              <w:rPr>
+                <w:rFonts w:ascii="Courier New" w:cs="Courier New" w:eastAsia="Courier New" w:hAnsi="Courier New"/>
+                <w:sz w:val="17"/>
+                <w:szCs w:val="17"/>
+              </w:rPr>
+              <w:t xml:space="preserve">  FREE T;</w:t>
+            </w:r>
+          </w:p>
+          <w:p>
+            <w:pPr>
+              <w:keepNext/>
+              <w:spacing w:after="0" w:line="228"/>
+            </w:pPr>
+            <w:r>
+              <w:rPr>
+                <w:rFonts w:ascii="Courier New" w:cs="Courier New" w:eastAsia="Courier New" w:hAnsi="Courier New"/>
+                <w:sz w:val="17"/>
+                <w:szCs w:val="17"/>
+              </w:rPr>
+              <w:t xml:space="preserve">  PUT SKIP LIST(ALLOCATION(T));</w:t>
+            </w:r>
+          </w:p>
+          <w:p>
+            <w:pPr>
+              <w:keepNext/>
+              <w:spacing w:after="0" w:line="228"/>
+            </w:pPr>
+            <w:r>
+              <w:rPr>
+                <w:rFonts w:ascii="Courier New" w:cs="Courier New" w:eastAsia="Courier New" w:hAnsi="Courier New"/>
+                <w:sz w:val="17"/>
+                <w:szCs w:val="17"/>
+              </w:rPr>
+              <w:t xml:space="preserve">  ALLOCATE S; S = 1; ALLOCATE S; S = 2;</w:t>
+            </w:r>
+          </w:p>
+          <w:p>
+            <w:pPr>
+              <w:keepNext/>
+              <w:spacing w:after="0" w:line="228"/>
+            </w:pPr>
+            <w:r>
+              <w:rPr>
+                <w:rFonts w:ascii="Courier New" w:cs="Courier New" w:eastAsia="Courier New" w:hAnsi="Courier New"/>
+                <w:sz w:val="17"/>
+                <w:szCs w:val="17"/>
+              </w:rPr>
+              <w:t xml:space="preserve">  PUT SKIP LIST(S, ALLOCATION(S));</w:t>
+            </w:r>
+          </w:p>
+          <w:p>
+            <w:pPr>
+              <w:keepNext/>
+              <w:spacing w:after="0" w:line="228"/>
+            </w:pPr>
+            <w:r>
+              <w:rPr>
+                <w:rFonts w:ascii="Courier New" w:cs="Courier New" w:eastAsia="Courier New" w:hAnsi="Courier New"/>
+                <w:sz w:val="17"/>
+                <w:szCs w:val="17"/>
+              </w:rPr>
+              <w:t xml:space="preserve">  FREE S;</w:t>
+            </w:r>
+          </w:p>
+          <w:p>
+            <w:pPr>
+              <w:keepNext/>
+              <w:spacing w:after="0" w:line="228"/>
+            </w:pPr>
+            <w:r>
+              <w:rPr>
+                <w:rFonts w:ascii="Courier New" w:cs="Courier New" w:eastAsia="Courier New" w:hAnsi="Courier New"/>
+                <w:sz w:val="17"/>
+                <w:szCs w:val="17"/>
+              </w:rPr>
+              <w:t xml:space="preserve">  PUT SKIP LIST(S);</w:t>
+            </w:r>
+          </w:p>
+          <w:p>
+            <w:pPr>
+              <w:keepNext/>
+              <w:spacing w:after="0" w:line="228"/>
+            </w:pPr>
+            <w:r>
+              <w:rPr>
+                <w:rFonts w:ascii="Courier New" w:cs="Courier New" w:eastAsia="Courier New" w:hAnsi="Courier New"/>
+                <w:sz w:val="17"/>
+                <w:szCs w:val="17"/>
+              </w:rPr>
+              <w:t xml:space="preserve">END T25;</w:t>
+            </w:r>
+          </w:p>
+          <w:p>
+            <w:pPr>
+              <w:keepNext/>
+              <w:spacing w:after="0" w:line="228"/>
+            </w:pPr>
+            <w:r>
+              <w:rPr>
+                <w:rFonts w:ascii="Courier New" w:cs="Courier New" w:eastAsia="Courier New" w:hAnsi="Courier New"/>
+                <w:sz w:val="17"/>
+                <w:szCs w:val="17"/>
+              </w:rPr>
+              <w:t xml:space="preserve"> </w:t>
+            </w:r>
+          </w:p>
+          <w:p>
+            <w:pPr>
+              <w:keepNext/>
+              <w:spacing w:after="0" w:line="228"/>
+            </w:pPr>
+            <w:r>
+              <w:rPr>
+                <w:rFonts w:ascii="Courier New" w:cs="Courier New" w:eastAsia="Courier New" w:hAnsi="Courier New"/>
+                <w:sz w:val="17"/>
+                <w:szCs w:val="17"/>
+              </w:rPr>
+              <w:t xml:space="preserve">/* prints */</w:t>
+            </w:r>
+          </w:p>
+          <w:p>
+            <w:pPr>
+              <w:keepNext/>
+              <w:spacing w:after="0" w:line="228"/>
+            </w:pPr>
+            <w:r>
+              <w:rPr>
+                <w:rFonts w:ascii="Courier New" w:cs="Courier New" w:eastAsia="Courier New" w:hAnsi="Courier New"/>
+                <w:sz w:val="17"/>
+                <w:szCs w:val="17"/>
+              </w:rPr>
+              <w:t xml:space="preserve">1                       5                       25</w:t>
+            </w:r>
+          </w:p>
+          <w:p>
+            <w:pPr>
+              <w:keepNext/>
+              <w:spacing w:after="0" w:line="228"/>
+            </w:pPr>
+            <w:r>
+              <w:rPr>
+                <w:rFonts w:ascii="Courier New" w:cs="Courier New" w:eastAsia="Courier New" w:hAnsi="Courier New"/>
+                <w:sz w:val="17"/>
+                <w:szCs w:val="17"/>
+              </w:rPr>
+              <w:t xml:space="preserve">0                       2                       300                     2</w:t>
+            </w:r>
+          </w:p>
+          <w:p>
+            <w:pPr>
+              <w:keepNext/>
+              <w:spacing w:after="0" w:line="228"/>
+            </w:pPr>
+            <w:r>
+              <w:rPr>
+                <w:rFonts w:ascii="Courier New" w:cs="Courier New" w:eastAsia="Courier New" w:hAnsi="Courier New"/>
+                <w:sz w:val="17"/>
+                <w:szCs w:val="17"/>
+              </w:rPr>
+              <w:t xml:space="preserve">1                       5                       9                       1</w:t>
+            </w:r>
+          </w:p>
+          <w:p>
+            <w:pPr>
+              <w:keepNext/>
+              <w:spacing w:after="0" w:line="228"/>
+            </w:pPr>
+            <w:r>
+              <w:rPr>
+                <w:rFonts w:ascii="Courier New" w:cs="Courier New" w:eastAsia="Courier New" w:hAnsi="Courier New"/>
+                <w:sz w:val="17"/>
+                <w:szCs w:val="17"/>
+              </w:rPr>
+              <w:t xml:space="preserve">0</w:t>
+            </w:r>
+          </w:p>
+          <w:p>
+            <w:pPr>
+              <w:keepNext/>
+              <w:spacing w:after="0" w:line="228"/>
+            </w:pPr>
+            <w:r>
+              <w:rPr>
+                <w:rFonts w:ascii="Courier New" w:cs="Courier New" w:eastAsia="Courier New" w:hAnsi="Courier New"/>
+                <w:sz w:val="17"/>
+                <w:szCs w:val="17"/>
+              </w:rPr>
+              <w:t xml:space="preserve">2                       2</w:t>
+            </w:r>
+          </w:p>
+          <w:p>
+            <w:pPr>
+              <w:keepNext/>
+              <w:spacing w:after="0" w:line="228"/>
+            </w:pPr>
+            <w:r>
+              <w:rPr>
+                <w:rFonts w:ascii="Courier New" w:cs="Courier New" w:eastAsia="Courier New" w:hAnsi="Courier New"/>
+                <w:sz w:val="17"/>
+                <w:szCs w:val="17"/>
+              </w:rPr>
+              <w:t xml:space="preserve">1</w:t>
+            </w:r>
+          </w:p>
+        </w:tc>
+      </w:tr>
+    </w:tbl>
+    <w:p>
+      <w:pPr>
+        <w:spacing w:after="200" w:before="80"/>
+      </w:pPr>
+      <w:r>
+        <w:rPr>
+          <w:rFonts w:ascii="Arial" w:cs="Arial" w:eastAsia="Arial" w:hAnsi="Arial"/>
+          <w:b/>
+          <w:bCs/>
+          <w:sz w:val="18"/>
+          <w:szCs w:val="18"/>
+        </w:rPr>
+        <w:t xml:space="preserve">Figure 19. </w:t>
+      </w:r>
+      <w:r>
+        <w:rPr>
+          <w:rFonts w:ascii="Arial" w:cs="Arial" w:eastAsia="Arial" w:hAnsi="Arial"/>
+          <w:sz w:val="18"/>
+          <w:szCs w:val="18"/>
+        </w:rPr>
+        <w:t xml:space="preserve">Generations of a CONTROLLED array</w:t>
       </w:r>
     </w:p>
     <w:p>
@@ -14833,7 +15338,7 @@
           <w:sz w:val="18"/>
           <w:szCs w:val="18"/>
         </w:rPr>
-        <w:t xml:space="preserve">Figure 19. </w:t>
+        <w:t xml:space="preserve">Figure 20. </w:t>
       </w:r>
       <w:r>
         <w:rPr>
@@ -14989,7 +15494,7 @@
           <w:sz w:val="21"/>
           <w:szCs w:val="21"/>
         </w:rPr>
-        <w:t xml:space="preserve">An ON-unit is translated to a separate C function and is active from the moment the ON statement is run until the end of the program or a REVERT. Unlike the F compiler, ON-units are not stacked and not restored when the procedure that established them returns.</w:t>
+        <w:t xml:space="preserve">An ON-unit is translated to a separate C function and is active from the moment the ON statement is run until a REVERT or until the procedure that contains the ON statement returns, whichever comes first. The ON-units that were active when the procedure was called are then active again, so ON-units are stacked as in the F compiler. A called procedure uses the ON-units of its caller unless it sets its own. This also applies to ON ENDFILE(file). A GOTO out of a procedure to a label in an outer procedure does not restore the ON-units, and a BEGIN block does not restore them at its end.</w:t>
       </w:r>
     </w:p>
     <w:tbl>
@@ -15304,7 +15809,7 @@
           <w:sz w:val="18"/>
           <w:szCs w:val="18"/>
         </w:rPr>
-        <w:t xml:space="preserve">Figure 20. </w:t>
+        <w:t xml:space="preserve">Figure 21. </w:t>
       </w:r>
       <w:r>
         <w:rPr>
@@ -15987,7 +16492,7 @@
           <w:sz w:val="18"/>
           <w:szCs w:val="18"/>
         </w:rPr>
-        <w:t xml:space="preserve">Figure 21. </w:t>
+        <w:t xml:space="preserve">Figure 22. </w:t>
       </w:r>
       <w:r>
         <w:rPr>
@@ -16523,7 +17028,7 @@
           <w:sz w:val="18"/>
           <w:szCs w:val="18"/>
         </w:rPr>
-        <w:t xml:space="preserve">Figure 22. </w:t>
+        <w:t xml:space="preserve">Figure 23. </w:t>
       </w:r>
       <w:r>
         <w:rPr>
@@ -17222,7 +17727,7 @@
           <w:sz w:val="18"/>
           <w:szCs w:val="18"/>
         </w:rPr>
-        <w:t xml:space="preserve">Figure 23. </w:t>
+        <w:t xml:space="preserve">Figure 24. </w:t>
       </w:r>
       <w:r>
         <w:rPr>
@@ -18370,7 +18875,7 @@
           <w:sz w:val="18"/>
           <w:szCs w:val="18"/>
         </w:rPr>
-        <w:t xml:space="preserve">Figure 24. </w:t>
+        <w:t xml:space="preserve">Figure 25. </w:t>
       </w:r>
       <w:r>
         <w:rPr>
@@ -18887,7 +19392,7 @@
           <w:sz w:val="18"/>
           <w:szCs w:val="18"/>
         </w:rPr>
-        <w:t xml:space="preserve">Figure 25. </w:t>
+        <w:t xml:space="preserve">Figure 26. </w:t>
       </w:r>
       <w:r>
         <w:rPr>
@@ -19844,7 +20349,7 @@
           <w:sz w:val="18"/>
           <w:szCs w:val="18"/>
         </w:rPr>
-        <w:t xml:space="preserve">Figure 26. </w:t>
+        <w:t xml:space="preserve">Figure 27. </w:t>
       </w:r>
       <w:r>
         <w:rPr>
@@ -20251,7 +20756,7 @@
           <w:sz w:val="18"/>
           <w:szCs w:val="18"/>
         </w:rPr>
-        <w:t xml:space="preserve">Figure 27. </w:t>
+        <w:t xml:space="preserve">Figure 28. </w:t>
       </w:r>
       <w:r>
         <w:rPr>
@@ -21085,7 +21590,7 @@
           <w:sz w:val="18"/>
           <w:szCs w:val="18"/>
         </w:rPr>
-        <w:t xml:space="preserve">Figure 28. </w:t>
+        <w:t xml:space="preserve">Figure 29. </w:t>
       </w:r>
       <w:r>
         <w:rPr>
@@ -21502,7 +22007,7 @@
           <w:sz w:val="18"/>
           <w:szCs w:val="18"/>
         </w:rPr>
-        <w:t xml:space="preserve">Figure 29. </w:t>
+        <w:t xml:space="preserve">Figure 30. </w:t>
       </w:r>
       <w:r>
         <w:rPr>
@@ -21941,7 +22446,7 @@
           <w:sz w:val="18"/>
           <w:szCs w:val="18"/>
         </w:rPr>
-        <w:t xml:space="preserve">Figure 30. </w:t>
+        <w:t xml:space="preserve">Figure 31. </w:t>
       </w:r>
       <w:r>
         <w:rPr>
@@ -22216,7 +22721,7 @@
           <w:sz w:val="18"/>
           <w:szCs w:val="18"/>
         </w:rPr>
-        <w:t xml:space="preserve">Figure 31. </w:t>
+        <w:t xml:space="preserve">Figure 32. </w:t>
       </w:r>
       <w:r>
         <w:rPr>
@@ -22627,7 +23132,7 @@
           <w:sz w:val="18"/>
           <w:szCs w:val="18"/>
         </w:rPr>
-        <w:t xml:space="preserve">Figure 32. </w:t>
+        <w:t xml:space="preserve">Figure 33. </w:t>
       </w:r>
       <w:r>
         <w:rPr>
@@ -23514,7 +24019,7 @@
           <w:sz w:val="18"/>
           <w:szCs w:val="18"/>
         </w:rPr>
-        <w:t xml:space="preserve">Figure 33. </w:t>
+        <w:t xml:space="preserve">Figure 34. </w:t>
       </w:r>
       <w:r>
         <w:rPr>
@@ -24591,7 +25096,7 @@
           <w:sz w:val="18"/>
           <w:szCs w:val="18"/>
         </w:rPr>
-        <w:t xml:space="preserve">Figure 34. </w:t>
+        <w:t xml:space="preserve">Figure 35. </w:t>
       </w:r>
       <w:r>
         <w:rPr>
@@ -25243,7 +25748,7 @@
           <w:sz w:val="18"/>
           <w:szCs w:val="18"/>
         </w:rPr>
-        <w:t xml:space="preserve">Figure 35. </w:t>
+        <w:t xml:space="preserve">Figure 36. </w:t>
       </w:r>
       <w:r>
         <w:rPr>
@@ -25526,7 +26031,7 @@
           <w:sz w:val="18"/>
           <w:szCs w:val="18"/>
         </w:rPr>
-        <w:t xml:space="preserve">Figure 36. </w:t>
+        <w:t xml:space="preserve">Figure 37. </w:t>
       </w:r>
       <w:r>
         <w:rPr>
@@ -25863,7 +26368,7 @@
           <w:sz w:val="18"/>
           <w:szCs w:val="18"/>
         </w:rPr>
-        <w:t xml:space="preserve">Figure 37. </w:t>
+        <w:t xml:space="preserve">Figure 38. </w:t>
       </w:r>
       <w:r>
         <w:rPr>
@@ -26762,7 +27267,7 @@
           <w:sz w:val="18"/>
           <w:szCs w:val="18"/>
         </w:rPr>
-        <w:t xml:space="preserve">Figure 38. </w:t>
+        <w:t xml:space="preserve">Figure 39. </w:t>
       </w:r>
       <w:r>
         <w:rPr>
@@ -27029,7 +27534,7 @@
           <w:sz w:val="18"/>
           <w:szCs w:val="18"/>
         </w:rPr>
-        <w:t xml:space="preserve">Figure 39. </w:t>
+        <w:t xml:space="preserve">Figure 40. </w:t>
       </w:r>
       <w:r>
         <w:rPr>
@@ -27477,7 +27982,7 @@
           <w:sz w:val="18"/>
           <w:szCs w:val="18"/>
         </w:rPr>
-        <w:t xml:space="preserve">Figure 40. </w:t>
+        <w:t xml:space="preserve">Figure 41. </w:t>
       </w:r>
       <w:r>
         <w:rPr>
@@ -28021,7 +28526,7 @@
           <w:sz w:val="18"/>
           <w:szCs w:val="18"/>
         </w:rPr>
-        <w:t xml:space="preserve">Figure 41. </w:t>
+        <w:t xml:space="preserve">Figure 42. </w:t>
       </w:r>
       <w:r>
         <w:rPr>
@@ -28537,7 +29042,7 @@
           <w:sz w:val="18"/>
           <w:szCs w:val="18"/>
         </w:rPr>
-        <w:t xml:space="preserve">Figure 42. </w:t>
+        <w:t xml:space="preserve">Figure 43. </w:t>
       </w:r>
       <w:r>
         <w:rPr>
@@ -29010,7 +29515,7 @@
           <w:sz w:val="18"/>
           <w:szCs w:val="18"/>
         </w:rPr>
-        <w:t xml:space="preserve">Figure 43. </w:t>
+        <w:t xml:space="preserve">Figure 44. </w:t>
       </w:r>
       <w:r>
         <w:rPr>
@@ -29399,7 +29904,7 @@
           <w:sz w:val="18"/>
           <w:szCs w:val="18"/>
         </w:rPr>
-        <w:t xml:space="preserve">Figure 44. </w:t>
+        <w:t xml:space="preserve">Figure 45. </w:t>
       </w:r>
       <w:r>
         <w:rPr>
@@ -29974,7 +30479,7 @@
           <w:sz w:val="18"/>
           <w:szCs w:val="18"/>
         </w:rPr>
-        <w:t xml:space="preserve">Figure 45. </w:t>
+        <w:t xml:space="preserve">Figure 46. </w:t>
       </w:r>
       <w:r>
         <w:rPr>
@@ -30419,7 +30924,7 @@
           <w:sz w:val="18"/>
           <w:szCs w:val="18"/>
         </w:rPr>
-        <w:t xml:space="preserve">Figure 46. </w:t>
+        <w:t xml:space="preserve">Figure 47. </w:t>
       </w:r>
       <w:r>
         <w:rPr>
@@ -31102,7 +31607,7 @@
           <w:sz w:val="18"/>
           <w:szCs w:val="18"/>
         </w:rPr>
-        <w:t xml:space="preserve">Figure 47. </w:t>
+        <w:t xml:space="preserve">Figure 48. </w:t>
       </w:r>
       <w:r>
         <w:rPr>
@@ -31901,7 +32406,7 @@
                 <w:sz w:val="19"/>
                 <w:szCs w:val="19"/>
               </w:rPr>
-              <w:t xml:space="preserve">One generation.</w:t>
+              <w:t xml:space="preserve">Supported.</w:t>
             </w:r>
           </w:p>
         </w:tc>
@@ -31960,7 +32465,7 @@
                 <w:sz w:val="19"/>
                 <w:szCs w:val="19"/>
               </w:rPr>
-              <w:t xml:space="preserve">ON-units are global and are not restored.</w:t>
+              <w:t xml:space="preserve">Supported (not for a GOTO out of the procedure, nor at the end of a BEGIN block).</w:t>
             </w:r>
           </w:p>
         </w:tc>
@@ -32232,7 +32737,7 @@
           <w:sz w:val="18"/>
           <w:szCs w:val="18"/>
         </w:rPr>
-        <w:t xml:space="preserve">Figure 48. </w:t>
+        <w:t xml:space="preserve">Figure 49. </w:t>
       </w:r>
       <w:r>
         <w:rPr>
@@ -32402,7 +32907,7 @@
           <w:sz w:val="21"/>
           <w:szCs w:val="21"/>
         </w:rPr>
-        <w:t xml:space="preserve">Only the conditions of Figure 19 are raised. ON ENDPAGE, KEY and TRANSMIT are accepted but never raised.</w:t>
+        <w:t xml:space="preserve">Only the conditions of Figure 20 are raised. ON ENDPAGE, KEY and TRANSMIT are accepted but never raised.</w:t>
       </w:r>
     </w:p>
     <w:p>
@@ -33088,7 +33593,7 @@
           <w:sz w:val="18"/>
           <w:szCs w:val="18"/>
         </w:rPr>
-        <w:t xml:space="preserve">Figure 49. </w:t>
+        <w:t xml:space="preserve">Figure 50. </w:t>
       </w:r>
       <w:r>
         <w:rPr>
@@ -34090,7 +34595,7 @@
           <w:sz w:val="18"/>
           <w:szCs w:val="18"/>
         </w:rPr>
-        <w:t xml:space="preserve">Figure 50. </w:t>
+        <w:t xml:space="preserve">Figure 51. </w:t>
       </w:r>
       <w:r>
         <w:rPr>
@@ -35068,7 +35573,7 @@
           <w:sz w:val="18"/>
           <w:szCs w:val="18"/>
         </w:rPr>
-        <w:t xml:space="preserve">Figure 51. </w:t>
+        <w:t xml:space="preserve">Figure 52. </w:t>
       </w:r>
       <w:r>
         <w:rPr>
@@ -35838,7 +36343,7 @@
           <w:sz w:val="18"/>
           <w:szCs w:val="18"/>
         </w:rPr>
-        <w:t xml:space="preserve">Figure 52. </w:t>
+        <w:t xml:space="preserve">Figure 53. </w:t>
       </w:r>
       <w:r>
         <w:rPr>
@@ -35971,27 +36476,7 @@
           <w:sz w:val="21"/>
           <w:szCs w:val="21"/>
         </w:rPr>
-        <w:t xml:space="preserve">A CONTROLLED variable has one generation, and the bounds of arrays must be constants.</w:t>
-      </w:r>
-    </w:p>
-    <w:p>
-      <w:pPr>
-        <w:pStyle w:val="ListParagraph"/>
-        <w:numPr>
-          <w:ilvl w:val="0"/>
-          <w:numId w:val="2"/>
-        </w:numPr>
-        <w:spacing w:after="60"/>
-      </w:pPr>
-      <w:r>
-        <w:rPr>
-          <w:rFonts w:ascii="Times New Roman" w:cs="Times New Roman" w:eastAsia="Times New Roman" w:hAnsi="Times New Roman"/>
-          <w:b w:val="false"/>
-          <w:bCs w:val="false"/>
-          <w:sz w:val="21"/>
-          <w:szCs w:val="21"/>
-        </w:rPr>
-        <w:t xml:space="preserve">ON-units are global: they are not stacked and not restored when the procedure that established them returns.</w:t>
+        <w:t xml:space="preserve">Only the first bound of a CONTROLLED array can be set at run time, and only by ALLOCATE; DECLARE bounds must be constants. ON-units are not restored by a GOTO out of a procedure or at the end of a BEGIN block.</w:t>
       </w:r>
     </w:p>
     <w:p>

</xml_diff>